<commit_message>
Lesson 01 - Extros
</commit_message>
<xml_diff>
--- a/AI descriptions.docx
+++ b/AI descriptions.docx
@@ -12,7 +12,7 @@
         <w:rPr>
           <w:lang w:val="en-US"/>
         </w:rPr>
-        <w:t xml:space="preserve"> Lesson 01</w:t>
+        <w:t>Lesson 01</w:t>
       </w:r>
     </w:p>
     <w:tbl>
@@ -24,8 +24,9 @@
       <w:tblGrid>
         <w:gridCol w:w="2614"/>
         <w:gridCol w:w="2614"/>
-        <w:gridCol w:w="2614"/>
-        <w:gridCol w:w="7446"/>
+        <w:gridCol w:w="1307"/>
+        <w:gridCol w:w="1307"/>
+        <w:gridCol w:w="7536"/>
       </w:tblGrid>
       <w:tr>
         <w:tc>
@@ -69,6 +70,7 @@
         <w:tc>
           <w:tcPr>
             <w:tcW w:w="2614" w:type="dxa"/>
+            <w:gridSpan w:val="2"/>
           </w:tcPr>
           <w:p>
             <w:pPr>
@@ -87,7 +89,7 @@
         </w:tc>
         <w:tc>
           <w:tcPr>
-            <w:tcW w:w="7446" w:type="dxa"/>
+            <w:tcW w:w="7536" w:type="dxa"/>
           </w:tcPr>
           <w:p>
             <w:pPr>
@@ -135,13 +137,7 @@
               <w:rPr>
                 <w:lang w:val="en-US"/>
               </w:rPr>
-              <w:t>17</w:t>
-            </w:r>
-            <w:r>
-              <w:rPr>
-                <w:lang w:val="en-US"/>
-              </w:rPr>
-              <w:t>:45</w:t>
+              <w:t>17:45</w:t>
             </w:r>
           </w:p>
         </w:tc>
@@ -167,30 +163,25 @@
         <w:tc>
           <w:tcPr>
             <w:tcW w:w="2614" w:type="dxa"/>
-          </w:tcPr>
-          <w:p>
-            <w:pPr>
-              <w:rPr>
-                <w:lang w:val="en-US"/>
-              </w:rPr>
-            </w:pPr>
-            <w:r>
-              <w:rPr>
-                <w:lang w:val="en-US"/>
-              </w:rPr>
-              <w:t>Artificial intelligence</w:t>
-            </w:r>
-            <w:r>
-              <w:rPr>
-                <w:lang w:val="en-US"/>
-              </w:rPr>
-              <w:t xml:space="preserve"> – simulation of human intelligence processes</w:t>
-            </w:r>
-          </w:p>
-        </w:tc>
-        <w:tc>
-          <w:tcPr>
-            <w:tcW w:w="7446" w:type="dxa"/>
+            <w:gridSpan w:val="2"/>
+          </w:tcPr>
+          <w:p>
+            <w:pPr>
+              <w:rPr>
+                <w:lang w:val="en-US"/>
+              </w:rPr>
+            </w:pPr>
+            <w:r>
+              <w:rPr>
+                <w:lang w:val="en-US"/>
+              </w:rPr>
+              <w:t>Artificial intelligence – simulation of human intelligence processes</w:t>
+            </w:r>
+          </w:p>
+        </w:tc>
+        <w:tc>
+          <w:tcPr>
+            <w:tcW w:w="7536" w:type="dxa"/>
           </w:tcPr>
           <w:p>
             <w:pPr>
@@ -204,7 +195,7 @@
                 <w:noProof/>
               </w:rPr>
               <w:drawing>
-                <wp:inline distT="0" distB="0" distL="0" distR="0" wp14:anchorId="75B2243F" wp14:editId="2E3C55CD">
+                <wp:inline distT="0" distB="0" distL="0" distR="0" wp14:anchorId="0C505F1D" wp14:editId="025D87D2">
                   <wp:extent cx="3140710" cy="2578347"/>
                   <wp:effectExtent l="152400" t="114300" r="116840" b="165100"/>
                   <wp:docPr id="530394011" name="Picture 1"/>
@@ -321,43 +312,32 @@
               <w:rPr>
                 <w:lang w:val="en-US"/>
               </w:rPr>
-              <w:t xml:space="preserve">Machine </w:t>
-            </w:r>
-            <w:r>
-              <w:rPr>
-                <w:lang w:val="en-US"/>
-              </w:rPr>
-              <w:t>Learning</w:t>
-            </w:r>
-          </w:p>
-        </w:tc>
-        <w:tc>
-          <w:tcPr>
-            <w:tcW w:w="2614" w:type="dxa"/>
-          </w:tcPr>
-          <w:p>
-            <w:pPr>
-              <w:rPr>
-                <w:lang w:val="en-US"/>
-              </w:rPr>
-            </w:pPr>
-            <w:r>
-              <w:rPr>
-                <w:lang w:val="en-US"/>
-              </w:rPr>
-              <w:t>The practice of teaching computers how to learn patterns from data</w:t>
-            </w:r>
-            <w:r>
-              <w:rPr>
-                <w:lang w:val="en-US"/>
-              </w:rPr>
-              <w:t>.</w:t>
-            </w:r>
-          </w:p>
-        </w:tc>
-        <w:tc>
-          <w:tcPr>
-            <w:tcW w:w="7446" w:type="dxa"/>
+              <w:t>Machine Learning</w:t>
+            </w:r>
+          </w:p>
+        </w:tc>
+        <w:tc>
+          <w:tcPr>
+            <w:tcW w:w="2614" w:type="dxa"/>
+            <w:gridSpan w:val="2"/>
+          </w:tcPr>
+          <w:p>
+            <w:pPr>
+              <w:rPr>
+                <w:lang w:val="en-US"/>
+              </w:rPr>
+            </w:pPr>
+            <w:r>
+              <w:rPr>
+                <w:lang w:val="en-US"/>
+              </w:rPr>
+              <w:t>The practice of teaching computers how to learn patterns from data.</w:t>
+            </w:r>
+          </w:p>
+        </w:tc>
+        <w:tc>
+          <w:tcPr>
+            <w:tcW w:w="7536" w:type="dxa"/>
           </w:tcPr>
           <w:p>
             <w:pPr>
@@ -385,7 +365,7 @@
                 <w:noProof/>
               </w:rPr>
               <w:drawing>
-                <wp:inline distT="0" distB="0" distL="0" distR="0" wp14:anchorId="4D849AC3" wp14:editId="5628A0E1">
+                <wp:inline distT="0" distB="0" distL="0" distR="0" wp14:anchorId="5930442D" wp14:editId="2BB457BB">
                   <wp:extent cx="924174" cy="742963"/>
                   <wp:effectExtent l="133350" t="114300" r="104775" b="171450"/>
                   <wp:docPr id="634775051" name="Picture 1"/>
@@ -484,13 +464,7 @@
               <w:rPr>
                 <w:lang w:val="en-US"/>
               </w:rPr>
-              <w:t>17:5</w:t>
-            </w:r>
-            <w:r>
-              <w:rPr>
-                <w:lang w:val="en-US"/>
-              </w:rPr>
-              <w:t>5</w:t>
+              <w:t>17:55</w:t>
             </w:r>
           </w:p>
         </w:tc>
@@ -516,42 +490,19 @@
         <w:tc>
           <w:tcPr>
             <w:tcW w:w="2614" w:type="dxa"/>
-          </w:tcPr>
-          <w:p>
-            <w:pPr>
-              <w:rPr>
-                <w:lang w:val="en-US"/>
-              </w:rPr>
-            </w:pPr>
-            <w:r>
-              <w:rPr>
-                <w:lang w:val="en-US"/>
-              </w:rPr>
-              <w:t xml:space="preserve">Generative artificial intelligence </w:t>
-            </w:r>
-            <w:r>
-              <w:rPr>
-                <w:lang w:val="en-US"/>
-              </w:rPr>
-              <w:t xml:space="preserve">(AI) describes </w:t>
-            </w:r>
-            <w:r>
-              <w:rPr>
-                <w:lang w:val="en-US"/>
-              </w:rPr>
-              <w:t>algorithms</w:t>
-            </w:r>
-            <w:r>
-              <w:rPr>
-                <w:lang w:val="en-US"/>
-              </w:rPr>
-              <w:t xml:space="preserve"> that can be used to create new content</w:t>
-            </w:r>
-            <w:r>
-              <w:rPr>
-                <w:lang w:val="en-US"/>
-              </w:rPr>
-              <w:t xml:space="preserve"> (Audio, Video </w:t>
+            <w:gridSpan w:val="2"/>
+          </w:tcPr>
+          <w:p>
+            <w:pPr>
+              <w:rPr>
+                <w:lang w:val="en-US"/>
+              </w:rPr>
+            </w:pPr>
+            <w:r>
+              <w:rPr>
+                <w:lang w:val="en-US"/>
+              </w:rPr>
+              <w:t xml:space="preserve">Generative artificial intelligence (AI) describes algorithms that can be used to create new content (Audio, Video </w:t>
             </w:r>
             <w:proofErr w:type="spellStart"/>
             <w:r>
@@ -571,7 +522,7 @@
         </w:tc>
         <w:tc>
           <w:tcPr>
-            <w:tcW w:w="7446" w:type="dxa"/>
+            <w:tcW w:w="7536" w:type="dxa"/>
           </w:tcPr>
           <w:p>
             <w:pPr>
@@ -585,7 +536,7 @@
                 <w:noProof/>
               </w:rPr>
               <w:drawing>
-                <wp:inline distT="0" distB="0" distL="0" distR="0" wp14:anchorId="49B4FE14" wp14:editId="121F259E">
+                <wp:inline distT="0" distB="0" distL="0" distR="0" wp14:anchorId="40966232" wp14:editId="6441FA05">
                   <wp:extent cx="3213017" cy="3102193"/>
                   <wp:effectExtent l="114300" t="114300" r="121285" b="136525"/>
                   <wp:docPr id="1734024055" name="Picture 1"/>
@@ -709,6 +660,7 @@
         <w:tc>
           <w:tcPr>
             <w:tcW w:w="2614" w:type="dxa"/>
+            <w:gridSpan w:val="2"/>
           </w:tcPr>
           <w:p>
             <w:pPr>
@@ -726,7 +678,7 @@
         </w:tc>
         <w:tc>
           <w:tcPr>
-            <w:tcW w:w="7446" w:type="dxa"/>
+            <w:tcW w:w="7536" w:type="dxa"/>
           </w:tcPr>
           <w:p>
             <w:pPr>
@@ -794,6 +746,7 @@
         <w:tc>
           <w:tcPr>
             <w:tcW w:w="2614" w:type="dxa"/>
+            <w:gridSpan w:val="2"/>
           </w:tcPr>
           <w:p>
             <w:pPr>
@@ -811,7 +764,7 @@
         </w:tc>
         <w:tc>
           <w:tcPr>
-            <w:tcW w:w="7446" w:type="dxa"/>
+            <w:tcW w:w="7536" w:type="dxa"/>
           </w:tcPr>
           <w:p>
             <w:pPr>
@@ -825,7 +778,7 @@
                 <w:noProof/>
               </w:rPr>
               <w:drawing>
-                <wp:inline distT="0" distB="0" distL="0" distR="0" wp14:anchorId="04E65AE5" wp14:editId="66D50E00">
+                <wp:inline distT="0" distB="0" distL="0" distR="0" wp14:anchorId="52217432" wp14:editId="68738EF5">
                   <wp:extent cx="2979737" cy="1849453"/>
                   <wp:effectExtent l="133350" t="114300" r="125730" b="170180"/>
                   <wp:docPr id="22680962" name="Picture 1"/>
@@ -964,6 +917,7 @@
         <w:tc>
           <w:tcPr>
             <w:tcW w:w="2614" w:type="dxa"/>
+            <w:gridSpan w:val="2"/>
           </w:tcPr>
           <w:p>
             <w:pPr>
@@ -988,19 +942,13 @@
               <w:rPr>
                 <w:lang w:val="en-US"/>
               </w:rPr>
-              <w:t>The artistic</w:t>
-            </w:r>
-            <w:r>
-              <w:rPr>
-                <w:lang w:val="en-US"/>
-              </w:rPr>
-              <w:t xml:space="preserve"> answers of AI</w:t>
-            </w:r>
-          </w:p>
-        </w:tc>
-        <w:tc>
-          <w:tcPr>
-            <w:tcW w:w="7446" w:type="dxa"/>
+              <w:t>The artistic answers of AI</w:t>
+            </w:r>
+          </w:p>
+        </w:tc>
+        <w:tc>
+          <w:tcPr>
+            <w:tcW w:w="7536" w:type="dxa"/>
           </w:tcPr>
           <w:p>
             <w:pPr>
@@ -1014,10 +962,10 @@
                 <w:noProof/>
               </w:rPr>
               <w:drawing>
-                <wp:inline distT="0" distB="0" distL="0" distR="0" wp14:anchorId="09525E79" wp14:editId="7F35D632">
-                  <wp:extent cx="3514421" cy="663865"/>
-                  <wp:effectExtent l="152400" t="114300" r="143510" b="136525"/>
-                  <wp:docPr id="1565423476" name="Picture 1"/>
+                <wp:inline distT="0" distB="0" distL="0" distR="0" wp14:anchorId="34404351" wp14:editId="20634D00">
+                  <wp:extent cx="3416307" cy="642749"/>
+                  <wp:effectExtent l="133350" t="114300" r="127000" b="138430"/>
+                  <wp:docPr id="2146641085" name="Picture 1"/>
                   <wp:cNvGraphicFramePr>
                     <a:graphicFrameLocks xmlns:a="http://schemas.openxmlformats.org/drawingml/2006/main" noChangeAspect="1"/>
                   </wp:cNvGraphicFramePr>
@@ -1025,7 +973,7 @@
                     <a:graphicData uri="http://schemas.openxmlformats.org/drawingml/2006/picture">
                       <pic:pic xmlns:pic="http://schemas.openxmlformats.org/drawingml/2006/picture">
                         <pic:nvPicPr>
-                          <pic:cNvPr id="1565423476" name=""/>
+                          <pic:cNvPr id="2146641085" name=""/>
                           <pic:cNvPicPr/>
                         </pic:nvPicPr>
                         <pic:blipFill>
@@ -1035,9 +983,9 @@
                           </a:stretch>
                         </pic:blipFill>
                         <pic:spPr>
-                          <a:xfrm flipV="1">
+                          <a:xfrm>
                             <a:off x="0" y="0"/>
-                            <a:ext cx="3541320" cy="668946"/>
+                            <a:ext cx="3464525" cy="651821"/>
                           </a:xfrm>
                           <a:prstGeom prst="rect">
                             <a:avLst/>
@@ -1092,7 +1040,7 @@
                 <w:noProof/>
               </w:rPr>
               <w:drawing>
-                <wp:inline distT="0" distB="0" distL="0" distR="0" wp14:anchorId="7532CA88" wp14:editId="72E2F07F">
+                <wp:inline distT="0" distB="0" distL="0" distR="0" wp14:anchorId="1C8DB2EC" wp14:editId="0315CAE0">
                   <wp:extent cx="2827683" cy="1721304"/>
                   <wp:effectExtent l="133350" t="114300" r="144145" b="165100"/>
                   <wp:docPr id="447448128" name="Picture 1"/>
@@ -1224,37 +1172,26 @@
         <w:tc>
           <w:tcPr>
             <w:tcW w:w="2614" w:type="dxa"/>
-          </w:tcPr>
-          <w:p>
-            <w:pPr>
-              <w:rPr>
-                <w:lang w:val="en-US"/>
-              </w:rPr>
-            </w:pPr>
-            <w:r>
-              <w:rPr>
-                <w:lang w:val="en-US"/>
-              </w:rPr>
-              <w:t xml:space="preserve">Sets the upper limit for the total number </w:t>
-            </w:r>
-            <w:r>
-              <w:rPr>
-                <w:lang w:val="en-US"/>
-              </w:rPr>
-              <w:t xml:space="preserve">of tokens, </w:t>
+            <w:gridSpan w:val="2"/>
+          </w:tcPr>
+          <w:p>
+            <w:pPr>
+              <w:rPr>
+                <w:lang w:val="en-US"/>
+              </w:rPr>
+            </w:pPr>
+            <w:r>
+              <w:rPr>
+                <w:lang w:val="en-US"/>
+              </w:rPr>
+              <w:t xml:space="preserve">Sets the upper limit for the total number of tokens, </w:t>
             </w:r>
             <w:proofErr w:type="spellStart"/>
             <w:r>
               <w:rPr>
                 <w:lang w:val="en-US"/>
               </w:rPr>
-              <w:t>encap</w:t>
-            </w:r>
-            <w:r>
-              <w:rPr>
-                <w:lang w:val="en-US"/>
-              </w:rPr>
-              <w:t>assing</w:t>
+              <w:t>encapassing</w:t>
             </w:r>
             <w:proofErr w:type="spellEnd"/>
             <w:r>
@@ -1267,7 +1204,7 @@
         </w:tc>
         <w:tc>
           <w:tcPr>
-            <w:tcW w:w="7446" w:type="dxa"/>
+            <w:tcW w:w="7536" w:type="dxa"/>
           </w:tcPr>
           <w:p>
             <w:pPr>
@@ -1281,7 +1218,7 @@
                 <w:noProof/>
               </w:rPr>
               <w:drawing>
-                <wp:inline distT="0" distB="0" distL="0" distR="0" wp14:anchorId="131D1149" wp14:editId="3C8FDA6C">
+                <wp:inline distT="0" distB="0" distL="0" distR="0" wp14:anchorId="76149D42" wp14:editId="0FE1DB6D">
                   <wp:extent cx="2137433" cy="707805"/>
                   <wp:effectExtent l="133350" t="114300" r="129540" b="149860"/>
                   <wp:docPr id="2102568577" name="Picture 1"/>
@@ -1379,13 +1316,7 @@
               <w:rPr>
                 <w:lang w:val="en-US"/>
               </w:rPr>
-              <w:t>18</w:t>
-            </w:r>
-            <w:r>
-              <w:rPr>
-                <w:lang w:val="en-US"/>
-              </w:rPr>
-              <w:t>:39</w:t>
+              <w:t>18:39</w:t>
             </w:r>
           </w:p>
         </w:tc>
@@ -1411,18 +1342,147 @@
         <w:tc>
           <w:tcPr>
             <w:tcW w:w="2614" w:type="dxa"/>
-          </w:tcPr>
-          <w:p>
-            <w:pPr>
-              <w:rPr>
-                <w:lang w:val="en-US"/>
-              </w:rPr>
-            </w:pPr>
-          </w:p>
-        </w:tc>
-        <w:tc>
-          <w:tcPr>
-            <w:tcW w:w="7446" w:type="dxa"/>
+            <w:gridSpan w:val="2"/>
+          </w:tcPr>
+          <w:p>
+            <w:pPr>
+              <w:bidi/>
+              <w:rPr>
+                <w:rtl/>
+                <w:lang w:val="en-US"/>
+              </w:rPr>
+            </w:pPr>
+            <w:r>
+              <w:rPr>
+                <w:rFonts w:hint="cs"/>
+                <w:rtl/>
+                <w:lang w:val="en-US"/>
+              </w:rPr>
+              <w:t>צמצום עוצר המילים.</w:t>
+            </w:r>
+          </w:p>
+          <w:p>
+            <w:pPr>
+              <w:rPr>
+                <w:lang w:val="en-US"/>
+              </w:rPr>
+            </w:pPr>
+          </w:p>
+          <w:p>
+            <w:pPr>
+              <w:rPr>
+                <w:lang w:val="en-US"/>
+              </w:rPr>
+            </w:pPr>
+            <w:r>
+              <w:rPr>
+                <w:lang w:val="en-US"/>
+              </w:rPr>
+              <w:t xml:space="preserve">Lower To-P: Take the mist famous results </w:t>
+            </w:r>
+          </w:p>
+          <w:p>
+            <w:pPr>
+              <w:rPr>
+                <w:lang w:val="en-US"/>
+              </w:rPr>
+            </w:pPr>
+          </w:p>
+          <w:p>
+            <w:pPr>
+              <w:rPr>
+                <w:lang w:val="en-US"/>
+              </w:rPr>
+            </w:pPr>
+            <w:r>
+              <w:rPr>
+                <w:lang w:val="en-US"/>
+              </w:rPr>
+              <w:t xml:space="preserve">Higher </w:t>
+            </w:r>
+            <w:proofErr w:type="gramStart"/>
+            <w:r>
+              <w:rPr>
+                <w:lang w:val="en-US"/>
+              </w:rPr>
+              <w:t>Top-P</w:t>
+            </w:r>
+            <w:proofErr w:type="gramEnd"/>
+            <w:r>
+              <w:rPr>
+                <w:lang w:val="en-US"/>
+              </w:rPr>
+              <w:t xml:space="preserve">: can take </w:t>
+            </w:r>
+            <w:proofErr w:type="gramStart"/>
+            <w:r>
+              <w:rPr>
+                <w:lang w:val="en-US"/>
+              </w:rPr>
+              <w:t>the all</w:t>
+            </w:r>
+            <w:proofErr w:type="gramEnd"/>
+            <w:r>
+              <w:rPr>
+                <w:lang w:val="en-US"/>
+              </w:rPr>
+              <w:t xml:space="preserve"> options to result</w:t>
+            </w:r>
+          </w:p>
+          <w:p>
+            <w:pPr>
+              <w:rPr>
+                <w:lang w:val="en-US"/>
+              </w:rPr>
+            </w:pPr>
+          </w:p>
+          <w:p>
+            <w:pPr>
+              <w:rPr>
+                <w:lang w:val="en-US"/>
+              </w:rPr>
+            </w:pPr>
+          </w:p>
+          <w:p>
+            <w:pPr>
+              <w:rPr>
+                <w:lang w:val="en-US"/>
+              </w:rPr>
+            </w:pPr>
+          </w:p>
+          <w:p>
+            <w:pPr>
+              <w:rPr>
+                <w:lang w:val="en-US"/>
+              </w:rPr>
+            </w:pPr>
+          </w:p>
+          <w:p>
+            <w:pPr>
+              <w:rPr>
+                <w:lang w:val="en-US"/>
+              </w:rPr>
+            </w:pPr>
+          </w:p>
+          <w:p>
+            <w:pPr>
+              <w:rPr>
+                <w:lang w:val="en-US"/>
+              </w:rPr>
+            </w:pPr>
+          </w:p>
+          <w:p>
+            <w:pPr>
+              <w:jc w:val="center"/>
+              <w:rPr>
+                <w:lang w:val="en-US"/>
+              </w:rPr>
+            </w:pPr>
+          </w:p>
+        </w:tc>
+        <w:tc>
+          <w:tcPr>
+            <w:tcW w:w="7536" w:type="dxa"/>
           </w:tcPr>
           <w:p>
             <w:pPr>
@@ -1436,7 +1496,7 @@
                 <w:noProof/>
               </w:rPr>
               <w:drawing>
-                <wp:inline distT="0" distB="0" distL="0" distR="0" wp14:anchorId="2371BAB6" wp14:editId="1F273AEE">
+                <wp:inline distT="0" distB="0" distL="0" distR="0" wp14:anchorId="66ABA51C" wp14:editId="61EA0C12">
                   <wp:extent cx="2913987" cy="2405568"/>
                   <wp:effectExtent l="133350" t="114300" r="134620" b="166370"/>
                   <wp:docPr id="1757605481" name="Picture 1"/>
@@ -1524,6 +1584,50 @@
               <w:t>18:42</w:t>
             </w:r>
           </w:p>
+          <w:p>
+            <w:pPr>
+              <w:jc w:val="center"/>
+              <w:rPr>
+                <w:lang w:val="en-US"/>
+              </w:rPr>
+            </w:pPr>
+          </w:p>
+          <w:p>
+            <w:pPr>
+              <w:jc w:val="center"/>
+              <w:rPr>
+                <w:lang w:val="en-US"/>
+              </w:rPr>
+            </w:pPr>
+            <w:r>
+              <w:rPr>
+                <w:b/>
+                <w:bCs/>
+                <w:lang w:val="en-US"/>
+              </w:rPr>
+              <w:t>Record</w:t>
+            </w:r>
+            <w:r>
+              <w:rPr>
+                <w:lang w:val="en-US"/>
+              </w:rPr>
+              <w:t xml:space="preserve">: </w:t>
+            </w:r>
+          </w:p>
+          <w:p>
+            <w:pPr>
+              <w:jc w:val="center"/>
+              <w:rPr>
+                <w:lang w:val="en-US"/>
+              </w:rPr>
+            </w:pPr>
+            <w:r>
+              <w:rPr>
+                <w:lang w:val="en-US"/>
+              </w:rPr>
+              <w:t>01:10:00</w:t>
+            </w:r>
+          </w:p>
         </w:tc>
         <w:tc>
           <w:tcPr>
@@ -1546,89 +1650,57 @@
           <w:p>
             <w:pPr>
               <w:jc w:val="center"/>
+              <w:rPr>
+                <w:rtl/>
+                <w:lang w:val="en-US"/>
+              </w:rPr>
+            </w:pPr>
+            <w:r>
               <w:rPr>
                 <w:rFonts w:hint="cs"/>
                 <w:rtl/>
                 <w:lang w:val="en-US"/>
               </w:rPr>
-            </w:pPr>
-            <w:r>
-              <w:rPr>
-                <w:rFonts w:hint="cs"/>
-                <w:rtl/>
-                <w:lang w:val="en-US"/>
-              </w:rPr>
-              <w:t xml:space="preserve">עד כמה </w:t>
-            </w:r>
-            <w:r>
-              <w:rPr>
-                <w:rFonts w:hint="cs"/>
-                <w:rtl/>
-                <w:lang w:val="en-US"/>
-              </w:rPr>
-              <w:t>מפריע לי שהוא חוזר על אותה מילה</w:t>
-            </w:r>
-          </w:p>
-        </w:tc>
-        <w:tc>
-          <w:tcPr>
-            <w:tcW w:w="2614" w:type="dxa"/>
-          </w:tcPr>
-          <w:p>
-            <w:pPr>
-              <w:rPr>
-                <w:lang w:val="en-US"/>
-              </w:rPr>
-            </w:pPr>
-            <w:r>
-              <w:rPr>
-                <w:lang w:val="en-US"/>
-              </w:rPr>
-              <w:t xml:space="preserve">Parameter </w:t>
-            </w:r>
-            <w:r>
-              <w:rPr>
-                <w:lang w:val="en-US"/>
-              </w:rPr>
-              <w:t>prevents</w:t>
-            </w:r>
-            <w:r>
-              <w:rPr>
-                <w:lang w:val="en-US"/>
-              </w:rPr>
-              <w:t xml:space="preserve"> the model from</w:t>
-            </w:r>
-            <w:r>
-              <w:rPr>
-                <w:lang w:val="en-US"/>
-              </w:rPr>
-              <w:t xml:space="preserve"> repeating a word, even if it’s only been used once</w:t>
-            </w:r>
-            <w:r>
-              <w:rPr>
-                <w:lang w:val="en-US"/>
-              </w:rPr>
-              <w:t>.</w:t>
-            </w:r>
-          </w:p>
-          <w:p>
-            <w:pPr>
-              <w:rPr>
-                <w:lang w:val="en-US"/>
-              </w:rPr>
-            </w:pPr>
-          </w:p>
-          <w:p>
-            <w:pPr>
-              <w:rPr>
-                <w:lang w:val="en-US"/>
-              </w:rPr>
-            </w:pPr>
-          </w:p>
-        </w:tc>
-        <w:tc>
-          <w:tcPr>
-            <w:tcW w:w="7446" w:type="dxa"/>
+              <w:t>עד כמה מפריע לי שהוא חוזר על אותה מילה</w:t>
+            </w:r>
+          </w:p>
+        </w:tc>
+        <w:tc>
+          <w:tcPr>
+            <w:tcW w:w="2614" w:type="dxa"/>
+            <w:gridSpan w:val="2"/>
+          </w:tcPr>
+          <w:p>
+            <w:pPr>
+              <w:rPr>
+                <w:lang w:val="en-US"/>
+              </w:rPr>
+            </w:pPr>
+            <w:r>
+              <w:rPr>
+                <w:lang w:val="en-US"/>
+              </w:rPr>
+              <w:t>Parameter prevents the model from repeating a word, even if it’s only been used once.</w:t>
+            </w:r>
+          </w:p>
+          <w:p>
+            <w:pPr>
+              <w:rPr>
+                <w:lang w:val="en-US"/>
+              </w:rPr>
+            </w:pPr>
+          </w:p>
+          <w:p>
+            <w:pPr>
+              <w:rPr>
+                <w:lang w:val="en-US"/>
+              </w:rPr>
+            </w:pPr>
+          </w:p>
+        </w:tc>
+        <w:tc>
+          <w:tcPr>
+            <w:tcW w:w="7536" w:type="dxa"/>
           </w:tcPr>
           <w:p>
             <w:pPr>
@@ -1642,7 +1714,7 @@
                 <w:noProof/>
               </w:rPr>
               <w:drawing>
-                <wp:inline distT="0" distB="0" distL="0" distR="0" wp14:anchorId="315EFF11" wp14:editId="2F4064EC">
+                <wp:inline distT="0" distB="0" distL="0" distR="0" wp14:anchorId="6ADDF3C4" wp14:editId="5FDD8F40">
                   <wp:extent cx="4337216" cy="2377892"/>
                   <wp:effectExtent l="133350" t="114300" r="120650" b="156210"/>
                   <wp:docPr id="2033863273" name="Picture 1"/>
@@ -1748,34 +1820,48 @@
               <w:t>Frequency Penalty</w:t>
             </w:r>
           </w:p>
-        </w:tc>
-        <w:tc>
-          <w:tcPr>
-            <w:tcW w:w="2614" w:type="dxa"/>
-          </w:tcPr>
-          <w:p>
-            <w:pPr>
-              <w:rPr>
-                <w:lang w:val="en-US"/>
-              </w:rPr>
-            </w:pPr>
-            <w:r>
-              <w:rPr>
-                <w:lang w:val="en-US"/>
-              </w:rPr>
-              <w:t xml:space="preserve">The </w:t>
-            </w:r>
-            <w:r>
-              <w:rPr>
-                <w:lang w:val="en-US"/>
-              </w:rPr>
-              <w:t>frequency</w:t>
-            </w:r>
-            <w:r>
-              <w:rPr>
-                <w:lang w:val="en-US"/>
-              </w:rPr>
-              <w:t xml:space="preserve"> penalty </w:t>
+          <w:p>
+            <w:pPr>
+              <w:jc w:val="center"/>
+              <w:rPr>
+                <w:rtl/>
+                <w:lang w:val="en-US"/>
+              </w:rPr>
+            </w:pPr>
+            <w:r>
+              <w:rPr>
+                <w:rFonts w:hint="cs"/>
+                <w:rtl/>
+                <w:lang w:val="en-US"/>
+              </w:rPr>
+              <w:t>עד כמה אני רוצה שירד תדירות שימוש במילה</w:t>
+            </w:r>
+          </w:p>
+          <w:p>
+            <w:pPr>
+              <w:jc w:val="center"/>
+              <w:rPr>
+                <w:lang w:val="en-US"/>
+              </w:rPr>
+            </w:pPr>
+          </w:p>
+        </w:tc>
+        <w:tc>
+          <w:tcPr>
+            <w:tcW w:w="2614" w:type="dxa"/>
+            <w:gridSpan w:val="2"/>
+          </w:tcPr>
+          <w:p>
+            <w:pPr>
+              <w:rPr>
+                <w:lang w:val="en-US"/>
+              </w:rPr>
+            </w:pPr>
+            <w:r>
+              <w:rPr>
+                <w:lang w:val="en-US"/>
+              </w:rPr>
+              <w:t xml:space="preserve">The frequency penalty </w:t>
             </w:r>
             <w:proofErr w:type="gramStart"/>
             <w:r>
@@ -1789,31 +1875,13 @@
               <w:rPr>
                 <w:lang w:val="en-US"/>
               </w:rPr>
-              <w:t xml:space="preserve"> a </w:t>
-            </w:r>
-            <w:r>
-              <w:rPr>
-                <w:lang w:val="en-US"/>
-              </w:rPr>
-              <w:t>penalty</w:t>
-            </w:r>
-            <w:r>
-              <w:rPr>
-                <w:lang w:val="en-US"/>
-              </w:rPr>
-              <w:t xml:space="preserve"> on the next token proportional to how many times that token already appe</w:t>
-            </w:r>
-            <w:r>
-              <w:rPr>
-                <w:lang w:val="en-US"/>
-              </w:rPr>
-              <w:t>ared in the response and prompt</w:t>
-            </w:r>
-          </w:p>
-        </w:tc>
-        <w:tc>
-          <w:tcPr>
-            <w:tcW w:w="7446" w:type="dxa"/>
+              <w:t xml:space="preserve"> a penalty on the next token proportional to how many times that token already appeared in the response and prompt</w:t>
+            </w:r>
+          </w:p>
+        </w:tc>
+        <w:tc>
+          <w:tcPr>
+            <w:tcW w:w="7536" w:type="dxa"/>
           </w:tcPr>
           <w:p>
             <w:pPr>
@@ -1827,7 +1895,7 @@
                 <w:noProof/>
               </w:rPr>
               <w:drawing>
-                <wp:inline distT="0" distB="0" distL="0" distR="0" wp14:anchorId="1BB2FF80" wp14:editId="394CDC18">
+                <wp:inline distT="0" distB="0" distL="0" distR="0" wp14:anchorId="51CD7D90" wp14:editId="5356EC0E">
                   <wp:extent cx="4191362" cy="2648523"/>
                   <wp:effectExtent l="152400" t="114300" r="152400" b="171450"/>
                   <wp:docPr id="932200491" name="Picture 1"/>
@@ -1904,6 +1972,94 @@
             <w:pPr>
               <w:jc w:val="center"/>
               <w:rPr>
+                <w:lang w:val="en-US"/>
+              </w:rPr>
+            </w:pPr>
+            <w:r>
+              <w:rPr>
+                <w:lang w:val="en-US"/>
+              </w:rPr>
+              <w:t>18:47</w:t>
+            </w:r>
+          </w:p>
+          <w:p>
+            <w:pPr>
+              <w:jc w:val="center"/>
+              <w:rPr>
+                <w:lang w:val="en-US"/>
+              </w:rPr>
+            </w:pPr>
+            <w:r>
+              <w:rPr>
+                <w:b/>
+                <w:bCs/>
+                <w:lang w:val="en-US"/>
+              </w:rPr>
+              <w:t>Record</w:t>
+            </w:r>
+            <w:r>
+              <w:rPr>
+                <w:lang w:val="en-US"/>
+              </w:rPr>
+              <w:t>:</w:t>
+            </w:r>
+          </w:p>
+          <w:p>
+            <w:pPr>
+              <w:jc w:val="center"/>
+              <w:rPr>
+                <w:lang w:val="en-US"/>
+              </w:rPr>
+            </w:pPr>
+            <w:r>
+              <w:rPr>
+                <w:lang w:val="en-US"/>
+              </w:rPr>
+              <w:t>01:15:00</w:t>
+            </w:r>
+          </w:p>
+        </w:tc>
+        <w:tc>
+          <w:tcPr>
+            <w:tcW w:w="2614" w:type="dxa"/>
+          </w:tcPr>
+          <w:p>
+            <w:pPr>
+              <w:jc w:val="center"/>
+              <w:rPr>
+                <w:lang w:val="en-US"/>
+              </w:rPr>
+            </w:pPr>
+            <w:r>
+              <w:rPr>
+                <w:lang w:val="en-US"/>
+              </w:rPr>
+              <w:t>Logits</w:t>
+            </w:r>
+          </w:p>
+        </w:tc>
+        <w:tc>
+          <w:tcPr>
+            <w:tcW w:w="2614" w:type="dxa"/>
+            <w:gridSpan w:val="2"/>
+          </w:tcPr>
+          <w:p>
+            <w:pPr>
+              <w:rPr>
+                <w:lang w:val="en-US"/>
+              </w:rPr>
+            </w:pPr>
+            <w:r>
+              <w:rPr>
+                <w:lang w:val="en-US"/>
+              </w:rPr>
+              <w:t>Scores assigned to different words by the model</w:t>
+            </w:r>
+          </w:p>
+          <w:p>
+            <w:pPr>
+              <w:bidi/>
+              <w:rPr>
                 <w:rFonts w:hint="cs"/>
                 <w:rtl/>
                 <w:lang w:val="en-US"/>
@@ -1911,58 +2067,17 @@
             </w:pPr>
             <w:r>
               <w:rPr>
-                <w:lang w:val="en-US"/>
-              </w:rPr>
-              <w:t>18:</w:t>
-            </w:r>
-            <w:r>
-              <w:rPr>
-                <w:lang w:val="en-US"/>
-              </w:rPr>
-              <w:t>47</w:t>
-            </w:r>
-          </w:p>
-        </w:tc>
-        <w:tc>
-          <w:tcPr>
-            <w:tcW w:w="2614" w:type="dxa"/>
-          </w:tcPr>
-          <w:p>
-            <w:pPr>
-              <w:jc w:val="center"/>
-              <w:rPr>
-                <w:lang w:val="en-US"/>
-              </w:rPr>
-            </w:pPr>
-            <w:r>
-              <w:rPr>
-                <w:lang w:val="en-US"/>
-              </w:rPr>
-              <w:t>Logits</w:t>
-            </w:r>
-          </w:p>
-        </w:tc>
-        <w:tc>
-          <w:tcPr>
-            <w:tcW w:w="2614" w:type="dxa"/>
-          </w:tcPr>
-          <w:p>
-            <w:pPr>
-              <w:rPr>
-                <w:lang w:val="en-US"/>
-              </w:rPr>
-            </w:pPr>
-            <w:r>
-              <w:rPr>
-                <w:lang w:val="en-US"/>
-              </w:rPr>
-              <w:t>Scores assigned to different words by the model</w:t>
-            </w:r>
-          </w:p>
-        </w:tc>
-        <w:tc>
-          <w:tcPr>
-            <w:tcW w:w="7446" w:type="dxa"/>
+                <w:rFonts w:hint="cs"/>
+                <w:rtl/>
+                <w:lang w:val="en-US"/>
+              </w:rPr>
+              <w:t>אחוז סיכוי שימוש במילה</w:t>
+            </w:r>
+          </w:p>
+        </w:tc>
+        <w:tc>
+          <w:tcPr>
+            <w:tcW w:w="7536" w:type="dxa"/>
           </w:tcPr>
           <w:p>
             <w:pPr>
@@ -1990,9 +2105,46 @@
               <w:rPr>
                 <w:lang w:val="en-US"/>
               </w:rPr>
+              <w:lastRenderedPageBreak/>
               <w:t>19:12</w:t>
             </w:r>
           </w:p>
+          <w:p>
+            <w:pPr>
+              <w:jc w:val="center"/>
+              <w:rPr>
+                <w:lang w:val="en-US"/>
+              </w:rPr>
+            </w:pPr>
+            <w:r>
+              <w:rPr>
+                <w:b/>
+                <w:bCs/>
+                <w:lang w:val="en-US"/>
+              </w:rPr>
+              <w:t>Record</w:t>
+            </w:r>
+            <w:r>
+              <w:rPr>
+                <w:lang w:val="en-US"/>
+              </w:rPr>
+              <w:t>:</w:t>
+            </w:r>
+          </w:p>
+          <w:p>
+            <w:pPr>
+              <w:jc w:val="center"/>
+              <w:rPr>
+                <w:lang w:val="en-US"/>
+              </w:rPr>
+            </w:pPr>
+            <w:r>
+              <w:rPr>
+                <w:lang w:val="en-US"/>
+              </w:rPr>
+              <w:t>01:40:10</w:t>
+            </w:r>
+          </w:p>
         </w:tc>
         <w:tc>
           <w:tcPr>
@@ -2010,13 +2162,7 @@
               <w:rPr>
                 <w:lang w:val="en-US"/>
               </w:rPr>
-              <w:t>Pro</w:t>
-            </w:r>
-            <w:r>
-              <w:rPr>
-                <w:lang w:val="en-US"/>
-              </w:rPr>
-              <w:t>mps</w:t>
+              <w:t>Promps</w:t>
             </w:r>
             <w:proofErr w:type="spellEnd"/>
             <w:r>
@@ -2038,6 +2184,7 @@
         <w:tc>
           <w:tcPr>
             <w:tcW w:w="2614" w:type="dxa"/>
+            <w:gridSpan w:val="2"/>
           </w:tcPr>
           <w:p>
             <w:pPr>
@@ -2063,26 +2210,19 @@
               <w:rPr>
                 <w:lang w:val="en-US"/>
               </w:rPr>
-              <w:t xml:space="preserve"> the best </w:t>
-            </w:r>
-            <w:r>
-              <w:rPr>
-                <w:lang w:val="en-US"/>
-              </w:rPr>
-              <w:t>result.</w:t>
-            </w:r>
-          </w:p>
-          <w:p>
-            <w:pPr>
-              <w:rPr>
-                <w:lang w:val="en-US"/>
-              </w:rPr>
-            </w:pPr>
-            <w:r>
-              <w:rPr>
-                <w:lang w:val="en-US"/>
-              </w:rPr>
-              <w:lastRenderedPageBreak/>
+              <w:t xml:space="preserve"> the best result.</w:t>
+            </w:r>
+          </w:p>
+          <w:p>
+            <w:pPr>
+              <w:rPr>
+                <w:lang w:val="en-US"/>
+              </w:rPr>
+            </w:pPr>
+            <w:r>
+              <w:rPr>
+                <w:lang w:val="en-US"/>
+              </w:rPr>
               <w:t>Tactics</w:t>
             </w:r>
           </w:p>
@@ -2096,7 +2236,7 @@
         </w:tc>
         <w:tc>
           <w:tcPr>
-            <w:tcW w:w="7446" w:type="dxa"/>
+            <w:tcW w:w="7536" w:type="dxa"/>
           </w:tcPr>
           <w:p>
             <w:pPr>
@@ -2152,18 +2292,19 @@
         <w:tc>
           <w:tcPr>
             <w:tcW w:w="2614" w:type="dxa"/>
-          </w:tcPr>
-          <w:p>
-            <w:pPr>
-              <w:rPr>
-                <w:lang w:val="en-US"/>
-              </w:rPr>
-            </w:pPr>
-          </w:p>
-        </w:tc>
-        <w:tc>
-          <w:tcPr>
-            <w:tcW w:w="7446" w:type="dxa"/>
+            <w:gridSpan w:val="2"/>
+          </w:tcPr>
+          <w:p>
+            <w:pPr>
+              <w:rPr>
+                <w:lang w:val="en-US"/>
+              </w:rPr>
+            </w:pPr>
+          </w:p>
+        </w:tc>
+        <w:tc>
+          <w:tcPr>
+            <w:tcW w:w="7536" w:type="dxa"/>
           </w:tcPr>
           <w:p>
             <w:pPr>
@@ -2177,7 +2318,7 @@
                 <w:noProof/>
               </w:rPr>
               <w:drawing>
-                <wp:inline distT="0" distB="0" distL="0" distR="0" wp14:anchorId="437AB0CD" wp14:editId="7FE9FC74">
+                <wp:inline distT="0" distB="0" distL="0" distR="0" wp14:anchorId="48AAC0C2" wp14:editId="59B1ACFD">
                   <wp:extent cx="4076545" cy="2175675"/>
                   <wp:effectExtent l="133350" t="114300" r="153035" b="148590"/>
                   <wp:docPr id="602190157" name="Picture 1"/>
@@ -2264,6 +2405,42 @@
               <w:t>19:17</w:t>
             </w:r>
           </w:p>
+          <w:p>
+            <w:pPr>
+              <w:jc w:val="center"/>
+              <w:rPr>
+                <w:lang w:val="en-US"/>
+              </w:rPr>
+            </w:pPr>
+            <w:r>
+              <w:rPr>
+                <w:b/>
+                <w:bCs/>
+                <w:lang w:val="en-US"/>
+              </w:rPr>
+              <w:t>Record</w:t>
+            </w:r>
+            <w:r>
+              <w:rPr>
+                <w:lang w:val="en-US"/>
+              </w:rPr>
+              <w:t>:</w:t>
+            </w:r>
+          </w:p>
+          <w:p>
+            <w:pPr>
+              <w:jc w:val="center"/>
+              <w:rPr>
+                <w:lang w:val="en-US"/>
+              </w:rPr>
+            </w:pPr>
+            <w:r>
+              <w:rPr>
+                <w:lang w:val="en-US"/>
+              </w:rPr>
+              <w:t>01:44:13</w:t>
+            </w:r>
+          </w:p>
         </w:tc>
         <w:tc>
           <w:tcPr>
@@ -2283,10 +2460,36 @@
               <w:t>Delimiters</w:t>
             </w:r>
           </w:p>
-        </w:tc>
-        <w:tc>
-          <w:tcPr>
-            <w:tcW w:w="2614" w:type="dxa"/>
+          <w:p>
+            <w:pPr>
+              <w:jc w:val="center"/>
+              <w:rPr>
+                <w:lang w:val="en-US"/>
+              </w:rPr>
+            </w:pPr>
+          </w:p>
+          <w:p>
+            <w:pPr>
+              <w:jc w:val="right"/>
+              <w:rPr>
+                <w:rFonts w:hint="cs"/>
+                <w:lang w:val="en-US"/>
+              </w:rPr>
+            </w:pPr>
+            <w:r>
+              <w:rPr>
+                <w:rFonts w:hint="cs"/>
+                <w:rtl/>
+                <w:lang w:val="en-US"/>
+              </w:rPr>
+              <w:t>דרך להפריד בין שאלה\בקשה לקטע מסוים</w:t>
+            </w:r>
+          </w:p>
+        </w:tc>
+        <w:tc>
+          <w:tcPr>
+            <w:tcW w:w="2614" w:type="dxa"/>
+            <w:gridSpan w:val="2"/>
           </w:tcPr>
           <w:p>
             <w:pPr>
@@ -2312,19 +2515,7 @@
               <w:rPr>
                 <w:lang w:val="en-US"/>
               </w:rPr>
-              <w:t xml:space="preserve"> in pro</w:t>
-            </w:r>
-            <w:r>
-              <w:rPr>
-                <w:lang w:val="en-US"/>
-              </w:rPr>
-              <w:t xml:space="preserve">mpts can be beneficial in situations where </w:t>
-            </w:r>
-            <w:r>
-              <w:rPr>
-                <w:lang w:val="en-US"/>
-              </w:rPr>
-              <w:t xml:space="preserve">you want to structure your input </w:t>
+              <w:t xml:space="preserve"> in prompts can be beneficial in situations where you want to structure your input </w:t>
             </w:r>
             <w:proofErr w:type="gramStart"/>
             <w:r>
@@ -2366,19 +2557,13 @@
               <w:rPr>
                 <w:lang w:val="en-US"/>
               </w:rPr>
-              <w:t xml:space="preserve"> on </w:t>
-            </w:r>
-            <w:r>
-              <w:rPr>
-                <w:lang w:val="en-US"/>
-              </w:rPr>
-              <w:t>textual context</w:t>
-            </w:r>
-          </w:p>
-        </w:tc>
-        <w:tc>
-          <w:tcPr>
-            <w:tcW w:w="7446" w:type="dxa"/>
+              <w:t xml:space="preserve"> on textual context</w:t>
+            </w:r>
+          </w:p>
+        </w:tc>
+        <w:tc>
+          <w:tcPr>
+            <w:tcW w:w="7536" w:type="dxa"/>
           </w:tcPr>
           <w:p>
             <w:pPr>
@@ -2392,7 +2577,7 @@
                 <w:noProof/>
               </w:rPr>
               <w:drawing>
-                <wp:inline distT="0" distB="0" distL="0" distR="0" wp14:anchorId="17911138" wp14:editId="07C23ECB">
+                <wp:inline distT="0" distB="0" distL="0" distR="0" wp14:anchorId="10464FF0" wp14:editId="74755E7C">
                   <wp:extent cx="3802352" cy="2692512"/>
                   <wp:effectExtent l="133350" t="114300" r="141605" b="165100"/>
                   <wp:docPr id="1154717965" name="Picture 1"/>
@@ -2480,6 +2665,42 @@
               <w:t>19:20</w:t>
             </w:r>
           </w:p>
+          <w:p>
+            <w:pPr>
+              <w:jc w:val="center"/>
+              <w:rPr>
+                <w:lang w:val="en-US"/>
+              </w:rPr>
+            </w:pPr>
+            <w:r>
+              <w:rPr>
+                <w:b/>
+                <w:bCs/>
+                <w:lang w:val="en-US"/>
+              </w:rPr>
+              <w:t>Record</w:t>
+            </w:r>
+            <w:r>
+              <w:rPr>
+                <w:lang w:val="en-US"/>
+              </w:rPr>
+              <w:t>:</w:t>
+            </w:r>
+          </w:p>
+          <w:p>
+            <w:pPr>
+              <w:jc w:val="center"/>
+              <w:rPr>
+                <w:lang w:val="en-US"/>
+              </w:rPr>
+            </w:pPr>
+            <w:r>
+              <w:rPr>
+                <w:lang w:val="en-US"/>
+              </w:rPr>
+              <w:t>01:47:37</w:t>
+            </w:r>
+          </w:p>
         </w:tc>
         <w:tc>
           <w:tcPr>
@@ -2499,18 +2720,40 @@
               <w:t>Specify Steps</w:t>
             </w:r>
           </w:p>
-        </w:tc>
-        <w:tc>
-          <w:tcPr>
-            <w:tcW w:w="2614" w:type="dxa"/>
-          </w:tcPr>
-          <w:p>
-            <w:pPr>
+          <w:p>
+            <w:pPr>
+              <w:jc w:val="right"/>
+              <w:rPr>
+                <w:lang w:val="en-US"/>
+              </w:rPr>
+            </w:pPr>
+            <w:r>
               <w:rPr>
                 <w:rFonts w:hint="cs"/>
                 <w:rtl/>
                 <w:lang w:val="en-US"/>
               </w:rPr>
+              <w:t xml:space="preserve">חלוקת התוכנים לפי שלבים </w:t>
+            </w:r>
+            <w:r>
+              <w:rPr>
+                <w:lang w:val="en-US"/>
+              </w:rPr>
+              <w:t xml:space="preserve"> (Step-by-Step)</w:t>
+            </w:r>
+          </w:p>
+        </w:tc>
+        <w:tc>
+          <w:tcPr>
+            <w:tcW w:w="2614" w:type="dxa"/>
+            <w:gridSpan w:val="2"/>
+          </w:tcPr>
+          <w:p>
+            <w:pPr>
+              <w:rPr>
+                <w:rtl/>
+                <w:lang w:val="en-US"/>
+              </w:rPr>
             </w:pPr>
             <w:r>
               <w:rPr>
@@ -2522,7 +2765,7 @@
         </w:tc>
         <w:tc>
           <w:tcPr>
-            <w:tcW w:w="7446" w:type="dxa"/>
+            <w:tcW w:w="7536" w:type="dxa"/>
           </w:tcPr>
           <w:p>
             <w:pPr>
@@ -2536,7 +2779,7 @@
                 <w:noProof/>
               </w:rPr>
               <w:drawing>
-                <wp:inline distT="0" distB="0" distL="0" distR="0" wp14:anchorId="669ABBFB" wp14:editId="30986E04">
+                <wp:inline distT="0" distB="0" distL="0" distR="0" wp14:anchorId="55B6B302" wp14:editId="5CFE2639">
                   <wp:extent cx="3002825" cy="2986623"/>
                   <wp:effectExtent l="133350" t="114300" r="121920" b="156845"/>
                   <wp:docPr id="450130856" name="Picture 1"/>
@@ -2625,31 +2868,157 @@
               <w:t>19:22</w:t>
             </w:r>
           </w:p>
-        </w:tc>
-        <w:tc>
-          <w:tcPr>
-            <w:tcW w:w="2614" w:type="dxa"/>
-          </w:tcPr>
-          <w:p>
-            <w:pPr>
-              <w:jc w:val="center"/>
+          <w:p>
+            <w:pPr>
+              <w:jc w:val="center"/>
+              <w:rPr>
+                <w:lang w:val="en-US"/>
+              </w:rPr>
+            </w:pPr>
+            <w:r>
+              <w:rPr>
+                <w:b/>
+                <w:bCs/>
+                <w:lang w:val="en-US"/>
+              </w:rPr>
+              <w:t>Record</w:t>
+            </w:r>
+            <w:r>
+              <w:rPr>
+                <w:lang w:val="en-US"/>
+              </w:rPr>
+              <w:t>:</w:t>
+            </w:r>
+          </w:p>
+          <w:p>
+            <w:pPr>
+              <w:jc w:val="center"/>
+              <w:rPr>
+                <w:lang w:val="en-US"/>
+              </w:rPr>
+            </w:pPr>
+            <w:r>
+              <w:rPr>
+                <w:lang w:val="en-US"/>
+              </w:rPr>
+              <w:t>01:49:58</w:t>
+            </w:r>
+          </w:p>
+        </w:tc>
+        <w:tc>
+          <w:tcPr>
+            <w:tcW w:w="2614" w:type="dxa"/>
+          </w:tcPr>
+          <w:p>
+            <w:pPr>
+              <w:jc w:val="center"/>
+              <w:rPr>
+                <w:lang w:val="en-US"/>
+              </w:rPr>
+            </w:pPr>
+            <w:r>
+              <w:rPr>
+                <w:lang w:val="en-US"/>
+              </w:rPr>
+              <w:t>Roles &amp; Goals</w:t>
+            </w:r>
+          </w:p>
+          <w:p>
+            <w:pPr>
+              <w:jc w:val="center"/>
+              <w:rPr>
+                <w:lang w:val="en-US"/>
+              </w:rPr>
+            </w:pPr>
+          </w:p>
+          <w:p>
+            <w:pPr>
+              <w:jc w:val="right"/>
+              <w:rPr>
+                <w:lang w:val="en-US"/>
+              </w:rPr>
+            </w:pPr>
+            <w:r>
+              <w:rPr>
+                <w:lang w:val="en-US"/>
+              </w:rPr>
+              <w:t>Goals - "</w:t>
+            </w:r>
+            <w:r>
               <w:rPr>
                 <w:rFonts w:hint="cs"/>
                 <w:rtl/>
                 <w:lang w:val="en-US"/>
               </w:rPr>
-            </w:pPr>
-            <w:r>
-              <w:rPr>
-                <w:lang w:val="en-US"/>
-              </w:rPr>
-              <w:t>Roles &amp; Goals</w:t>
-            </w:r>
-          </w:p>
-        </w:tc>
-        <w:tc>
-          <w:tcPr>
-            <w:tcW w:w="2614" w:type="dxa"/>
+              <w:t>לשים קובע של מישהו\משהו אחר"</w:t>
+            </w:r>
+            <w:r>
+              <w:rPr>
+                <w:lang w:val="en-US"/>
+              </w:rPr>
+              <w:t xml:space="preserve"> </w:t>
+            </w:r>
+          </w:p>
+          <w:p>
+            <w:pPr>
+              <w:jc w:val="right"/>
+              <w:rPr>
+                <w:rFonts w:hint="cs"/>
+                <w:lang w:val="en-US"/>
+              </w:rPr>
+            </w:pPr>
+            <w:proofErr w:type="gramStart"/>
+            <w:r>
+              <w:rPr>
+                <w:lang w:val="en-US"/>
+              </w:rPr>
+              <w:t xml:space="preserve">Roles </w:t>
+            </w:r>
+            <w:r>
+              <w:rPr>
+                <w:rFonts w:hint="cs"/>
+                <w:rtl/>
+                <w:lang w:val="en-US"/>
+              </w:rPr>
+              <w:t xml:space="preserve"> -</w:t>
+            </w:r>
+            <w:proofErr w:type="gramEnd"/>
+            <w:r>
+              <w:rPr>
+                <w:rFonts w:hint="cs"/>
+                <w:rtl/>
+                <w:lang w:val="en-US"/>
+              </w:rPr>
+              <w:t xml:space="preserve"> מטרתו של ה</w:t>
+            </w:r>
+            <w:r>
+              <w:rPr>
+                <w:lang w:val="en-US"/>
+              </w:rPr>
+              <w:t>AI</w:t>
+            </w:r>
+            <w:r>
+              <w:rPr>
+                <w:rFonts w:hint="cs"/>
+                <w:rtl/>
+                <w:lang w:val="en-US"/>
+              </w:rPr>
+              <w:t xml:space="preserve"> כאשר הוא ב"קובע"</w:t>
+            </w:r>
+          </w:p>
+          <w:p>
+            <w:pPr>
+              <w:rPr>
+                <w:rtl/>
+                <w:lang w:val="en-US"/>
+              </w:rPr>
+            </w:pPr>
+          </w:p>
+        </w:tc>
+        <w:tc>
+          <w:tcPr>
+            <w:tcW w:w="2614" w:type="dxa"/>
+            <w:gridSpan w:val="2"/>
           </w:tcPr>
           <w:p>
             <w:pPr>
@@ -2703,7 +3072,7 @@
         </w:tc>
         <w:tc>
           <w:tcPr>
-            <w:tcW w:w="7446" w:type="dxa"/>
+            <w:tcW w:w="7536" w:type="dxa"/>
           </w:tcPr>
           <w:p>
             <w:pPr>
@@ -2717,7 +3086,7 @@
                 <w:noProof/>
               </w:rPr>
               <w:drawing>
-                <wp:inline distT="0" distB="0" distL="0" distR="0" wp14:anchorId="5BA03470" wp14:editId="6D72F61F">
+                <wp:inline distT="0" distB="0" distL="0" distR="0" wp14:anchorId="1D0D3206" wp14:editId="1E44D770">
                   <wp:extent cx="3985208" cy="1458931"/>
                   <wp:effectExtent l="152400" t="114300" r="149225" b="160655"/>
                   <wp:docPr id="1119957091" name="Picture 1"/>
@@ -2795,7 +3164,7 @@
                 <w:noProof/>
               </w:rPr>
               <w:drawing>
-                <wp:inline distT="0" distB="0" distL="0" distR="0" wp14:anchorId="12AF6E4E" wp14:editId="636EEF1E">
+                <wp:inline distT="0" distB="0" distL="0" distR="0" wp14:anchorId="5209B38F" wp14:editId="593A66EA">
                   <wp:extent cx="3177145" cy="684308"/>
                   <wp:effectExtent l="152400" t="114300" r="118745" b="173355"/>
                   <wp:docPr id="283238123" name="Picture 1"/>
@@ -2880,13 +3249,43 @@
                 <w:lang w:val="en-US"/>
               </w:rPr>
               <w:lastRenderedPageBreak/>
-              <w:t>19:</w:t>
-            </w:r>
-            <w:r>
-              <w:rPr>
-                <w:lang w:val="en-US"/>
-              </w:rPr>
-              <w:t>32</w:t>
+              <w:t>19:32</w:t>
+            </w:r>
+          </w:p>
+          <w:p>
+            <w:pPr>
+              <w:jc w:val="center"/>
+              <w:rPr>
+                <w:lang w:val="en-US"/>
+              </w:rPr>
+            </w:pPr>
+            <w:r>
+              <w:rPr>
+                <w:b/>
+                <w:bCs/>
+                <w:lang w:val="en-US"/>
+              </w:rPr>
+              <w:t>Record</w:t>
+            </w:r>
+            <w:r>
+              <w:rPr>
+                <w:lang w:val="en-US"/>
+              </w:rPr>
+              <w:t>:</w:t>
+            </w:r>
+          </w:p>
+          <w:p>
+            <w:pPr>
+              <w:jc w:val="center"/>
+              <w:rPr>
+                <w:lang w:val="en-US"/>
+              </w:rPr>
+            </w:pPr>
+            <w:r>
+              <w:rPr>
+                <w:lang w:val="en-US"/>
+              </w:rPr>
+              <w:t>01:59:38</w:t>
             </w:r>
           </w:p>
         </w:tc>
@@ -2912,6 +3311,7 @@
         <w:tc>
           <w:tcPr>
             <w:tcW w:w="2614" w:type="dxa"/>
+            <w:gridSpan w:val="2"/>
           </w:tcPr>
           <w:p>
             <w:pPr>
@@ -2942,7 +3342,7 @@
         </w:tc>
         <w:tc>
           <w:tcPr>
-            <w:tcW w:w="7446" w:type="dxa"/>
+            <w:tcW w:w="7536" w:type="dxa"/>
           </w:tcPr>
           <w:p>
             <w:pPr>
@@ -2956,7 +3356,7 @@
                 <w:noProof/>
               </w:rPr>
               <w:drawing>
-                <wp:inline distT="0" distB="0" distL="0" distR="0" wp14:anchorId="08D64B4B" wp14:editId="73A59919">
+                <wp:inline distT="0" distB="0" distL="0" distR="0" wp14:anchorId="308B036A" wp14:editId="600EBC44">
                   <wp:extent cx="3488115" cy="1802409"/>
                   <wp:effectExtent l="152400" t="114300" r="150495" b="160020"/>
                   <wp:docPr id="416197373" name="Picture 1"/>
@@ -3043,29 +3443,59 @@
               <w:t>19:35</w:t>
             </w:r>
           </w:p>
-        </w:tc>
-        <w:tc>
-          <w:tcPr>
-            <w:tcW w:w="2614" w:type="dxa"/>
-          </w:tcPr>
-          <w:p>
-            <w:pPr>
-              <w:jc w:val="center"/>
-              <w:rPr>
-                <w:lang w:val="en-US"/>
-              </w:rPr>
-            </w:pPr>
-            <w:r>
-              <w:rPr>
-                <w:lang w:val="en-US"/>
-              </w:rPr>
-              <w:t xml:space="preserve">ChatGPT Prompts </w:t>
-            </w:r>
-            <w:r>
-              <w:rPr>
-                <w:lang w:val="en-US"/>
-              </w:rPr>
-              <w:t>Strategi:</w:t>
+          <w:p>
+            <w:pPr>
+              <w:jc w:val="center"/>
+              <w:rPr>
+                <w:lang w:val="en-US"/>
+              </w:rPr>
+            </w:pPr>
+            <w:r>
+              <w:rPr>
+                <w:b/>
+                <w:bCs/>
+                <w:lang w:val="en-US"/>
+              </w:rPr>
+              <w:t>Record</w:t>
+            </w:r>
+            <w:r>
+              <w:rPr>
+                <w:lang w:val="en-US"/>
+              </w:rPr>
+              <w:t>:</w:t>
+            </w:r>
+          </w:p>
+          <w:p>
+            <w:pPr>
+              <w:jc w:val="center"/>
+              <w:rPr>
+                <w:lang w:val="en-US"/>
+              </w:rPr>
+            </w:pPr>
+            <w:r>
+              <w:rPr>
+                <w:lang w:val="en-US"/>
+              </w:rPr>
+              <w:t>02:03:03</w:t>
+            </w:r>
+          </w:p>
+        </w:tc>
+        <w:tc>
+          <w:tcPr>
+            <w:tcW w:w="2614" w:type="dxa"/>
+          </w:tcPr>
+          <w:p>
+            <w:pPr>
+              <w:jc w:val="center"/>
+              <w:rPr>
+                <w:lang w:val="en-US"/>
+              </w:rPr>
+            </w:pPr>
+            <w:r>
+              <w:rPr>
+                <w:lang w:val="en-US"/>
+              </w:rPr>
+              <w:t>ChatGPT Prompts Strategi:</w:t>
             </w:r>
           </w:p>
           <w:p>
@@ -3086,6 +3516,7 @@
         <w:tc>
           <w:tcPr>
             <w:tcW w:w="2614" w:type="dxa"/>
+            <w:gridSpan w:val="2"/>
           </w:tcPr>
           <w:p>
             <w:pPr>
@@ -3113,10 +3544,27 @@
               <w:t>And get the output</w:t>
             </w:r>
           </w:p>
-        </w:tc>
-        <w:tc>
-          <w:tcPr>
-            <w:tcW w:w="7446" w:type="dxa"/>
+          <w:p>
+            <w:pPr>
+              <w:jc w:val="right"/>
+              <w:rPr>
+                <w:rFonts w:hint="cs"/>
+                <w:lang w:val="en-US"/>
+              </w:rPr>
+            </w:pPr>
+            <w:r>
+              <w:rPr>
+                <w:rFonts w:hint="cs"/>
+                <w:rtl/>
+                <w:lang w:val="en-US"/>
+              </w:rPr>
+              <w:t>הכנסת טקסט\קלט אחר וקבלת חזרה את הפלט</w:t>
+            </w:r>
+          </w:p>
+        </w:tc>
+        <w:tc>
+          <w:tcPr>
+            <w:tcW w:w="7536" w:type="dxa"/>
           </w:tcPr>
           <w:p>
             <w:pPr>
@@ -3151,6 +3599,50 @@
               <w:t>19:36</w:t>
             </w:r>
           </w:p>
+          <w:p>
+            <w:pPr>
+              <w:jc w:val="center"/>
+              <w:rPr>
+                <w:lang w:val="en-US"/>
+              </w:rPr>
+            </w:pPr>
+          </w:p>
+          <w:p>
+            <w:pPr>
+              <w:jc w:val="center"/>
+              <w:rPr>
+                <w:lang w:val="en-US"/>
+              </w:rPr>
+            </w:pPr>
+            <w:r>
+              <w:rPr>
+                <w:b/>
+                <w:bCs/>
+                <w:lang w:val="en-US"/>
+              </w:rPr>
+              <w:t>Record</w:t>
+            </w:r>
+            <w:r>
+              <w:rPr>
+                <w:lang w:val="en-US"/>
+              </w:rPr>
+              <w:t>:</w:t>
+            </w:r>
+          </w:p>
+          <w:p>
+            <w:pPr>
+              <w:jc w:val="center"/>
+              <w:rPr>
+                <w:lang w:val="en-US"/>
+              </w:rPr>
+            </w:pPr>
+            <w:r>
+              <w:rPr>
+                <w:lang w:val="en-US"/>
+              </w:rPr>
+              <w:t>02:04:53</w:t>
+            </w:r>
+          </w:p>
         </w:tc>
         <w:tc>
           <w:tcPr>
@@ -3185,10 +3677,50 @@
               <w:t>X-Shot</w:t>
             </w:r>
           </w:p>
-        </w:tc>
-        <w:tc>
-          <w:tcPr>
-            <w:tcW w:w="2614" w:type="dxa"/>
+          <w:p>
+            <w:pPr>
+              <w:bidi/>
+              <w:rPr>
+                <w:rtl/>
+                <w:lang w:val="en-US"/>
+              </w:rPr>
+            </w:pPr>
+          </w:p>
+          <w:p>
+            <w:pPr>
+              <w:bidi/>
+              <w:rPr>
+                <w:lang w:val="en-US"/>
+              </w:rPr>
+            </w:pPr>
+            <w:r>
+              <w:rPr>
+                <w:rFonts w:hint="cs"/>
+                <w:rtl/>
+                <w:lang w:val="en-US"/>
+              </w:rPr>
+              <w:t>מתן דוגמאות ל</w:t>
+            </w:r>
+            <w:r>
+              <w:rPr>
+                <w:lang w:val="en-US"/>
+              </w:rPr>
+              <w:t>AI</w:t>
+            </w:r>
+            <w:r>
+              <w:rPr>
+                <w:rFonts w:hint="cs"/>
+                <w:rtl/>
+                <w:lang w:val="en-US"/>
+              </w:rPr>
+              <w:t xml:space="preserve"> ביחד עם השאלה\בקשה</w:t>
+            </w:r>
+          </w:p>
+        </w:tc>
+        <w:tc>
+          <w:tcPr>
+            <w:tcW w:w="2614" w:type="dxa"/>
+            <w:gridSpan w:val="2"/>
           </w:tcPr>
           <w:p>
             <w:pPr>
@@ -3213,7 +3745,7 @@
         </w:tc>
         <w:tc>
           <w:tcPr>
-            <w:tcW w:w="7446" w:type="dxa"/>
+            <w:tcW w:w="7536" w:type="dxa"/>
           </w:tcPr>
           <w:p>
             <w:pPr>
@@ -3227,7 +3759,7 @@
                 <w:noProof/>
               </w:rPr>
               <w:drawing>
-                <wp:inline distT="0" distB="0" distL="0" distR="0" wp14:anchorId="241F6703" wp14:editId="2BFF126F">
+                <wp:inline distT="0" distB="0" distL="0" distR="0" wp14:anchorId="305976D6" wp14:editId="7330CC6D">
                   <wp:extent cx="3085714" cy="466667"/>
                   <wp:effectExtent l="133350" t="114300" r="114935" b="162560"/>
                   <wp:docPr id="1522415803" name="Picture 1"/>
@@ -3354,6 +3886,7 @@
         <w:tc>
           <w:tcPr>
             <w:tcW w:w="2614" w:type="dxa"/>
+            <w:gridSpan w:val="2"/>
           </w:tcPr>
           <w:p>
             <w:pPr>
@@ -3378,7 +3911,7 @@
         </w:tc>
         <w:tc>
           <w:tcPr>
-            <w:tcW w:w="7446" w:type="dxa"/>
+            <w:tcW w:w="7536" w:type="dxa"/>
           </w:tcPr>
           <w:p>
             <w:pPr>
@@ -3392,7 +3925,7 @@
                 <w:noProof/>
               </w:rPr>
               <w:drawing>
-                <wp:inline distT="0" distB="0" distL="0" distR="0" wp14:anchorId="75F0FDE9" wp14:editId="3949D5A5">
+                <wp:inline distT="0" distB="0" distL="0" distR="0" wp14:anchorId="321F65E3" wp14:editId="79948BB4">
                   <wp:extent cx="2714286" cy="628571"/>
                   <wp:effectExtent l="133350" t="114300" r="143510" b="153035"/>
                   <wp:docPr id="1080097949" name="Picture 1"/>
@@ -3495,6 +4028,7 @@
         <w:tc>
           <w:tcPr>
             <w:tcW w:w="2614" w:type="dxa"/>
+            <w:gridSpan w:val="2"/>
           </w:tcPr>
           <w:p>
             <w:pPr>
@@ -3550,7 +4084,7 @@
         </w:tc>
         <w:tc>
           <w:tcPr>
-            <w:tcW w:w="7446" w:type="dxa"/>
+            <w:tcW w:w="7536" w:type="dxa"/>
           </w:tcPr>
           <w:p>
             <w:pPr>
@@ -3564,7 +4098,7 @@
                 <w:noProof/>
               </w:rPr>
               <w:drawing>
-                <wp:inline distT="0" distB="0" distL="0" distR="0" wp14:anchorId="010F55A1" wp14:editId="4454A2E8">
+                <wp:inline distT="0" distB="0" distL="0" distR="0" wp14:anchorId="52C07B37" wp14:editId="3D43CC84">
                   <wp:extent cx="2379797" cy="1185971"/>
                   <wp:effectExtent l="133350" t="114300" r="154305" b="167005"/>
                   <wp:docPr id="1939861984" name="Picture 1"/>
@@ -3655,29 +4189,74 @@
               <w:t>19:52</w:t>
             </w:r>
           </w:p>
-        </w:tc>
-        <w:tc>
-          <w:tcPr>
-            <w:tcW w:w="2614" w:type="dxa"/>
-          </w:tcPr>
-          <w:p>
-            <w:pPr>
-              <w:jc w:val="center"/>
-              <w:rPr>
-                <w:lang w:val="en-US"/>
-              </w:rPr>
-            </w:pPr>
-            <w:r>
-              <w:rPr>
-                <w:lang w:val="en-US"/>
-              </w:rPr>
-              <w:t>Iterative</w:t>
-            </w:r>
-          </w:p>
-        </w:tc>
-        <w:tc>
-          <w:tcPr>
-            <w:tcW w:w="2614" w:type="dxa"/>
+          <w:p>
+            <w:pPr>
+              <w:jc w:val="center"/>
+              <w:rPr>
+                <w:lang w:val="en-US"/>
+              </w:rPr>
+            </w:pPr>
+          </w:p>
+          <w:p>
+            <w:pPr>
+              <w:jc w:val="center"/>
+              <w:rPr>
+                <w:lang w:val="en-US"/>
+              </w:rPr>
+            </w:pPr>
+            <w:r>
+              <w:rPr>
+                <w:b/>
+                <w:bCs/>
+                <w:lang w:val="en-US"/>
+              </w:rPr>
+              <w:t>Record</w:t>
+            </w:r>
+            <w:r>
+              <w:rPr>
+                <w:lang w:val="en-US"/>
+              </w:rPr>
+              <w:t>:</w:t>
+            </w:r>
+          </w:p>
+          <w:p>
+            <w:pPr>
+              <w:jc w:val="center"/>
+              <w:rPr>
+                <w:lang w:val="en-US"/>
+              </w:rPr>
+            </w:pPr>
+            <w:r>
+              <w:rPr>
+                <w:lang w:val="en-US"/>
+              </w:rPr>
+              <w:t>02:19:35</w:t>
+            </w:r>
+          </w:p>
+        </w:tc>
+        <w:tc>
+          <w:tcPr>
+            <w:tcW w:w="2614" w:type="dxa"/>
+          </w:tcPr>
+          <w:p>
+            <w:pPr>
+              <w:jc w:val="center"/>
+              <w:rPr>
+                <w:lang w:val="en-US"/>
+              </w:rPr>
+            </w:pPr>
+            <w:r>
+              <w:rPr>
+                <w:lang w:val="en-US"/>
+              </w:rPr>
+              <w:t xml:space="preserve">Iterative  </w:t>
+            </w:r>
+          </w:p>
+        </w:tc>
+        <w:tc>
+          <w:tcPr>
+            <w:tcW w:w="2614" w:type="dxa"/>
+            <w:gridSpan w:val="2"/>
           </w:tcPr>
           <w:p>
             <w:pPr>
@@ -3714,7 +4293,7 @@
               <w:rPr>
                 <w:lang w:val="en-US"/>
               </w:rPr>
-              <w:t>Up-Front Iterations</w:t>
+              <w:t>Up-Front Iterations (Requests with Step-by-Step scenario of dialog)</w:t>
             </w:r>
           </w:p>
           <w:p>
@@ -3738,7 +4317,7 @@
         </w:tc>
         <w:tc>
           <w:tcPr>
-            <w:tcW w:w="7446" w:type="dxa"/>
+            <w:tcW w:w="7536" w:type="dxa"/>
           </w:tcPr>
           <w:p>
             <w:pPr>
@@ -3752,7 +4331,7 @@
                 <w:noProof/>
               </w:rPr>
               <w:drawing>
-                <wp:inline distT="0" distB="0" distL="0" distR="0" wp14:anchorId="6487F763" wp14:editId="4FDA1EBD">
+                <wp:inline distT="0" distB="0" distL="0" distR="0" wp14:anchorId="6D09AE21" wp14:editId="276A2173">
                   <wp:extent cx="3659026" cy="3075961"/>
                   <wp:effectExtent l="152400" t="114300" r="151130" b="143510"/>
                   <wp:docPr id="1467141750" name="Picture 1"/>
@@ -3843,80 +4422,127 @@
               <w:t>19:58</w:t>
             </w:r>
           </w:p>
-        </w:tc>
-        <w:tc>
-          <w:tcPr>
-            <w:tcW w:w="2614" w:type="dxa"/>
-          </w:tcPr>
-          <w:p>
-            <w:pPr>
-              <w:jc w:val="center"/>
-              <w:rPr>
-                <w:lang w:val="en-US"/>
-              </w:rPr>
-            </w:pPr>
-            <w:r>
-              <w:rPr>
-                <w:lang w:val="en-US"/>
-              </w:rPr>
-              <w:t>Chain-of-Thought</w:t>
-            </w:r>
-          </w:p>
-        </w:tc>
-        <w:tc>
-          <w:tcPr>
-            <w:tcW w:w="2614" w:type="dxa"/>
-          </w:tcPr>
-          <w:p>
-            <w:pPr>
-              <w:rPr>
-                <w:lang w:val="en-US"/>
-              </w:rPr>
-            </w:pPr>
-            <w:r>
-              <w:rPr>
-                <w:lang w:val="en-US"/>
-              </w:rPr>
-              <w:t>Chain of Thought Prompting is a way to ask better questions (and get better results) with Al.</w:t>
-            </w:r>
-          </w:p>
-          <w:p>
-            <w:pPr>
+          <w:p>
+            <w:pPr>
+              <w:jc w:val="center"/>
               <w:rPr>
                 <w:b/>
                 <w:bCs/>
                 <w:lang w:val="en-US"/>
               </w:rPr>
             </w:pPr>
+          </w:p>
+          <w:p>
+            <w:pPr>
+              <w:jc w:val="center"/>
+              <w:rPr>
+                <w:lang w:val="en-US"/>
+              </w:rPr>
+            </w:pPr>
             <w:r>
               <w:rPr>
                 <w:b/>
                 <w:bCs/>
                 <w:lang w:val="en-US"/>
               </w:rPr>
-              <w:t>I teach the AI how to</w:t>
-            </w:r>
-            <w:r>
+              <w:t>Record</w:t>
+            </w:r>
+            <w:r>
+              <w:rPr>
+                <w:lang w:val="en-US"/>
+              </w:rPr>
+              <w:t>:</w:t>
+            </w:r>
+          </w:p>
+          <w:p>
+            <w:pPr>
+              <w:jc w:val="center"/>
+              <w:rPr>
+                <w:lang w:val="en-US"/>
+              </w:rPr>
+            </w:pPr>
+            <w:r>
+              <w:rPr>
+                <w:lang w:val="en-US"/>
+              </w:rPr>
+              <w:t>02:26:15</w:t>
+            </w:r>
+          </w:p>
+        </w:tc>
+        <w:tc>
+          <w:tcPr>
+            <w:tcW w:w="2614" w:type="dxa"/>
+          </w:tcPr>
+          <w:p>
+            <w:pPr>
+              <w:jc w:val="center"/>
+              <w:rPr>
+                <w:lang w:val="en-US"/>
+              </w:rPr>
+            </w:pPr>
+            <w:r>
+              <w:rPr>
+                <w:lang w:val="en-US"/>
+              </w:rPr>
+              <w:t>Chain-of-Thought</w:t>
+            </w:r>
+          </w:p>
+        </w:tc>
+        <w:tc>
+          <w:tcPr>
+            <w:tcW w:w="2614" w:type="dxa"/>
+            <w:gridSpan w:val="2"/>
+          </w:tcPr>
+          <w:p>
+            <w:pPr>
+              <w:rPr>
+                <w:lang w:val="en-US"/>
+              </w:rPr>
+            </w:pPr>
+            <w:r>
+              <w:rPr>
+                <w:lang w:val="en-US"/>
+              </w:rPr>
+              <w:t>Chain of Thought Prompting is a way to ask better questions (and get better results) with Al.</w:t>
+            </w:r>
+          </w:p>
+          <w:p>
+            <w:pPr>
               <w:rPr>
                 <w:b/>
                 <w:bCs/>
                 <w:lang w:val="en-US"/>
               </w:rPr>
-              <w:t xml:space="preserve"> tel</w:t>
-            </w:r>
+            </w:pPr>
             <w:r>
               <w:rPr>
                 <w:b/>
                 <w:bCs/>
                 <w:lang w:val="en-US"/>
               </w:rPr>
+              <w:t>I teach the AI how to</w:t>
+            </w:r>
+            <w:r>
+              <w:rPr>
+                <w:b/>
+                <w:bCs/>
+                <w:lang w:val="en-US"/>
+              </w:rPr>
+              <w:t xml:space="preserve"> tel</w:t>
+            </w:r>
+            <w:r>
+              <w:rPr>
+                <w:b/>
+                <w:bCs/>
+                <w:lang w:val="en-US"/>
+              </w:rPr>
               <w:t>.</w:t>
             </w:r>
           </w:p>
         </w:tc>
         <w:tc>
           <w:tcPr>
-            <w:tcW w:w="7446" w:type="dxa"/>
+            <w:tcW w:w="7536" w:type="dxa"/>
           </w:tcPr>
           <w:p>
             <w:pPr>
@@ -3930,7 +4556,7 @@
                 <w:noProof/>
               </w:rPr>
               <w:drawing>
-                <wp:inline distT="0" distB="0" distL="0" distR="0" wp14:anchorId="50FA8331" wp14:editId="7937414F">
+                <wp:inline distT="0" distB="0" distL="0" distR="0" wp14:anchorId="2D91FD30" wp14:editId="54AAEE0E">
                   <wp:extent cx="3433414" cy="3401205"/>
                   <wp:effectExtent l="133350" t="114300" r="129540" b="161290"/>
                   <wp:docPr id="678013004" name="Picture 1"/>
@@ -4004,28 +4630,111 @@
         </w:trPr>
         <w:tc>
           <w:tcPr>
-            <w:tcW w:w="15288" w:type="dxa"/>
-            <w:gridSpan w:val="4"/>
-          </w:tcPr>
-          <w:p>
-            <w:pPr>
-              <w:jc w:val="center"/>
+            <w:tcW w:w="2614" w:type="dxa"/>
+          </w:tcPr>
+          <w:p>
+            <w:pPr>
+              <w:jc w:val="center"/>
+              <w:rPr>
+                <w:lang w:val="en-US"/>
+              </w:rPr>
+            </w:pPr>
+            <w:r>
               <w:rPr>
                 <w:b/>
                 <w:bCs/>
+                <w:lang w:val="en-US"/>
+              </w:rPr>
+              <w:t>Record</w:t>
+            </w:r>
+            <w:r>
+              <w:rPr>
+                <w:lang w:val="en-US"/>
+              </w:rPr>
+              <w:t>:</w:t>
+            </w:r>
+          </w:p>
+          <w:p>
+            <w:pPr>
+              <w:jc w:val="center"/>
+              <w:rPr>
+                <w:lang w:val="en-US"/>
+              </w:rPr>
+            </w:pPr>
+            <w:r>
+              <w:rPr>
+                <w:lang w:val="en-US"/>
+              </w:rPr>
+              <w:t>03:30:35</w:t>
+            </w:r>
+          </w:p>
+        </w:tc>
+        <w:tc>
+          <w:tcPr>
+            <w:tcW w:w="2614" w:type="dxa"/>
+          </w:tcPr>
+          <w:p>
+            <w:pPr>
+              <w:jc w:val="center"/>
+              <w:rPr>
+                <w:lang w:val="en-US"/>
+              </w:rPr>
+            </w:pPr>
+            <w:r>
+              <w:t>The Python Package Index </w:t>
+            </w:r>
+            <w:r>
+              <w:rPr>
+                <w:lang w:val="en-US"/>
+              </w:rPr>
+              <w:t>(</w:t>
+            </w:r>
+            <w:proofErr w:type="spellStart"/>
+            <w:r>
+              <w:rPr>
+                <w:lang w:val="en-US"/>
+              </w:rPr>
+              <w:t>PyPI</w:t>
+            </w:r>
+            <w:proofErr w:type="spellEnd"/>
+            <w:r>
+              <w:rPr>
+                <w:lang w:val="en-US"/>
+              </w:rPr>
+              <w:t>)</w:t>
+            </w:r>
+          </w:p>
+        </w:tc>
+        <w:tc>
+          <w:tcPr>
+            <w:tcW w:w="2614" w:type="dxa"/>
+            <w:gridSpan w:val="2"/>
+          </w:tcPr>
+          <w:p>
+            <w:pPr>
+              <w:rPr>
+                <w:lang w:val="en-US"/>
+              </w:rPr>
+            </w:pPr>
+            <w:r>
+              <w:rPr>
+                <w:lang w:val="en-US"/>
+              </w:rPr>
+              <w:t>Python library. For working with Python (NPM for PYTHON)</w:t>
+            </w:r>
+          </w:p>
+        </w:tc>
+        <w:tc>
+          <w:tcPr>
+            <w:tcW w:w="7536" w:type="dxa"/>
+          </w:tcPr>
+          <w:p>
+            <w:pPr>
+              <w:jc w:val="center"/>
+              <w:rPr>
                 <w:noProof/>
               </w:rPr>
             </w:pPr>
-            <w:r>
-              <w:rPr>
-                <w:b/>
-                <w:bCs/>
-                <w:noProof/>
-                <w:sz w:val="56"/>
-                <w:szCs w:val="56"/>
-              </w:rPr>
-              <w:t>20:05</w:t>
-            </w:r>
           </w:p>
         </w:tc>
       </w:tr>
@@ -4044,36 +4753,207 @@
                 <w:lang w:val="en-US"/>
               </w:rPr>
             </w:pPr>
-          </w:p>
-        </w:tc>
-        <w:tc>
-          <w:tcPr>
-            <w:tcW w:w="2614" w:type="dxa"/>
-          </w:tcPr>
-          <w:p>
-            <w:pPr>
-              <w:jc w:val="center"/>
-              <w:rPr>
-                <w:lang w:val="en-US"/>
-              </w:rPr>
-            </w:pPr>
-          </w:p>
-        </w:tc>
-        <w:tc>
-          <w:tcPr>
-            <w:tcW w:w="2614" w:type="dxa"/>
-          </w:tcPr>
-          <w:p>
-            <w:pPr>
-              <w:rPr>
-                <w:lang w:val="en-US"/>
-              </w:rPr>
-            </w:pPr>
-          </w:p>
-        </w:tc>
-        <w:tc>
-          <w:tcPr>
-            <w:tcW w:w="7446" w:type="dxa"/>
+            <w:r>
+              <w:rPr>
+                <w:b/>
+                <w:bCs/>
+                <w:lang w:val="en-US"/>
+              </w:rPr>
+              <w:t>Record</w:t>
+            </w:r>
+            <w:r>
+              <w:rPr>
+                <w:lang w:val="en-US"/>
+              </w:rPr>
+              <w:t>:</w:t>
+            </w:r>
+          </w:p>
+          <w:p>
+            <w:pPr>
+              <w:jc w:val="center"/>
+              <w:rPr>
+                <w:lang w:val="en-US"/>
+              </w:rPr>
+            </w:pPr>
+            <w:r>
+              <w:rPr>
+                <w:lang w:val="en-US"/>
+              </w:rPr>
+              <w:t>03:29:50</w:t>
+            </w:r>
+          </w:p>
+        </w:tc>
+        <w:tc>
+          <w:tcPr>
+            <w:tcW w:w="2614" w:type="dxa"/>
+          </w:tcPr>
+          <w:p>
+            <w:pPr>
+              <w:jc w:val="center"/>
+              <w:rPr>
+                <w:i/>
+                <w:iCs/>
+                <w:lang w:val="en-US"/>
+              </w:rPr>
+            </w:pPr>
+            <w:proofErr w:type="gramStart"/>
+            <w:r>
+              <w:rPr>
+                <w:i/>
+                <w:iCs/>
+                <w:lang w:val="en-US"/>
+              </w:rPr>
+              <w:t>pip</w:t>
+            </w:r>
+            <w:proofErr w:type="gramEnd"/>
+            <w:r>
+              <w:rPr>
+                <w:i/>
+                <w:iCs/>
+                <w:lang w:val="en-US"/>
+              </w:rPr>
+              <w:t xml:space="preserve"> install </w:t>
+            </w:r>
+            <w:proofErr w:type="spellStart"/>
+            <w:r>
+              <w:rPr>
+                <w:i/>
+                <w:iCs/>
+                <w:lang w:val="en-US"/>
+              </w:rPr>
+              <w:t>operin</w:t>
+            </w:r>
+            <w:proofErr w:type="spellEnd"/>
+          </w:p>
+        </w:tc>
+        <w:tc>
+          <w:tcPr>
+            <w:tcW w:w="2614" w:type="dxa"/>
+            <w:gridSpan w:val="2"/>
+          </w:tcPr>
+          <w:p>
+            <w:pPr>
+              <w:rPr>
+                <w:lang w:val="en-US"/>
+              </w:rPr>
+            </w:pPr>
+            <w:r>
+              <w:rPr>
+                <w:lang w:val="en-US"/>
+              </w:rPr>
+              <w:t>Package for python for working with AI</w:t>
+            </w:r>
+          </w:p>
+          <w:p>
+            <w:pPr>
+              <w:rPr>
+                <w:lang w:val="en-US"/>
+              </w:rPr>
+            </w:pPr>
+            <w:r>
+              <w:rPr>
+                <w:lang w:val="en-US"/>
+              </w:rPr>
+              <w:t xml:space="preserve">Installation: </w:t>
+            </w:r>
+          </w:p>
+          <w:p>
+            <w:pPr>
+              <w:rPr>
+                <w:i/>
+                <w:iCs/>
+                <w:lang w:val="en-US"/>
+              </w:rPr>
+            </w:pPr>
+            <w:r>
+              <w:rPr>
+                <w:i/>
+                <w:iCs/>
+                <w:lang w:val="en-US"/>
+              </w:rPr>
+              <w:t>"</w:t>
+            </w:r>
+            <w:proofErr w:type="gramStart"/>
+            <w:r>
+              <w:rPr>
+                <w:i/>
+                <w:iCs/>
+                <w:lang w:val="en-US"/>
+              </w:rPr>
+              <w:t>pip</w:t>
+            </w:r>
+            <w:proofErr w:type="gramEnd"/>
+            <w:r>
+              <w:rPr>
+                <w:i/>
+                <w:iCs/>
+                <w:lang w:val="en-US"/>
+              </w:rPr>
+              <w:t xml:space="preserve"> install </w:t>
+            </w:r>
+            <w:proofErr w:type="spellStart"/>
+            <w:r>
+              <w:rPr>
+                <w:i/>
+                <w:iCs/>
+                <w:lang w:val="en-US"/>
+              </w:rPr>
+              <w:t>openai</w:t>
+            </w:r>
+            <w:proofErr w:type="spellEnd"/>
+            <w:r>
+              <w:rPr>
+                <w:i/>
+                <w:iCs/>
+                <w:lang w:val="en-US"/>
+              </w:rPr>
+              <w:t>"</w:t>
+            </w:r>
+          </w:p>
+          <w:p>
+            <w:pPr>
+              <w:rPr>
+                <w:lang w:val="en-US"/>
+              </w:rPr>
+            </w:pPr>
+            <w:r>
+              <w:rPr>
+                <w:lang w:val="en-US"/>
+              </w:rPr>
+              <w:t>Into the package:</w:t>
+            </w:r>
+          </w:p>
+          <w:p>
+            <w:pPr>
+              <w:rPr>
+                <w:lang w:val="en-US"/>
+              </w:rPr>
+            </w:pPr>
+            <w:r>
+              <w:rPr>
+                <w:lang w:val="en-US"/>
+              </w:rPr>
+              <w:t xml:space="preserve">OpenAI – include </w:t>
+            </w:r>
+            <w:proofErr w:type="gramStart"/>
+            <w:r>
+              <w:rPr>
+                <w:lang w:val="en-US"/>
+              </w:rPr>
+              <w:t>the all</w:t>
+            </w:r>
+            <w:proofErr w:type="gramEnd"/>
+            <w:r>
+              <w:rPr>
+                <w:lang w:val="en-US"/>
+              </w:rPr>
+              <w:t xml:space="preserve"> functions for working with AI</w:t>
+            </w:r>
+          </w:p>
+        </w:tc>
+        <w:tc>
+          <w:tcPr>
+            <w:tcW w:w="7536" w:type="dxa"/>
           </w:tcPr>
           <w:p>
             <w:pPr>
@@ -4082,110 +4962,340 @@
                 <w:noProof/>
               </w:rPr>
             </w:pPr>
+            <w:r>
+              <w:rPr>
+                <w:noProof/>
+              </w:rPr>
+              <w:drawing>
+                <wp:inline distT="0" distB="0" distL="0" distR="0" wp14:anchorId="2D789911" wp14:editId="4312F2E7">
+                  <wp:extent cx="3206411" cy="579376"/>
+                  <wp:effectExtent l="133350" t="114300" r="127635" b="144780"/>
+                  <wp:docPr id="452802507" name="Picture 1"/>
+                  <wp:cNvGraphicFramePr>
+                    <a:graphicFrameLocks xmlns:a="http://schemas.openxmlformats.org/drawingml/2006/main" noChangeAspect="1"/>
+                  </wp:cNvGraphicFramePr>
+                  <a:graphic xmlns:a="http://schemas.openxmlformats.org/drawingml/2006/main">
+                    <a:graphicData uri="http://schemas.openxmlformats.org/drawingml/2006/picture">
+                      <pic:pic xmlns:pic="http://schemas.openxmlformats.org/drawingml/2006/picture">
+                        <pic:nvPicPr>
+                          <pic:cNvPr id="452802507" name=""/>
+                          <pic:cNvPicPr/>
+                        </pic:nvPicPr>
+                        <pic:blipFill>
+                          <a:blip r:embed="rId26"/>
+                          <a:stretch>
+                            <a:fillRect/>
+                          </a:stretch>
+                        </pic:blipFill>
+                        <pic:spPr>
+                          <a:xfrm>
+                            <a:off x="0" y="0"/>
+                            <a:ext cx="3217174" cy="581321"/>
+                          </a:xfrm>
+                          <a:prstGeom prst="rect">
+                            <a:avLst/>
+                          </a:prstGeom>
+                          <a:solidFill>
+                            <a:srgbClr val="FFFFFF">
+                              <a:shade val="85000"/>
+                            </a:srgbClr>
+                          </a:solidFill>
+                          <a:ln w="88900" cap="sq">
+                            <a:solidFill>
+                              <a:srgbClr val="FFFFFF"/>
+                            </a:solidFill>
+                            <a:miter lim="800000"/>
+                          </a:ln>
+                          <a:effectLst>
+                            <a:outerShdw blurRad="55000" dist="18000" dir="5400000" algn="tl" rotWithShape="0">
+                              <a:srgbClr val="000000">
+                                <a:alpha val="40000"/>
+                              </a:srgbClr>
+                            </a:outerShdw>
+                          </a:effectLst>
+                          <a:scene3d>
+                            <a:camera prst="orthographicFront"/>
+                            <a:lightRig rig="twoPt" dir="t">
+                              <a:rot lat="0" lon="0" rev="7200000"/>
+                            </a:lightRig>
+                          </a:scene3d>
+                          <a:sp3d>
+                            <a:bevelT w="25400" h="19050"/>
+                            <a:contourClr>
+                              <a:srgbClr val="FFFFFF"/>
+                            </a:contourClr>
+                          </a:sp3d>
+                        </pic:spPr>
+                      </pic:pic>
+                    </a:graphicData>
+                  </a:graphic>
+                </wp:inline>
+              </w:drawing>
+            </w:r>
           </w:p>
         </w:tc>
       </w:tr>
       <w:tr>
         <w:trPr>
-          <w:trHeight w:val="1557"/>
+          <w:trHeight w:val="520"/>
         </w:trPr>
         <w:tc>
           <w:tcPr>
             <w:tcW w:w="2614" w:type="dxa"/>
-          </w:tcPr>
-          <w:p>
-            <w:pPr>
-              <w:jc w:val="center"/>
-              <w:rPr>
-                <w:lang w:val="en-US"/>
-              </w:rPr>
-            </w:pPr>
-          </w:p>
-        </w:tc>
-        <w:tc>
-          <w:tcPr>
-            <w:tcW w:w="2614" w:type="dxa"/>
-          </w:tcPr>
-          <w:p>
-            <w:pPr>
-              <w:jc w:val="center"/>
-              <w:rPr>
-                <w:lang w:val="en-US"/>
-              </w:rPr>
-            </w:pPr>
-          </w:p>
-        </w:tc>
-        <w:tc>
-          <w:tcPr>
-            <w:tcW w:w="2614" w:type="dxa"/>
-          </w:tcPr>
-          <w:p>
-            <w:pPr>
-              <w:rPr>
-                <w:lang w:val="en-US"/>
-              </w:rPr>
-            </w:pPr>
-          </w:p>
-        </w:tc>
-        <w:tc>
-          <w:tcPr>
-            <w:tcW w:w="7446" w:type="dxa"/>
+            <w:vMerge w:val="restart"/>
+          </w:tcPr>
+          <w:p>
+            <w:pPr>
+              <w:jc w:val="center"/>
+              <w:rPr>
+                <w:lang w:val="en-US"/>
+              </w:rPr>
+            </w:pPr>
+            <w:r>
+              <w:rPr>
+                <w:b/>
+                <w:bCs/>
+                <w:lang w:val="en-US"/>
+              </w:rPr>
+              <w:lastRenderedPageBreak/>
+              <w:t>Record</w:t>
+            </w:r>
+            <w:r>
+              <w:rPr>
+                <w:lang w:val="en-US"/>
+              </w:rPr>
+              <w:t>:</w:t>
+            </w:r>
+          </w:p>
+          <w:p>
+            <w:pPr>
+              <w:jc w:val="center"/>
+              <w:rPr>
+                <w:lang w:val="en-US"/>
+              </w:rPr>
+            </w:pPr>
+            <w:r>
+              <w:rPr>
+                <w:lang w:val="en-US"/>
+              </w:rPr>
+              <w:t>03:33:20</w:t>
+            </w:r>
+          </w:p>
+        </w:tc>
+        <w:tc>
+          <w:tcPr>
+            <w:tcW w:w="2614" w:type="dxa"/>
+            <w:vMerge w:val="restart"/>
+          </w:tcPr>
+          <w:p>
+            <w:pPr>
+              <w:jc w:val="center"/>
+              <w:rPr>
+                <w:lang w:val="en-US"/>
+              </w:rPr>
+            </w:pPr>
+            <w:r>
+              <w:rPr>
+                <w:lang w:val="en-US"/>
+              </w:rPr>
+              <w:t>Roles</w:t>
+            </w:r>
+          </w:p>
+        </w:tc>
+        <w:tc>
+          <w:tcPr>
+            <w:tcW w:w="1307" w:type="dxa"/>
+          </w:tcPr>
+          <w:p>
+            <w:pPr>
+              <w:rPr>
+                <w:lang w:val="en-US"/>
+              </w:rPr>
+            </w:pPr>
+            <w:r>
+              <w:rPr>
+                <w:lang w:val="en-US"/>
+              </w:rPr>
+              <w:t>System</w:t>
+            </w:r>
+          </w:p>
+        </w:tc>
+        <w:tc>
+          <w:tcPr>
+            <w:tcW w:w="1307" w:type="dxa"/>
+          </w:tcPr>
+          <w:p>
+            <w:pPr>
+              <w:rPr>
+                <w:lang w:val="en-US"/>
+              </w:rPr>
+            </w:pPr>
+            <w:r>
+              <w:rPr>
+                <w:lang w:val="en-US"/>
+              </w:rPr>
+              <w:t>Using once on the start of program</w:t>
+            </w:r>
+          </w:p>
+        </w:tc>
+        <w:tc>
+          <w:tcPr>
+            <w:tcW w:w="7536" w:type="dxa"/>
           </w:tcPr>
           <w:p>
             <w:pPr>
               <w:jc w:val="center"/>
               <w:rPr>
                 <w:noProof/>
-              </w:rPr>
-            </w:pPr>
+                <w:lang w:val="en-US"/>
+              </w:rPr>
+            </w:pPr>
+            <w:r>
+              <w:rPr>
+                <w:noProof/>
+              </w:rPr>
+              <w:drawing>
+                <wp:inline distT="0" distB="0" distL="0" distR="0" wp14:anchorId="3C3077AD" wp14:editId="6F4AF794">
+                  <wp:extent cx="4386099" cy="565289"/>
+                  <wp:effectExtent l="133350" t="114300" r="128905" b="139700"/>
+                  <wp:docPr id="853190943" name="Picture 1"/>
+                  <wp:cNvGraphicFramePr>
+                    <a:graphicFrameLocks xmlns:a="http://schemas.openxmlformats.org/drawingml/2006/main" noChangeAspect="1"/>
+                  </wp:cNvGraphicFramePr>
+                  <a:graphic xmlns:a="http://schemas.openxmlformats.org/drawingml/2006/main">
+                    <a:graphicData uri="http://schemas.openxmlformats.org/drawingml/2006/picture">
+                      <pic:pic xmlns:pic="http://schemas.openxmlformats.org/drawingml/2006/picture">
+                        <pic:nvPicPr>
+                          <pic:cNvPr id="853190943" name=""/>
+                          <pic:cNvPicPr/>
+                        </pic:nvPicPr>
+                        <pic:blipFill>
+                          <a:blip r:embed="rId27"/>
+                          <a:stretch>
+                            <a:fillRect/>
+                          </a:stretch>
+                        </pic:blipFill>
+                        <pic:spPr>
+                          <a:xfrm>
+                            <a:off x="0" y="0"/>
+                            <a:ext cx="4497399" cy="579634"/>
+                          </a:xfrm>
+                          <a:prstGeom prst="rect">
+                            <a:avLst/>
+                          </a:prstGeom>
+                          <a:solidFill>
+                            <a:srgbClr val="FFFFFF">
+                              <a:shade val="85000"/>
+                            </a:srgbClr>
+                          </a:solidFill>
+                          <a:ln w="88900" cap="sq">
+                            <a:solidFill>
+                              <a:srgbClr val="FFFFFF"/>
+                            </a:solidFill>
+                            <a:miter lim="800000"/>
+                          </a:ln>
+                          <a:effectLst>
+                            <a:outerShdw blurRad="55000" dist="18000" dir="5400000" algn="tl" rotWithShape="0">
+                              <a:srgbClr val="000000">
+                                <a:alpha val="40000"/>
+                              </a:srgbClr>
+                            </a:outerShdw>
+                          </a:effectLst>
+                          <a:scene3d>
+                            <a:camera prst="orthographicFront"/>
+                            <a:lightRig rig="twoPt" dir="t">
+                              <a:rot lat="0" lon="0" rev="7200000"/>
+                            </a:lightRig>
+                          </a:scene3d>
+                          <a:sp3d>
+                            <a:bevelT w="25400" h="19050"/>
+                            <a:contourClr>
+                              <a:srgbClr val="FFFFFF"/>
+                            </a:contourClr>
+                          </a:sp3d>
+                        </pic:spPr>
+                      </pic:pic>
+                    </a:graphicData>
+                  </a:graphic>
+                </wp:inline>
+              </w:drawing>
+            </w:r>
           </w:p>
         </w:tc>
       </w:tr>
       <w:tr>
         <w:trPr>
-          <w:trHeight w:val="1557"/>
+          <w:trHeight w:val="520"/>
         </w:trPr>
         <w:tc>
           <w:tcPr>
             <w:tcW w:w="2614" w:type="dxa"/>
-          </w:tcPr>
-          <w:p>
-            <w:pPr>
-              <w:jc w:val="center"/>
-              <w:rPr>
-                <w:lang w:val="en-US"/>
-              </w:rPr>
-            </w:pPr>
-          </w:p>
-        </w:tc>
-        <w:tc>
-          <w:tcPr>
-            <w:tcW w:w="2614" w:type="dxa"/>
-          </w:tcPr>
-          <w:p>
-            <w:pPr>
-              <w:jc w:val="center"/>
-              <w:rPr>
-                <w:lang w:val="en-US"/>
-              </w:rPr>
-            </w:pPr>
-          </w:p>
-        </w:tc>
-        <w:tc>
-          <w:tcPr>
-            <w:tcW w:w="2614" w:type="dxa"/>
-          </w:tcPr>
-          <w:p>
-            <w:pPr>
-              <w:rPr>
-                <w:lang w:val="en-US"/>
-              </w:rPr>
-            </w:pPr>
-          </w:p>
-        </w:tc>
-        <w:tc>
-          <w:tcPr>
-            <w:tcW w:w="7446" w:type="dxa"/>
+            <w:vMerge/>
+          </w:tcPr>
+          <w:p>
+            <w:pPr>
+              <w:jc w:val="center"/>
+              <w:rPr>
+                <w:b/>
+                <w:bCs/>
+                <w:lang w:val="en-US"/>
+              </w:rPr>
+            </w:pPr>
+          </w:p>
+        </w:tc>
+        <w:tc>
+          <w:tcPr>
+            <w:tcW w:w="2614" w:type="dxa"/>
+            <w:vMerge/>
+          </w:tcPr>
+          <w:p>
+            <w:pPr>
+              <w:jc w:val="center"/>
+              <w:rPr>
+                <w:lang w:val="en-US"/>
+              </w:rPr>
+            </w:pPr>
+          </w:p>
+        </w:tc>
+        <w:tc>
+          <w:tcPr>
+            <w:tcW w:w="1307" w:type="dxa"/>
+          </w:tcPr>
+          <w:p>
+            <w:pPr>
+              <w:rPr>
+                <w:lang w:val="en-US"/>
+              </w:rPr>
+            </w:pPr>
+            <w:r>
+              <w:rPr>
+                <w:lang w:val="en-US"/>
+              </w:rPr>
+              <w:t>User</w:t>
+            </w:r>
+          </w:p>
+        </w:tc>
+        <w:tc>
+          <w:tcPr>
+            <w:tcW w:w="1307" w:type="dxa"/>
+          </w:tcPr>
+          <w:p>
+            <w:pPr>
+              <w:rPr>
+                <w:lang w:val="en-US"/>
+              </w:rPr>
+            </w:pPr>
+            <w:r>
+              <w:rPr>
+                <w:lang w:val="en-US"/>
+              </w:rPr>
+              <w:t>User's input</w:t>
+            </w:r>
+          </w:p>
+        </w:tc>
+        <w:tc>
+          <w:tcPr>
+            <w:tcW w:w="7536" w:type="dxa"/>
           </w:tcPr>
           <w:p>
             <w:pPr>
@@ -4199,49 +5309,671 @@
       </w:tr>
       <w:tr>
         <w:trPr>
-          <w:trHeight w:val="1557"/>
+          <w:trHeight w:val="520"/>
         </w:trPr>
         <w:tc>
           <w:tcPr>
             <w:tcW w:w="2614" w:type="dxa"/>
-          </w:tcPr>
-          <w:p>
-            <w:pPr>
-              <w:jc w:val="center"/>
-              <w:rPr>
-                <w:lang w:val="en-US"/>
-              </w:rPr>
-            </w:pPr>
-          </w:p>
-        </w:tc>
-        <w:tc>
-          <w:tcPr>
-            <w:tcW w:w="2614" w:type="dxa"/>
-          </w:tcPr>
-          <w:p>
-            <w:pPr>
-              <w:jc w:val="center"/>
-              <w:rPr>
-                <w:lang w:val="en-US"/>
-              </w:rPr>
-            </w:pPr>
-          </w:p>
-        </w:tc>
-        <w:tc>
-          <w:tcPr>
-            <w:tcW w:w="2614" w:type="dxa"/>
-          </w:tcPr>
-          <w:p>
-            <w:pPr>
-              <w:rPr>
-                <w:lang w:val="en-US"/>
-              </w:rPr>
-            </w:pPr>
-          </w:p>
-        </w:tc>
-        <w:tc>
-          <w:tcPr>
-            <w:tcW w:w="7446" w:type="dxa"/>
+            <w:vMerge/>
+          </w:tcPr>
+          <w:p>
+            <w:pPr>
+              <w:jc w:val="center"/>
+              <w:rPr>
+                <w:b/>
+                <w:bCs/>
+                <w:lang w:val="en-US"/>
+              </w:rPr>
+            </w:pPr>
+          </w:p>
+        </w:tc>
+        <w:tc>
+          <w:tcPr>
+            <w:tcW w:w="2614" w:type="dxa"/>
+            <w:vMerge/>
+          </w:tcPr>
+          <w:p>
+            <w:pPr>
+              <w:jc w:val="center"/>
+              <w:rPr>
+                <w:lang w:val="en-US"/>
+              </w:rPr>
+            </w:pPr>
+          </w:p>
+        </w:tc>
+        <w:tc>
+          <w:tcPr>
+            <w:tcW w:w="1307" w:type="dxa"/>
+          </w:tcPr>
+          <w:p>
+            <w:pPr>
+              <w:rPr>
+                <w:lang w:val="en-US"/>
+              </w:rPr>
+            </w:pPr>
+            <w:r>
+              <w:rPr>
+                <w:lang w:val="en-US"/>
+              </w:rPr>
+              <w:t>Assistant</w:t>
+            </w:r>
+          </w:p>
+        </w:tc>
+        <w:tc>
+          <w:tcPr>
+            <w:tcW w:w="1307" w:type="dxa"/>
+          </w:tcPr>
+          <w:p>
+            <w:pPr>
+              <w:rPr>
+                <w:lang w:val="en-US"/>
+              </w:rPr>
+            </w:pPr>
+            <w:r>
+              <w:rPr>
+                <w:lang w:val="en-US"/>
+              </w:rPr>
+              <w:t>AI</w:t>
+            </w:r>
+            <w:r>
+              <w:rPr>
+                <w:lang w:val="en-US"/>
+              </w:rPr>
+              <w:t>'s</w:t>
+            </w:r>
+            <w:r>
+              <w:rPr>
+                <w:lang w:val="en-US"/>
+              </w:rPr>
+              <w:t xml:space="preserve"> output</w:t>
+            </w:r>
+          </w:p>
+        </w:tc>
+        <w:tc>
+          <w:tcPr>
+            <w:tcW w:w="7536" w:type="dxa"/>
+          </w:tcPr>
+          <w:p>
+            <w:pPr>
+              <w:jc w:val="center"/>
+              <w:rPr>
+                <w:noProof/>
+              </w:rPr>
+            </w:pPr>
+          </w:p>
+        </w:tc>
+      </w:tr>
+      <w:tr>
+        <w:trPr>
+          <w:trHeight w:val="780"/>
+        </w:trPr>
+        <w:tc>
+          <w:tcPr>
+            <w:tcW w:w="2614" w:type="dxa"/>
+            <w:vMerge w:val="restart"/>
+          </w:tcPr>
+          <w:p>
+            <w:pPr>
+              <w:jc w:val="center"/>
+              <w:rPr>
+                <w:lang w:val="en-US"/>
+              </w:rPr>
+            </w:pPr>
+            <w:r>
+              <w:rPr>
+                <w:b/>
+                <w:bCs/>
+                <w:lang w:val="en-US"/>
+              </w:rPr>
+              <w:t>Record</w:t>
+            </w:r>
+            <w:r>
+              <w:rPr>
+                <w:lang w:val="en-US"/>
+              </w:rPr>
+              <w:t>:</w:t>
+            </w:r>
+          </w:p>
+          <w:p>
+            <w:pPr>
+              <w:jc w:val="center"/>
+              <w:rPr>
+                <w:lang w:val="en-US"/>
+              </w:rPr>
+            </w:pPr>
+            <w:r>
+              <w:rPr>
+                <w:lang w:val="en-US"/>
+              </w:rPr>
+              <w:t>03:41:20</w:t>
+            </w:r>
+          </w:p>
+        </w:tc>
+        <w:tc>
+          <w:tcPr>
+            <w:tcW w:w="2614" w:type="dxa"/>
+            <w:vMerge w:val="restart"/>
+          </w:tcPr>
+          <w:p>
+            <w:pPr>
+              <w:jc w:val="center"/>
+              <w:rPr>
+                <w:lang w:val="en-US"/>
+              </w:rPr>
+            </w:pPr>
+            <w:r>
+              <w:rPr>
+                <w:lang w:val="en-US"/>
+              </w:rPr>
+              <w:t>Request</w:t>
+            </w:r>
+          </w:p>
+          <w:p>
+            <w:pPr>
+              <w:jc w:val="center"/>
+              <w:rPr>
+                <w:lang w:val="en-US"/>
+              </w:rPr>
+            </w:pPr>
+            <w:r>
+              <w:rPr>
+                <w:lang w:val="en-US"/>
+              </w:rPr>
+              <w:t xml:space="preserve"> And</w:t>
+            </w:r>
+          </w:p>
+          <w:p>
+            <w:pPr>
+              <w:jc w:val="center"/>
+              <w:rPr>
+                <w:lang w:val="en-US"/>
+              </w:rPr>
+            </w:pPr>
+            <w:r>
+              <w:rPr>
+                <w:lang w:val="en-US"/>
+              </w:rPr>
+              <w:t>Response</w:t>
+            </w:r>
+          </w:p>
+        </w:tc>
+        <w:tc>
+          <w:tcPr>
+            <w:tcW w:w="2614" w:type="dxa"/>
+            <w:gridSpan w:val="2"/>
+            <w:vAlign w:val="center"/>
+          </w:tcPr>
+          <w:p>
+            <w:pPr>
+              <w:jc w:val="center"/>
+              <w:rPr>
+                <w:lang w:val="en-US"/>
+              </w:rPr>
+            </w:pPr>
+            <w:r>
+              <w:rPr>
+                <w:lang w:val="en-US"/>
+              </w:rPr>
+              <w:t>Request</w:t>
+            </w:r>
+          </w:p>
+        </w:tc>
+        <w:tc>
+          <w:tcPr>
+            <w:tcW w:w="7536" w:type="dxa"/>
+          </w:tcPr>
+          <w:p>
+            <w:pPr>
+              <w:jc w:val="center"/>
+              <w:rPr>
+                <w:noProof/>
+              </w:rPr>
+            </w:pPr>
+            <w:r>
+              <w:rPr>
+                <w:noProof/>
+              </w:rPr>
+              <w:drawing>
+                <wp:inline distT="0" distB="0" distL="0" distR="0" wp14:anchorId="45E7F6D7" wp14:editId="5845675F">
+                  <wp:extent cx="3607689" cy="1690345"/>
+                  <wp:effectExtent l="152400" t="114300" r="145415" b="158115"/>
+                  <wp:docPr id="1445391605" name="Picture 1"/>
+                  <wp:cNvGraphicFramePr>
+                    <a:graphicFrameLocks xmlns:a="http://schemas.openxmlformats.org/drawingml/2006/main" noChangeAspect="1"/>
+                  </wp:cNvGraphicFramePr>
+                  <a:graphic xmlns:a="http://schemas.openxmlformats.org/drawingml/2006/main">
+                    <a:graphicData uri="http://schemas.openxmlformats.org/drawingml/2006/picture">
+                      <pic:pic xmlns:pic="http://schemas.openxmlformats.org/drawingml/2006/picture">
+                        <pic:nvPicPr>
+                          <pic:cNvPr id="1445391605" name=""/>
+                          <pic:cNvPicPr/>
+                        </pic:nvPicPr>
+                        <pic:blipFill>
+                          <a:blip r:embed="rId28"/>
+                          <a:stretch>
+                            <a:fillRect/>
+                          </a:stretch>
+                        </pic:blipFill>
+                        <pic:spPr>
+                          <a:xfrm>
+                            <a:off x="0" y="0"/>
+                            <a:ext cx="3633517" cy="1702446"/>
+                          </a:xfrm>
+                          <a:prstGeom prst="rect">
+                            <a:avLst/>
+                          </a:prstGeom>
+                          <a:solidFill>
+                            <a:srgbClr val="FFFFFF">
+                              <a:shade val="85000"/>
+                            </a:srgbClr>
+                          </a:solidFill>
+                          <a:ln w="88900" cap="sq">
+                            <a:solidFill>
+                              <a:srgbClr val="FFFFFF"/>
+                            </a:solidFill>
+                            <a:miter lim="800000"/>
+                          </a:ln>
+                          <a:effectLst>
+                            <a:outerShdw blurRad="55000" dist="18000" dir="5400000" algn="tl" rotWithShape="0">
+                              <a:srgbClr val="000000">
+                                <a:alpha val="40000"/>
+                              </a:srgbClr>
+                            </a:outerShdw>
+                          </a:effectLst>
+                          <a:scene3d>
+                            <a:camera prst="orthographicFront"/>
+                            <a:lightRig rig="twoPt" dir="t">
+                              <a:rot lat="0" lon="0" rev="7200000"/>
+                            </a:lightRig>
+                          </a:scene3d>
+                          <a:sp3d>
+                            <a:bevelT w="25400" h="19050"/>
+                            <a:contourClr>
+                              <a:srgbClr val="FFFFFF"/>
+                            </a:contourClr>
+                          </a:sp3d>
+                        </pic:spPr>
+                      </pic:pic>
+                    </a:graphicData>
+                  </a:graphic>
+                </wp:inline>
+              </w:drawing>
+            </w:r>
+          </w:p>
+        </w:tc>
+      </w:tr>
+      <w:tr>
+        <w:trPr>
+          <w:trHeight w:val="780"/>
+        </w:trPr>
+        <w:tc>
+          <w:tcPr>
+            <w:tcW w:w="2614" w:type="dxa"/>
+            <w:vMerge/>
+          </w:tcPr>
+          <w:p>
+            <w:pPr>
+              <w:jc w:val="center"/>
+              <w:rPr>
+                <w:b/>
+                <w:bCs/>
+                <w:lang w:val="en-US"/>
+              </w:rPr>
+            </w:pPr>
+          </w:p>
+        </w:tc>
+        <w:tc>
+          <w:tcPr>
+            <w:tcW w:w="2614" w:type="dxa"/>
+            <w:vMerge/>
+          </w:tcPr>
+          <w:p>
+            <w:pPr>
+              <w:jc w:val="center"/>
+              <w:rPr>
+                <w:lang w:val="en-US"/>
+              </w:rPr>
+            </w:pPr>
+          </w:p>
+        </w:tc>
+        <w:tc>
+          <w:tcPr>
+            <w:tcW w:w="2614" w:type="dxa"/>
+            <w:gridSpan w:val="2"/>
+            <w:vAlign w:val="center"/>
+          </w:tcPr>
+          <w:p>
+            <w:pPr>
+              <w:jc w:val="center"/>
+              <w:rPr>
+                <w:lang w:val="en-US"/>
+              </w:rPr>
+            </w:pPr>
+            <w:r>
+              <w:rPr>
+                <w:lang w:val="en-US"/>
+              </w:rPr>
+              <w:t>Response</w:t>
+            </w:r>
+          </w:p>
+        </w:tc>
+        <w:tc>
+          <w:tcPr>
+            <w:tcW w:w="7536" w:type="dxa"/>
+          </w:tcPr>
+          <w:p>
+            <w:pPr>
+              <w:jc w:val="center"/>
+              <w:rPr>
+                <w:noProof/>
+              </w:rPr>
+            </w:pPr>
+            <w:r>
+              <w:rPr>
+                <w:noProof/>
+              </w:rPr>
+              <w:drawing>
+                <wp:inline distT="0" distB="0" distL="0" distR="0" wp14:anchorId="7A76AA41" wp14:editId="1D13A1A8">
+                  <wp:extent cx="4036726" cy="2735733"/>
+                  <wp:effectExtent l="152400" t="114300" r="154305" b="160020"/>
+                  <wp:docPr id="1901302137" name="Picture 1"/>
+                  <wp:cNvGraphicFramePr>
+                    <a:graphicFrameLocks xmlns:a="http://schemas.openxmlformats.org/drawingml/2006/main" noChangeAspect="1"/>
+                  </wp:cNvGraphicFramePr>
+                  <a:graphic xmlns:a="http://schemas.openxmlformats.org/drawingml/2006/main">
+                    <a:graphicData uri="http://schemas.openxmlformats.org/drawingml/2006/picture">
+                      <pic:pic xmlns:pic="http://schemas.openxmlformats.org/drawingml/2006/picture">
+                        <pic:nvPicPr>
+                          <pic:cNvPr id="1901302137" name=""/>
+                          <pic:cNvPicPr/>
+                        </pic:nvPicPr>
+                        <pic:blipFill>
+                          <a:blip r:embed="rId29"/>
+                          <a:stretch>
+                            <a:fillRect/>
+                          </a:stretch>
+                        </pic:blipFill>
+                        <pic:spPr>
+                          <a:xfrm>
+                            <a:off x="0" y="0"/>
+                            <a:ext cx="4046571" cy="2742405"/>
+                          </a:xfrm>
+                          <a:prstGeom prst="rect">
+                            <a:avLst/>
+                          </a:prstGeom>
+                          <a:solidFill>
+                            <a:srgbClr val="FFFFFF">
+                              <a:shade val="85000"/>
+                            </a:srgbClr>
+                          </a:solidFill>
+                          <a:ln w="88900" cap="sq">
+                            <a:solidFill>
+                              <a:srgbClr val="FFFFFF"/>
+                            </a:solidFill>
+                            <a:miter lim="800000"/>
+                          </a:ln>
+                          <a:effectLst>
+                            <a:outerShdw blurRad="55000" dist="18000" dir="5400000" algn="tl" rotWithShape="0">
+                              <a:srgbClr val="000000">
+                                <a:alpha val="40000"/>
+                              </a:srgbClr>
+                            </a:outerShdw>
+                          </a:effectLst>
+                          <a:scene3d>
+                            <a:camera prst="orthographicFront"/>
+                            <a:lightRig rig="twoPt" dir="t">
+                              <a:rot lat="0" lon="0" rev="7200000"/>
+                            </a:lightRig>
+                          </a:scene3d>
+                          <a:sp3d>
+                            <a:bevelT w="25400" h="19050"/>
+                            <a:contourClr>
+                              <a:srgbClr val="FFFFFF"/>
+                            </a:contourClr>
+                          </a:sp3d>
+                        </pic:spPr>
+                      </pic:pic>
+                    </a:graphicData>
+                  </a:graphic>
+                </wp:inline>
+              </w:drawing>
+            </w:r>
+          </w:p>
+        </w:tc>
+      </w:tr>
+      <w:tr>
+        <w:trPr>
+          <w:trHeight w:val="780"/>
+        </w:trPr>
+        <w:tc>
+          <w:tcPr>
+            <w:tcW w:w="2614" w:type="dxa"/>
+          </w:tcPr>
+          <w:p>
+            <w:pPr>
+              <w:jc w:val="center"/>
+              <w:rPr>
+                <w:b/>
+                <w:bCs/>
+                <w:lang w:val="en-US"/>
+              </w:rPr>
+            </w:pPr>
+          </w:p>
+        </w:tc>
+        <w:tc>
+          <w:tcPr>
+            <w:tcW w:w="2614" w:type="dxa"/>
+          </w:tcPr>
+          <w:p>
+            <w:pPr>
+              <w:jc w:val="center"/>
+              <w:rPr>
+                <w:lang w:val="en-US"/>
+              </w:rPr>
+            </w:pPr>
+          </w:p>
+        </w:tc>
+        <w:tc>
+          <w:tcPr>
+            <w:tcW w:w="2614" w:type="dxa"/>
+            <w:gridSpan w:val="2"/>
+            <w:vAlign w:val="center"/>
+          </w:tcPr>
+          <w:p>
+            <w:pPr>
+              <w:jc w:val="center"/>
+              <w:rPr>
+                <w:lang w:val="en-US"/>
+              </w:rPr>
+            </w:pPr>
+          </w:p>
+        </w:tc>
+        <w:tc>
+          <w:tcPr>
+            <w:tcW w:w="7536" w:type="dxa"/>
+          </w:tcPr>
+          <w:p>
+            <w:pPr>
+              <w:jc w:val="center"/>
+              <w:rPr>
+                <w:noProof/>
+              </w:rPr>
+            </w:pPr>
+          </w:p>
+        </w:tc>
+      </w:tr>
+      <w:tr>
+        <w:trPr>
+          <w:trHeight w:val="780"/>
+        </w:trPr>
+        <w:tc>
+          <w:tcPr>
+            <w:tcW w:w="2614" w:type="dxa"/>
+          </w:tcPr>
+          <w:p>
+            <w:pPr>
+              <w:jc w:val="center"/>
+              <w:rPr>
+                <w:b/>
+                <w:bCs/>
+                <w:lang w:val="en-US"/>
+              </w:rPr>
+            </w:pPr>
+          </w:p>
+        </w:tc>
+        <w:tc>
+          <w:tcPr>
+            <w:tcW w:w="2614" w:type="dxa"/>
+          </w:tcPr>
+          <w:p>
+            <w:pPr>
+              <w:jc w:val="center"/>
+              <w:rPr>
+                <w:lang w:val="en-US"/>
+              </w:rPr>
+            </w:pPr>
+          </w:p>
+        </w:tc>
+        <w:tc>
+          <w:tcPr>
+            <w:tcW w:w="2614" w:type="dxa"/>
+            <w:gridSpan w:val="2"/>
+            <w:vAlign w:val="center"/>
+          </w:tcPr>
+          <w:p>
+            <w:pPr>
+              <w:jc w:val="center"/>
+              <w:rPr>
+                <w:lang w:val="en-US"/>
+              </w:rPr>
+            </w:pPr>
+          </w:p>
+        </w:tc>
+        <w:tc>
+          <w:tcPr>
+            <w:tcW w:w="7536" w:type="dxa"/>
+          </w:tcPr>
+          <w:p>
+            <w:pPr>
+              <w:jc w:val="center"/>
+              <w:rPr>
+                <w:noProof/>
+              </w:rPr>
+            </w:pPr>
+          </w:p>
+        </w:tc>
+      </w:tr>
+      <w:tr>
+        <w:trPr>
+          <w:trHeight w:val="780"/>
+        </w:trPr>
+        <w:tc>
+          <w:tcPr>
+            <w:tcW w:w="2614" w:type="dxa"/>
+          </w:tcPr>
+          <w:p>
+            <w:pPr>
+              <w:jc w:val="center"/>
+              <w:rPr>
+                <w:b/>
+                <w:bCs/>
+                <w:lang w:val="en-US"/>
+              </w:rPr>
+            </w:pPr>
+          </w:p>
+        </w:tc>
+        <w:tc>
+          <w:tcPr>
+            <w:tcW w:w="2614" w:type="dxa"/>
+          </w:tcPr>
+          <w:p>
+            <w:pPr>
+              <w:jc w:val="center"/>
+              <w:rPr>
+                <w:lang w:val="en-US"/>
+              </w:rPr>
+            </w:pPr>
+          </w:p>
+        </w:tc>
+        <w:tc>
+          <w:tcPr>
+            <w:tcW w:w="2614" w:type="dxa"/>
+            <w:gridSpan w:val="2"/>
+            <w:vAlign w:val="center"/>
+          </w:tcPr>
+          <w:p>
+            <w:pPr>
+              <w:jc w:val="center"/>
+              <w:rPr>
+                <w:lang w:val="en-US"/>
+              </w:rPr>
+            </w:pPr>
+          </w:p>
+        </w:tc>
+        <w:tc>
+          <w:tcPr>
+            <w:tcW w:w="7536" w:type="dxa"/>
+          </w:tcPr>
+          <w:p>
+            <w:pPr>
+              <w:jc w:val="center"/>
+              <w:rPr>
+                <w:noProof/>
+              </w:rPr>
+            </w:pPr>
+          </w:p>
+        </w:tc>
+      </w:tr>
+      <w:tr>
+        <w:trPr>
+          <w:trHeight w:val="780"/>
+        </w:trPr>
+        <w:tc>
+          <w:tcPr>
+            <w:tcW w:w="2614" w:type="dxa"/>
+          </w:tcPr>
+          <w:p>
+            <w:pPr>
+              <w:jc w:val="center"/>
+              <w:rPr>
+                <w:b/>
+                <w:bCs/>
+                <w:lang w:val="en-US"/>
+              </w:rPr>
+            </w:pPr>
+          </w:p>
+        </w:tc>
+        <w:tc>
+          <w:tcPr>
+            <w:tcW w:w="2614" w:type="dxa"/>
+          </w:tcPr>
+          <w:p>
+            <w:pPr>
+              <w:jc w:val="center"/>
+              <w:rPr>
+                <w:lang w:val="en-US"/>
+              </w:rPr>
+            </w:pPr>
+          </w:p>
+        </w:tc>
+        <w:tc>
+          <w:tcPr>
+            <w:tcW w:w="2614" w:type="dxa"/>
+            <w:gridSpan w:val="2"/>
+            <w:vAlign w:val="center"/>
+          </w:tcPr>
+          <w:p>
+            <w:pPr>
+              <w:jc w:val="center"/>
+              <w:rPr>
+                <w:lang w:val="en-US"/>
+              </w:rPr>
+            </w:pPr>
+          </w:p>
+        </w:tc>
+        <w:tc>
+          <w:tcPr>
+            <w:tcW w:w="7536" w:type="dxa"/>
           </w:tcPr>
           <w:p>
             <w:pPr>
@@ -4281,6 +6013,7 @@
         </w:rPr>
       </w:pPr>
     </w:p>
+    <w:p/>
     <w:sectPr>
       <w:pgSz w:w="16838" w:h="11906" w:orient="landscape"/>
       <w:pgMar w:top="720" w:right="720" w:bottom="720" w:left="720" w:header="708" w:footer="708" w:gutter="0"/>
@@ -4420,7 +6153,7 @@
         <w:kern w:val="2"/>
         <w:sz w:val="22"/>
         <w:szCs w:val="22"/>
-        <w:lang w:val="en-IL" w:eastAsia="en-US" w:bidi="he-IL"/>
+        <w:lang w:eastAsia="en-US" w:bidi="he-IL"/>
         <w14:ligatures w14:val="standardContextual"/>
       </w:rPr>
     </w:rPrDefault>
@@ -5015,6 +6748,7 @@
   <w:style w:type="character" w:default="1" w:styleId="DefaultParagraphFont">
     <w:name w:val="Default Paragraph Font"/>
     <w:uiPriority w:val="1"/>
+    <w:semiHidden/>
     <w:unhideWhenUsed/>
   </w:style>
   <w:style w:type="table" w:default="1" w:styleId="TableNormal">

</xml_diff>

<commit_message>
Adding Further explanations. Adding new files with prompts
</commit_message>
<xml_diff>
--- a/AI descriptions.docx
+++ b/AI descriptions.docx
@@ -3,15 +3,7 @@
 <w:document xmlns:wpc="http://schemas.microsoft.com/office/word/2010/wordprocessingCanvas" xmlns:cx="http://schemas.microsoft.com/office/drawing/2014/chartex" xmlns:cx1="http://schemas.microsoft.com/office/drawing/2015/9/8/chartex" xmlns:cx2="http://schemas.microsoft.com/office/drawing/2015/10/21/chartex" xmlns:cx3="http://schemas.microsoft.com/office/drawing/2016/5/9/chartex" xmlns:cx4="http://schemas.microsoft.com/office/drawing/2016/5/10/chartex" xmlns:cx5="http://schemas.microsoft.com/office/drawing/2016/5/11/chartex" xmlns:cx6="http://schemas.microsoft.com/office/drawing/2016/5/12/chartex" xmlns:cx7="http://schemas.microsoft.com/office/drawing/2016/5/13/chartex" xmlns:cx8="http://schemas.microsoft.com/office/drawing/2016/5/14/chartex" xmlns:mc="http://schemas.openxmlformats.org/markup-compatibility/2006" xmlns:aink="http://schemas.microsoft.com/office/drawing/2016/ink" xmlns:am3d="http://schemas.microsoft.com/office/drawing/2017/model3d" xmlns:o="urn:schemas-microsoft-com:office:office" xmlns:oel="http://schemas.microsoft.com/office/2019/extlst" xmlns:r="http://schemas.openxmlformats.org/officeDocument/2006/relationships" xmlns:m="http://schemas.openxmlformats.org/officeDocument/2006/math" xmlns:v="urn:schemas-microsoft-com:vml" xmlns:wp14="http://schemas.microsoft.com/office/word/2010/wordprocessingDrawing" xmlns:wp="http://schemas.openxmlformats.org/drawingml/2006/wordprocessingDrawing" xmlns:w10="urn:schemas-microsoft-com:office:word" xmlns:w="http://schemas.openxmlformats.org/wordprocessingml/2006/main" xmlns:w14="http://schemas.microsoft.com/office/word/2010/wordml" xmlns:w15="http://schemas.microsoft.com/office/word/2012/wordml" xmlns:w16cex="http://schemas.microsoft.com/office/word/2018/wordml/cex" xmlns:w16cid="http://schemas.microsoft.com/office/word/2016/wordml/cid" xmlns:w16="http://schemas.microsoft.com/office/word/2018/wordml" xmlns:w16du="http://schemas.microsoft.com/office/word/2023/wordml/word16du" xmlns:w16sdtdh="http://schemas.microsoft.com/office/word/2020/wordml/sdtdatahash" xmlns:w16sdtfl="http://schemas.microsoft.com/office/word/2024/wordml/sdtformatlock" xmlns:w16se="http://schemas.microsoft.com/office/word/2015/wordml/symex" xmlns:wpg="http://schemas.microsoft.com/office/word/2010/wordprocessingGroup" xmlns:wpi="http://schemas.microsoft.com/office/word/2010/wordprocessingInk" xmlns:wne="http://schemas.microsoft.com/office/word/2006/wordml" xmlns:wps="http://schemas.microsoft.com/office/word/2010/wordprocessingShape" mc:Ignorable="w14 w15 w16se w16cid w16 w16cex w16sdtdh w16sdtfl w16du wp14">
   <w:body>
     <w:p>
-      <w:pPr>
-        <w:rPr>
-          <w:lang w:val="en-US"/>
-        </w:rPr>
-      </w:pPr>
       <w:r>
-        <w:rPr>
-          <w:lang w:val="en-US"/>
-        </w:rPr>
         <w:t>Lesson 01</w:t>
       </w:r>
     </w:p>
@@ -36,14 +28,8 @@
           <w:p>
             <w:pPr>
               <w:jc w:val="center"/>
-              <w:rPr>
-                <w:lang w:val="en-US"/>
-              </w:rPr>
-            </w:pPr>
-            <w:r>
-              <w:rPr>
-                <w:lang w:val="en-US"/>
-              </w:rPr>
+            </w:pPr>
+            <w:r>
               <w:t>Time</w:t>
             </w:r>
           </w:p>
@@ -55,14 +41,8 @@
           <w:p>
             <w:pPr>
               <w:jc w:val="center"/>
-              <w:rPr>
-                <w:lang w:val="en-US"/>
-              </w:rPr>
-            </w:pPr>
-            <w:r>
-              <w:rPr>
-                <w:lang w:val="en-US"/>
-              </w:rPr>
+            </w:pPr>
+            <w:r>
               <w:t>Concept</w:t>
             </w:r>
           </w:p>
@@ -75,14 +55,8 @@
           <w:p>
             <w:pPr>
               <w:jc w:val="center"/>
-              <w:rPr>
-                <w:lang w:val="en-US"/>
-              </w:rPr>
-            </w:pPr>
-            <w:r>
-              <w:rPr>
-                <w:lang w:val="en-US"/>
-              </w:rPr>
+            </w:pPr>
+            <w:r>
               <w:t>Description</w:t>
             </w:r>
           </w:p>
@@ -94,14 +68,8 @@
           <w:p>
             <w:pPr>
               <w:jc w:val="center"/>
-              <w:rPr>
-                <w:lang w:val="en-US"/>
-              </w:rPr>
-            </w:pPr>
-            <w:r>
-              <w:rPr>
-                <w:lang w:val="en-US"/>
-              </w:rPr>
+            </w:pPr>
+            <w:r>
               <w:t>Examples</w:t>
             </w:r>
           </w:p>
@@ -115,28 +83,16 @@
           <w:p>
             <w:pPr>
               <w:jc w:val="center"/>
-              <w:rPr>
-                <w:lang w:val="en-US"/>
-              </w:rPr>
-            </w:pPr>
-            <w:r>
-              <w:rPr>
-                <w:lang w:val="en-US"/>
-              </w:rPr>
+            </w:pPr>
+            <w:r>
               <w:t>L01</w:t>
             </w:r>
           </w:p>
           <w:p>
             <w:pPr>
               <w:jc w:val="center"/>
-              <w:rPr>
-                <w:lang w:val="en-US"/>
-              </w:rPr>
-            </w:pPr>
-            <w:r>
-              <w:rPr>
-                <w:lang w:val="en-US"/>
-              </w:rPr>
+            </w:pPr>
+            <w:r>
               <w:t>17:45</w:t>
             </w:r>
           </w:p>
@@ -148,14 +104,8 @@
           <w:p>
             <w:pPr>
               <w:jc w:val="center"/>
-              <w:rPr>
-                <w:lang w:val="en-US"/>
-              </w:rPr>
-            </w:pPr>
-            <w:r>
-              <w:rPr>
-                <w:lang w:val="en-US"/>
-              </w:rPr>
+            </w:pPr>
+            <w:r>
               <w:t>AI</w:t>
             </w:r>
           </w:p>
@@ -166,15 +116,7 @@
             <w:gridSpan w:val="2"/>
           </w:tcPr>
           <w:p>
-            <w:pPr>
-              <w:rPr>
-                <w:lang w:val="en-US"/>
-              </w:rPr>
-            </w:pPr>
-            <w:r>
-              <w:rPr>
-                <w:lang w:val="en-US"/>
-              </w:rPr>
+            <w:r>
               <w:t>Artificial intelligence – simulation of human intelligence processes</w:t>
             </w:r>
           </w:p>
@@ -186,9 +128,6 @@
           <w:p>
             <w:pPr>
               <w:jc w:val="center"/>
-              <w:rPr>
-                <w:lang w:val="en-US"/>
-              </w:rPr>
             </w:pPr>
             <w:r>
               <w:rPr>
@@ -271,28 +210,16 @@
           <w:p>
             <w:pPr>
               <w:jc w:val="center"/>
-              <w:rPr>
-                <w:lang w:val="en-US"/>
-              </w:rPr>
-            </w:pPr>
-            <w:r>
-              <w:rPr>
-                <w:lang w:val="en-US"/>
-              </w:rPr>
+            </w:pPr>
+            <w:r>
               <w:t>L01</w:t>
             </w:r>
           </w:p>
           <w:p>
             <w:pPr>
               <w:jc w:val="center"/>
-              <w:rPr>
-                <w:lang w:val="en-US"/>
-              </w:rPr>
-            </w:pPr>
-            <w:r>
-              <w:rPr>
-                <w:lang w:val="en-US"/>
-              </w:rPr>
+            </w:pPr>
+            <w:r>
               <w:t>17:50</w:t>
             </w:r>
           </w:p>
@@ -304,14 +231,8 @@
           <w:p>
             <w:pPr>
               <w:jc w:val="center"/>
-              <w:rPr>
-                <w:lang w:val="en-US"/>
-              </w:rPr>
-            </w:pPr>
-            <w:r>
-              <w:rPr>
-                <w:lang w:val="en-US"/>
-              </w:rPr>
+            </w:pPr>
+            <w:r>
               <w:t>Machine Learning</w:t>
             </w:r>
           </w:p>
@@ -322,15 +243,7 @@
             <w:gridSpan w:val="2"/>
           </w:tcPr>
           <w:p>
-            <w:pPr>
-              <w:rPr>
-                <w:lang w:val="en-US"/>
-              </w:rPr>
-            </w:pPr>
-            <w:r>
-              <w:rPr>
-                <w:lang w:val="en-US"/>
-              </w:rPr>
+            <w:r>
               <w:t>The practice of teaching computers how to learn patterns from data.</w:t>
             </w:r>
           </w:p>
@@ -342,23 +255,14 @@
           <w:p>
             <w:pPr>
               <w:jc w:val="center"/>
-              <w:rPr>
-                <w:lang w:val="en-US"/>
-              </w:rPr>
-            </w:pPr>
-            <w:r>
-              <w:rPr>
-                <w:lang w:val="en-US"/>
-              </w:rPr>
+            </w:pPr>
+            <w:r>
               <w:t>Waze</w:t>
             </w:r>
           </w:p>
           <w:p>
             <w:pPr>
               <w:jc w:val="center"/>
-              <w:rPr>
-                <w:lang w:val="en-US"/>
-              </w:rPr>
             </w:pPr>
             <w:r>
               <w:rPr>
@@ -441,14 +345,8 @@
           <w:p>
             <w:pPr>
               <w:jc w:val="center"/>
-              <w:rPr>
-                <w:lang w:val="en-US"/>
-              </w:rPr>
-            </w:pPr>
-            <w:r>
-              <w:rPr>
-                <w:lang w:val="en-US"/>
-              </w:rPr>
+            </w:pPr>
+            <w:r>
               <w:lastRenderedPageBreak/>
               <w:t>L01</w:t>
             </w:r>
@@ -456,14 +354,8 @@
           <w:p>
             <w:pPr>
               <w:jc w:val="center"/>
-              <w:rPr>
-                <w:lang w:val="en-US"/>
-              </w:rPr>
-            </w:pPr>
-            <w:r>
-              <w:rPr>
-                <w:lang w:val="en-US"/>
-              </w:rPr>
+            </w:pPr>
+            <w:r>
               <w:t>17:55</w:t>
             </w:r>
           </w:p>
@@ -475,14 +367,8 @@
           <w:p>
             <w:pPr>
               <w:jc w:val="center"/>
-              <w:rPr>
-                <w:lang w:val="en-US"/>
-              </w:rPr>
-            </w:pPr>
-            <w:r>
-              <w:rPr>
-                <w:lang w:val="en-US"/>
-              </w:rPr>
+            </w:pPr>
+            <w:r>
               <w:t>Generative AI</w:t>
             </w:r>
           </w:p>
@@ -493,29 +379,15 @@
             <w:gridSpan w:val="2"/>
           </w:tcPr>
           <w:p>
-            <w:pPr>
-              <w:rPr>
-                <w:lang w:val="en-US"/>
-              </w:rPr>
-            </w:pPr>
-            <w:r>
-              <w:rPr>
-                <w:lang w:val="en-US"/>
-              </w:rPr>
+            <w:r>
               <w:t xml:space="preserve">Generative artificial intelligence (AI) describes algorithms that can be used to create new content (Audio, Video </w:t>
             </w:r>
             <w:proofErr w:type="spellStart"/>
             <w:r>
-              <w:rPr>
-                <w:lang w:val="en-US"/>
-              </w:rPr>
               <w:t>e.t.</w:t>
             </w:r>
             <w:proofErr w:type="spellEnd"/>
             <w:r>
-              <w:rPr>
-                <w:lang w:val="en-US"/>
-              </w:rPr>
               <w:t>)</w:t>
             </w:r>
           </w:p>
@@ -527,9 +399,6 @@
           <w:p>
             <w:pPr>
               <w:jc w:val="center"/>
-              <w:rPr>
-                <w:lang w:val="en-US"/>
-              </w:rPr>
             </w:pPr>
             <w:r>
               <w:rPr>
@@ -612,28 +481,16 @@
           <w:p>
             <w:pPr>
               <w:jc w:val="center"/>
-              <w:rPr>
-                <w:lang w:val="en-US"/>
-              </w:rPr>
-            </w:pPr>
-            <w:r>
-              <w:rPr>
-                <w:lang w:val="en-US"/>
-              </w:rPr>
+            </w:pPr>
+            <w:r>
               <w:t>L01</w:t>
             </w:r>
           </w:p>
           <w:p>
             <w:pPr>
               <w:jc w:val="center"/>
-              <w:rPr>
-                <w:lang w:val="en-US"/>
-              </w:rPr>
-            </w:pPr>
-            <w:r>
-              <w:rPr>
-                <w:lang w:val="en-US"/>
-              </w:rPr>
+            </w:pPr>
+            <w:r>
               <w:t>18:05</w:t>
             </w:r>
           </w:p>
@@ -645,14 +502,8 @@
           <w:p>
             <w:pPr>
               <w:jc w:val="center"/>
-              <w:rPr>
-                <w:lang w:val="en-US"/>
-              </w:rPr>
-            </w:pPr>
-            <w:r>
-              <w:rPr>
-                <w:lang w:val="en-US"/>
-              </w:rPr>
+            </w:pPr>
+            <w:r>
               <w:t>Large Language Models (LLM)</w:t>
             </w:r>
           </w:p>
@@ -663,15 +514,7 @@
             <w:gridSpan w:val="2"/>
           </w:tcPr>
           <w:p>
-            <w:pPr>
-              <w:rPr>
-                <w:lang w:val="en-US"/>
-              </w:rPr>
-            </w:pPr>
-            <w:r>
-              <w:rPr>
-                <w:lang w:val="en-US"/>
-              </w:rPr>
+            <w:r>
               <w:t>Type of AI that can mimic human intelligence</w:t>
             </w:r>
           </w:p>
@@ -683,9 +526,6 @@
           <w:p>
             <w:pPr>
               <w:jc w:val="center"/>
-              <w:rPr>
-                <w:lang w:val="en-US"/>
-              </w:rPr>
             </w:pPr>
           </w:p>
         </w:tc>
@@ -698,28 +538,16 @@
           <w:p>
             <w:pPr>
               <w:jc w:val="center"/>
-              <w:rPr>
-                <w:lang w:val="en-US"/>
-              </w:rPr>
-            </w:pPr>
-            <w:r>
-              <w:rPr>
-                <w:lang w:val="en-US"/>
-              </w:rPr>
+            </w:pPr>
+            <w:r>
               <w:t>L01</w:t>
             </w:r>
           </w:p>
           <w:p>
             <w:pPr>
               <w:jc w:val="center"/>
-              <w:rPr>
-                <w:lang w:val="en-US"/>
-              </w:rPr>
-            </w:pPr>
-            <w:r>
-              <w:rPr>
-                <w:lang w:val="en-US"/>
-              </w:rPr>
+            </w:pPr>
+            <w:r>
               <w:t>18:25</w:t>
             </w:r>
           </w:p>
@@ -731,14 +559,8 @@
           <w:p>
             <w:pPr>
               <w:jc w:val="center"/>
-              <w:rPr>
-                <w:lang w:val="en-US"/>
-              </w:rPr>
-            </w:pPr>
-            <w:r>
-              <w:rPr>
-                <w:lang w:val="en-US"/>
-              </w:rPr>
+            </w:pPr>
+            <w:r>
               <w:t>Chat GPT</w:t>
             </w:r>
           </w:p>
@@ -749,15 +571,7 @@
             <w:gridSpan w:val="2"/>
           </w:tcPr>
           <w:p>
-            <w:pPr>
-              <w:rPr>
-                <w:lang w:val="en-US"/>
-              </w:rPr>
-            </w:pPr>
-            <w:r>
-              <w:rPr>
-                <w:lang w:val="en-US"/>
-              </w:rPr>
+            <w:r>
               <w:t>Tool of LLM</w:t>
             </w:r>
           </w:p>
@@ -769,9 +583,6 @@
           <w:p>
             <w:pPr>
               <w:jc w:val="center"/>
-              <w:rPr>
-                <w:lang w:val="en-US"/>
-              </w:rPr>
             </w:pPr>
             <w:r>
               <w:rPr>
@@ -854,14 +665,8 @@
           <w:p>
             <w:pPr>
               <w:jc w:val="center"/>
-              <w:rPr>
-                <w:lang w:val="en-US"/>
-              </w:rPr>
-            </w:pPr>
-            <w:r>
-              <w:rPr>
-                <w:lang w:val="en-US"/>
-              </w:rPr>
+            </w:pPr>
+            <w:r>
               <w:lastRenderedPageBreak/>
               <w:t>L01</w:t>
             </w:r>
@@ -869,14 +674,8 @@
           <w:p>
             <w:pPr>
               <w:jc w:val="center"/>
-              <w:rPr>
-                <w:lang w:val="en-US"/>
-              </w:rPr>
-            </w:pPr>
-            <w:r>
-              <w:rPr>
-                <w:lang w:val="en-US"/>
-              </w:rPr>
+            </w:pPr>
+            <w:r>
               <w:t>18:30</w:t>
             </w:r>
           </w:p>
@@ -888,27 +687,17 @@
           <w:p>
             <w:pPr>
               <w:jc w:val="center"/>
-              <w:rPr>
-                <w:lang w:val="en-US"/>
-              </w:rPr>
-            </w:pPr>
-            <w:r>
-              <w:rPr>
-                <w:lang w:val="en-US"/>
-              </w:rPr>
+            </w:pPr>
+            <w:r>
               <w:t>Temperature</w:t>
             </w:r>
             <w:r>
-              <w:rPr>
-                <w:lang w:val="en-US"/>
-              </w:rPr>
               <w:br/>
             </w:r>
             <w:r>
               <w:rPr>
                 <w:rFonts w:hint="cs"/>
                 <w:rtl/>
-                <w:lang w:val="en-US"/>
               </w:rPr>
               <w:t>עד כמה יצירתי אני רוצה שהוא יהיה</w:t>
             </w:r>
@@ -920,28 +709,12 @@
             <w:gridSpan w:val="2"/>
           </w:tcPr>
           <w:p>
-            <w:pPr>
-              <w:rPr>
-                <w:lang w:val="en-US"/>
-              </w:rPr>
-            </w:pPr>
-            <w:r>
-              <w:rPr>
-                <w:lang w:val="en-US"/>
-              </w:rPr>
+            <w:r>
               <w:t>Param of LLM</w:t>
             </w:r>
           </w:p>
           <w:p>
-            <w:pPr>
-              <w:rPr>
-                <w:lang w:val="en-US"/>
-              </w:rPr>
-            </w:pPr>
-            <w:r>
-              <w:rPr>
-                <w:lang w:val="en-US"/>
-              </w:rPr>
+            <w:r>
               <w:t>The artistic answers of AI</w:t>
             </w:r>
           </w:p>
@@ -953,9 +726,6 @@
           <w:p>
             <w:pPr>
               <w:jc w:val="center"/>
-              <w:rPr>
-                <w:lang w:val="en-US"/>
-              </w:rPr>
             </w:pPr>
             <w:r>
               <w:rPr>
@@ -1031,9 +801,6 @@
           <w:p>
             <w:pPr>
               <w:jc w:val="center"/>
-              <w:rPr>
-                <w:lang w:val="en-US"/>
-              </w:rPr>
             </w:pPr>
             <w:r>
               <w:rPr>
@@ -1116,55 +883,34 @@
           <w:p>
             <w:pPr>
               <w:jc w:val="center"/>
-              <w:rPr>
-                <w:lang w:val="en-US"/>
-              </w:rPr>
-            </w:pPr>
-            <w:r>
-              <w:rPr>
-                <w:lang w:val="en-US"/>
-              </w:rPr>
+            </w:pPr>
+            <w:r>
               <w:t>L01</w:t>
             </w:r>
           </w:p>
           <w:p>
             <w:pPr>
               <w:jc w:val="center"/>
-              <w:rPr>
-                <w:lang w:val="en-US"/>
-              </w:rPr>
-            </w:pPr>
-            <w:r>
-              <w:rPr>
-                <w:lang w:val="en-US"/>
-              </w:rPr>
+            </w:pPr>
+            <w:r>
               <w:t>18:35</w:t>
             </w:r>
           </w:p>
           <w:p>
             <w:pPr>
               <w:jc w:val="center"/>
-              <w:rPr>
-                <w:lang w:val="en-US"/>
-              </w:rPr>
-            </w:pPr>
-          </w:p>
-        </w:tc>
-        <w:tc>
-          <w:tcPr>
-            <w:tcW w:w="2614" w:type="dxa"/>
-          </w:tcPr>
-          <w:p>
-            <w:pPr>
-              <w:jc w:val="center"/>
-              <w:rPr>
-                <w:lang w:val="en-US"/>
-              </w:rPr>
-            </w:pPr>
-            <w:r>
-              <w:rPr>
-                <w:lang w:val="en-US"/>
-              </w:rPr>
+            </w:pPr>
+          </w:p>
+        </w:tc>
+        <w:tc>
+          <w:tcPr>
+            <w:tcW w:w="2614" w:type="dxa"/>
+          </w:tcPr>
+          <w:p>
+            <w:pPr>
+              <w:jc w:val="center"/>
+            </w:pPr>
+            <w:r>
               <w:t>Max Tokens</w:t>
             </w:r>
           </w:p>
@@ -1175,29 +921,15 @@
             <w:gridSpan w:val="2"/>
           </w:tcPr>
           <w:p>
-            <w:pPr>
-              <w:rPr>
-                <w:lang w:val="en-US"/>
-              </w:rPr>
-            </w:pPr>
-            <w:r>
-              <w:rPr>
-                <w:lang w:val="en-US"/>
-              </w:rPr>
+            <w:r>
               <w:t xml:space="preserve">Sets the upper limit for the total number of tokens, </w:t>
             </w:r>
             <w:proofErr w:type="spellStart"/>
             <w:r>
-              <w:rPr>
-                <w:lang w:val="en-US"/>
-              </w:rPr>
               <w:t>encapassing</w:t>
             </w:r>
             <w:proofErr w:type="spellEnd"/>
             <w:r>
-              <w:rPr>
-                <w:lang w:val="en-US"/>
-              </w:rPr>
               <w:t xml:space="preserve"> both the input provided to the LLM as a prompt</w:t>
             </w:r>
           </w:p>
@@ -1209,9 +941,6 @@
           <w:p>
             <w:pPr>
               <w:jc w:val="center"/>
-              <w:rPr>
-                <w:lang w:val="en-US"/>
-              </w:rPr>
             </w:pPr>
             <w:r>
               <w:rPr>
@@ -1294,28 +1023,16 @@
           <w:p>
             <w:pPr>
               <w:jc w:val="center"/>
-              <w:rPr>
-                <w:lang w:val="en-US"/>
-              </w:rPr>
-            </w:pPr>
-            <w:r>
-              <w:rPr>
-                <w:lang w:val="en-US"/>
-              </w:rPr>
+            </w:pPr>
+            <w:r>
               <w:t>L01</w:t>
             </w:r>
           </w:p>
           <w:p>
             <w:pPr>
               <w:jc w:val="center"/>
-              <w:rPr>
-                <w:lang w:val="en-US"/>
-              </w:rPr>
-            </w:pPr>
-            <w:r>
-              <w:rPr>
-                <w:lang w:val="en-US"/>
-              </w:rPr>
+            </w:pPr>
+            <w:r>
               <w:t>18:39</w:t>
             </w:r>
           </w:p>
@@ -1327,14 +1044,8 @@
           <w:p>
             <w:pPr>
               <w:jc w:val="center"/>
-              <w:rPr>
-                <w:lang w:val="en-US"/>
-              </w:rPr>
-            </w:pPr>
-            <w:r>
-              <w:rPr>
-                <w:lang w:val="en-US"/>
-              </w:rPr>
+            </w:pPr>
+            <w:r>
               <w:t>Top P</w:t>
             </w:r>
           </w:p>
@@ -1349,134 +1060,37 @@
               <w:bidi/>
               <w:rPr>
                 <w:rtl/>
-                <w:lang w:val="en-US"/>
               </w:rPr>
             </w:pPr>
             <w:r>
               <w:rPr>
                 <w:rFonts w:hint="cs"/>
                 <w:rtl/>
-                <w:lang w:val="en-US"/>
               </w:rPr>
               <w:t>צמצום עוצר המילים.</w:t>
             </w:r>
           </w:p>
-          <w:p>
-            <w:pPr>
-              <w:rPr>
-                <w:lang w:val="en-US"/>
-              </w:rPr>
-            </w:pPr>
-          </w:p>
-          <w:p>
-            <w:pPr>
-              <w:rPr>
-                <w:lang w:val="en-US"/>
-              </w:rPr>
-            </w:pPr>
-            <w:r>
-              <w:rPr>
-                <w:lang w:val="en-US"/>
-              </w:rPr>
+          <w:p/>
+          <w:p>
+            <w:r>
               <w:t xml:space="preserve">Lower To-P: Take the mist famous results </w:t>
             </w:r>
           </w:p>
-          <w:p>
-            <w:pPr>
-              <w:rPr>
-                <w:lang w:val="en-US"/>
-              </w:rPr>
-            </w:pPr>
-          </w:p>
-          <w:p>
-            <w:pPr>
-              <w:rPr>
-                <w:lang w:val="en-US"/>
-              </w:rPr>
-            </w:pPr>
-            <w:r>
-              <w:rPr>
-                <w:lang w:val="en-US"/>
-              </w:rPr>
-              <w:t xml:space="preserve">Higher </w:t>
-            </w:r>
-            <w:proofErr w:type="gramStart"/>
-            <w:r>
-              <w:rPr>
-                <w:lang w:val="en-US"/>
-              </w:rPr>
-              <w:t>Top-P</w:t>
-            </w:r>
-            <w:proofErr w:type="gramEnd"/>
-            <w:r>
-              <w:rPr>
-                <w:lang w:val="en-US"/>
-              </w:rPr>
-              <w:t xml:space="preserve">: can take </w:t>
-            </w:r>
-            <w:proofErr w:type="gramStart"/>
-            <w:r>
-              <w:rPr>
-                <w:lang w:val="en-US"/>
-              </w:rPr>
-              <w:t>the all</w:t>
-            </w:r>
-            <w:proofErr w:type="gramEnd"/>
-            <w:r>
-              <w:rPr>
-                <w:lang w:val="en-US"/>
-              </w:rPr>
-              <w:t xml:space="preserve"> options to result</w:t>
-            </w:r>
-          </w:p>
-          <w:p>
-            <w:pPr>
-              <w:rPr>
-                <w:lang w:val="en-US"/>
-              </w:rPr>
-            </w:pPr>
-          </w:p>
-          <w:p>
-            <w:pPr>
-              <w:rPr>
-                <w:lang w:val="en-US"/>
-              </w:rPr>
-            </w:pPr>
-          </w:p>
-          <w:p>
-            <w:pPr>
-              <w:rPr>
-                <w:lang w:val="en-US"/>
-              </w:rPr>
-            </w:pPr>
-          </w:p>
-          <w:p>
-            <w:pPr>
-              <w:rPr>
-                <w:lang w:val="en-US"/>
-              </w:rPr>
-            </w:pPr>
-          </w:p>
-          <w:p>
-            <w:pPr>
-              <w:rPr>
-                <w:lang w:val="en-US"/>
-              </w:rPr>
-            </w:pPr>
-          </w:p>
-          <w:p>
-            <w:pPr>
-              <w:rPr>
-                <w:lang w:val="en-US"/>
-              </w:rPr>
-            </w:pPr>
-          </w:p>
-          <w:p>
-            <w:pPr>
-              <w:jc w:val="center"/>
-              <w:rPr>
-                <w:lang w:val="en-US"/>
-              </w:rPr>
+          <w:p/>
+          <w:p>
+            <w:r>
+              <w:t>Higher Top-P: can take the all options to result</w:t>
+            </w:r>
+          </w:p>
+          <w:p/>
+          <w:p/>
+          <w:p/>
+          <w:p/>
+          <w:p/>
+          <w:p/>
+          <w:p>
+            <w:pPr>
+              <w:jc w:val="center"/>
             </w:pPr>
           </w:p>
         </w:tc>
@@ -1487,9 +1101,6 @@
           <w:p>
             <w:pPr>
               <w:jc w:val="center"/>
-              <w:rPr>
-                <w:lang w:val="en-US"/>
-              </w:rPr>
             </w:pPr>
             <w:r>
               <w:rPr>
@@ -1572,14 +1183,8 @@
           <w:p>
             <w:pPr>
               <w:jc w:val="center"/>
-              <w:rPr>
-                <w:lang w:val="en-US"/>
-              </w:rPr>
-            </w:pPr>
-            <w:r>
-              <w:rPr>
-                <w:lang w:val="en-US"/>
-              </w:rPr>
+            </w:pPr>
+            <w:r>
               <w:lastRenderedPageBreak/>
               <w:t>18:42</w:t>
             </w:r>
@@ -1587,44 +1192,28 @@
           <w:p>
             <w:pPr>
               <w:jc w:val="center"/>
-              <w:rPr>
-                <w:lang w:val="en-US"/>
-              </w:rPr>
-            </w:pPr>
-          </w:p>
-          <w:p>
-            <w:pPr>
-              <w:jc w:val="center"/>
-              <w:rPr>
-                <w:lang w:val="en-US"/>
-              </w:rPr>
+            </w:pPr>
+          </w:p>
+          <w:p>
+            <w:pPr>
+              <w:jc w:val="center"/>
             </w:pPr>
             <w:r>
               <w:rPr>
                 <w:b/>
                 <w:bCs/>
-                <w:lang w:val="en-US"/>
               </w:rPr>
               <w:t>Record</w:t>
             </w:r>
             <w:r>
-              <w:rPr>
-                <w:lang w:val="en-US"/>
-              </w:rPr>
               <w:t xml:space="preserve">: </w:t>
             </w:r>
           </w:p>
           <w:p>
             <w:pPr>
               <w:jc w:val="center"/>
-              <w:rPr>
-                <w:lang w:val="en-US"/>
-              </w:rPr>
-            </w:pPr>
-            <w:r>
-              <w:rPr>
-                <w:lang w:val="en-US"/>
-              </w:rPr>
+            </w:pPr>
+            <w:r>
               <w:t>01:10:00</w:t>
             </w:r>
           </w:p>
@@ -1636,14 +1225,8 @@
           <w:p>
             <w:pPr>
               <w:jc w:val="center"/>
-              <w:rPr>
-                <w:lang w:val="en-US"/>
-              </w:rPr>
-            </w:pPr>
-            <w:r>
-              <w:rPr>
-                <w:lang w:val="en-US"/>
-              </w:rPr>
+            </w:pPr>
+            <w:r>
               <w:t>Presence Penalty\</w:t>
             </w:r>
           </w:p>
@@ -1652,14 +1235,12 @@
               <w:jc w:val="center"/>
               <w:rPr>
                 <w:rtl/>
-                <w:lang w:val="en-US"/>
               </w:rPr>
             </w:pPr>
             <w:r>
               <w:rPr>
                 <w:rFonts w:hint="cs"/>
                 <w:rtl/>
-                <w:lang w:val="en-US"/>
               </w:rPr>
               <w:t>עד כמה מפריע לי שהוא חוזר על אותה מילה</w:t>
             </w:r>
@@ -1671,32 +1252,12 @@
             <w:gridSpan w:val="2"/>
           </w:tcPr>
           <w:p>
-            <w:pPr>
-              <w:rPr>
-                <w:lang w:val="en-US"/>
-              </w:rPr>
-            </w:pPr>
-            <w:r>
-              <w:rPr>
-                <w:lang w:val="en-US"/>
-              </w:rPr>
+            <w:r>
               <w:t>Parameter prevents the model from repeating a word, even if it’s only been used once.</w:t>
             </w:r>
           </w:p>
-          <w:p>
-            <w:pPr>
-              <w:rPr>
-                <w:lang w:val="en-US"/>
-              </w:rPr>
-            </w:pPr>
-          </w:p>
-          <w:p>
-            <w:pPr>
-              <w:rPr>
-                <w:lang w:val="en-US"/>
-              </w:rPr>
-            </w:pPr>
-          </w:p>
+          <w:p/>
+          <w:p/>
         </w:tc>
         <w:tc>
           <w:tcPr>
@@ -1790,14 +1351,8 @@
           <w:p>
             <w:pPr>
               <w:jc w:val="center"/>
-              <w:rPr>
-                <w:lang w:val="en-US"/>
-              </w:rPr>
-            </w:pPr>
-            <w:r>
-              <w:rPr>
-                <w:lang w:val="en-US"/>
-              </w:rPr>
+            </w:pPr>
+            <w:r>
               <w:t>18:44</w:t>
             </w:r>
           </w:p>
@@ -1809,14 +1364,8 @@
           <w:p>
             <w:pPr>
               <w:jc w:val="center"/>
-              <w:rPr>
-                <w:lang w:val="en-US"/>
-              </w:rPr>
-            </w:pPr>
-            <w:r>
-              <w:rPr>
-                <w:lang w:val="en-US"/>
-              </w:rPr>
+            </w:pPr>
+            <w:r>
               <w:t>Frequency Penalty</w:t>
             </w:r>
           </w:p>
@@ -1825,14 +1374,12 @@
               <w:jc w:val="center"/>
               <w:rPr>
                 <w:rtl/>
-                <w:lang w:val="en-US"/>
               </w:rPr>
             </w:pPr>
             <w:r>
               <w:rPr>
                 <w:rFonts w:hint="cs"/>
                 <w:rtl/>
-                <w:lang w:val="en-US"/>
               </w:rPr>
               <w:t>עד כמה אני רוצה שירד תדירות שימוש במילה</w:t>
             </w:r>
@@ -1840,9 +1387,6 @@
           <w:p>
             <w:pPr>
               <w:jc w:val="center"/>
-              <w:rPr>
-                <w:lang w:val="en-US"/>
-              </w:rPr>
             </w:pPr>
           </w:p>
         </w:tc>
@@ -1852,30 +1396,8 @@
             <w:gridSpan w:val="2"/>
           </w:tcPr>
           <w:p>
-            <w:pPr>
-              <w:rPr>
-                <w:lang w:val="en-US"/>
-              </w:rPr>
-            </w:pPr>
-            <w:r>
-              <w:rPr>
-                <w:lang w:val="en-US"/>
-              </w:rPr>
-              <w:t xml:space="preserve">The frequency penalty </w:t>
-            </w:r>
-            <w:proofErr w:type="gramStart"/>
-            <w:r>
-              <w:rPr>
-                <w:lang w:val="en-US"/>
-              </w:rPr>
-              <w:t>applies</w:t>
-            </w:r>
-            <w:proofErr w:type="gramEnd"/>
-            <w:r>
-              <w:rPr>
-                <w:lang w:val="en-US"/>
-              </w:rPr>
-              <w:t xml:space="preserve"> a penalty on the next token proportional to how many times that token already appeared in the response and prompt</w:t>
+            <w:r>
+              <w:t>The frequency penalty applies a penalty on the next token proportional to how many times that token already appeared in the response and prompt</w:t>
             </w:r>
           </w:p>
         </w:tc>
@@ -1971,50 +1493,31 @@
           <w:p>
             <w:pPr>
               <w:jc w:val="center"/>
-              <w:rPr>
-                <w:lang w:val="en-US"/>
-              </w:rPr>
-            </w:pPr>
-            <w:r>
-              <w:rPr>
-                <w:lang w:val="en-US"/>
-              </w:rPr>
+            </w:pPr>
+            <w:r>
               <w:t>18:47</w:t>
             </w:r>
           </w:p>
           <w:p>
             <w:pPr>
               <w:jc w:val="center"/>
-              <w:rPr>
-                <w:lang w:val="en-US"/>
-              </w:rPr>
             </w:pPr>
             <w:r>
               <w:rPr>
                 <w:b/>
                 <w:bCs/>
-                <w:lang w:val="en-US"/>
               </w:rPr>
               <w:t>Record</w:t>
             </w:r>
             <w:r>
-              <w:rPr>
-                <w:lang w:val="en-US"/>
-              </w:rPr>
               <w:t>:</w:t>
             </w:r>
           </w:p>
           <w:p>
             <w:pPr>
               <w:jc w:val="center"/>
-              <w:rPr>
-                <w:lang w:val="en-US"/>
-              </w:rPr>
-            </w:pPr>
-            <w:r>
-              <w:rPr>
-                <w:lang w:val="en-US"/>
-              </w:rPr>
+            </w:pPr>
+            <w:r>
               <w:t>01:15:00</w:t>
             </w:r>
           </w:p>
@@ -2026,14 +1529,8 @@
           <w:p>
             <w:pPr>
               <w:jc w:val="center"/>
-              <w:rPr>
-                <w:lang w:val="en-US"/>
-              </w:rPr>
-            </w:pPr>
-            <w:r>
-              <w:rPr>
-                <w:lang w:val="en-US"/>
-              </w:rPr>
+            </w:pPr>
+            <w:r>
               <w:t>Logits</w:t>
             </w:r>
           </w:p>
@@ -2044,32 +1541,21 @@
             <w:gridSpan w:val="2"/>
           </w:tcPr>
           <w:p>
-            <w:pPr>
-              <w:rPr>
-                <w:lang w:val="en-US"/>
-              </w:rPr>
-            </w:pPr>
-            <w:r>
-              <w:rPr>
-                <w:lang w:val="en-US"/>
-              </w:rPr>
+            <w:r>
               <w:t>Scores assigned to different words by the model</w:t>
             </w:r>
           </w:p>
           <w:p>
             <w:pPr>
               <w:bidi/>
+              <w:rPr>
+                <w:rtl/>
+              </w:rPr>
+            </w:pPr>
+            <w:r>
               <w:rPr>
                 <w:rFonts w:hint="cs"/>
                 <w:rtl/>
-                <w:lang w:val="en-US"/>
-              </w:rPr>
-            </w:pPr>
-            <w:r>
-              <w:rPr>
-                <w:rFonts w:hint="cs"/>
-                <w:rtl/>
-                <w:lang w:val="en-US"/>
               </w:rPr>
               <w:t>אחוז סיכוי שימוש במילה</w:t>
             </w:r>
@@ -2097,14 +1583,8 @@
           <w:p>
             <w:pPr>
               <w:jc w:val="center"/>
-              <w:rPr>
-                <w:lang w:val="en-US"/>
-              </w:rPr>
-            </w:pPr>
-            <w:r>
-              <w:rPr>
-                <w:lang w:val="en-US"/>
-              </w:rPr>
+            </w:pPr>
+            <w:r>
               <w:lastRenderedPageBreak/>
               <w:t>19:12</w:t>
             </w:r>
@@ -2112,36 +1592,23 @@
           <w:p>
             <w:pPr>
               <w:jc w:val="center"/>
-              <w:rPr>
-                <w:lang w:val="en-US"/>
-              </w:rPr>
             </w:pPr>
             <w:r>
               <w:rPr>
                 <w:b/>
                 <w:bCs/>
-                <w:lang w:val="en-US"/>
               </w:rPr>
               <w:t>Record</w:t>
             </w:r>
             <w:r>
-              <w:rPr>
-                <w:lang w:val="en-US"/>
-              </w:rPr>
               <w:t>:</w:t>
             </w:r>
           </w:p>
           <w:p>
             <w:pPr>
               <w:jc w:val="center"/>
-              <w:rPr>
-                <w:lang w:val="en-US"/>
-              </w:rPr>
-            </w:pPr>
-            <w:r>
-              <w:rPr>
-                <w:lang w:val="en-US"/>
-              </w:rPr>
+            </w:pPr>
+            <w:r>
               <w:t>01:40:10</w:t>
             </w:r>
           </w:p>
@@ -2153,31 +1620,19 @@
           <w:p>
             <w:pPr>
               <w:jc w:val="center"/>
-              <w:rPr>
-                <w:lang w:val="en-US"/>
-              </w:rPr>
             </w:pPr>
             <w:proofErr w:type="spellStart"/>
             <w:r>
-              <w:rPr>
-                <w:lang w:val="en-US"/>
-              </w:rPr>
               <w:t>Promps</w:t>
             </w:r>
             <w:proofErr w:type="spellEnd"/>
             <w:r>
-              <w:rPr>
-                <w:lang w:val="en-US"/>
-              </w:rPr>
               <w:t xml:space="preserve"> Engineering</w:t>
             </w:r>
           </w:p>
           <w:p>
             <w:pPr>
               <w:jc w:val="center"/>
-              <w:rPr>
-                <w:lang w:val="en-US"/>
-              </w:rPr>
             </w:pPr>
           </w:p>
         </w:tc>
@@ -2187,52 +1642,16 @@
             <w:gridSpan w:val="2"/>
           </w:tcPr>
           <w:p>
-            <w:pPr>
-              <w:rPr>
-                <w:lang w:val="en-US"/>
-              </w:rPr>
-            </w:pPr>
-            <w:r>
-              <w:rPr>
-                <w:lang w:val="en-US"/>
-              </w:rPr>
-              <w:t xml:space="preserve">Management of the AI tool </w:t>
-            </w:r>
-            <w:proofErr w:type="gramStart"/>
-            <w:r>
-              <w:rPr>
-                <w:lang w:val="en-US"/>
-              </w:rPr>
-              <w:t>for get</w:t>
-            </w:r>
-            <w:proofErr w:type="gramEnd"/>
-            <w:r>
-              <w:rPr>
-                <w:lang w:val="en-US"/>
-              </w:rPr>
-              <w:t xml:space="preserve"> the best result.</w:t>
-            </w:r>
-          </w:p>
-          <w:p>
-            <w:pPr>
-              <w:rPr>
-                <w:lang w:val="en-US"/>
-              </w:rPr>
-            </w:pPr>
-            <w:r>
-              <w:rPr>
-                <w:lang w:val="en-US"/>
-              </w:rPr>
+            <w:r>
+              <w:t>Management of the AI tool for get the best result.</w:t>
+            </w:r>
+          </w:p>
+          <w:p>
+            <w:r>
               <w:t>Tactics</w:t>
             </w:r>
           </w:p>
-          <w:p>
-            <w:pPr>
-              <w:rPr>
-                <w:lang w:val="en-US"/>
-              </w:rPr>
-            </w:pPr>
-          </w:p>
+          <w:p/>
         </w:tc>
         <w:tc>
           <w:tcPr>
@@ -2256,35 +1675,23 @@
           <w:p>
             <w:pPr>
               <w:jc w:val="center"/>
-              <w:rPr>
-                <w:lang w:val="en-US"/>
-              </w:rPr>
-            </w:pPr>
-          </w:p>
-        </w:tc>
-        <w:tc>
-          <w:tcPr>
-            <w:tcW w:w="2614" w:type="dxa"/>
-          </w:tcPr>
-          <w:p>
-            <w:pPr>
-              <w:jc w:val="center"/>
-              <w:rPr>
-                <w:lang w:val="en-US"/>
-              </w:rPr>
+            </w:pPr>
+          </w:p>
+        </w:tc>
+        <w:tc>
+          <w:tcPr>
+            <w:tcW w:w="2614" w:type="dxa"/>
+          </w:tcPr>
+          <w:p>
+            <w:pPr>
+              <w:jc w:val="center"/>
             </w:pPr>
             <w:proofErr w:type="spellStart"/>
             <w:r>
-              <w:rPr>
-                <w:lang w:val="en-US"/>
-              </w:rPr>
               <w:t>Promps</w:t>
             </w:r>
             <w:proofErr w:type="spellEnd"/>
             <w:r>
-              <w:rPr>
-                <w:lang w:val="en-US"/>
-              </w:rPr>
               <w:t xml:space="preserve"> Wording</w:t>
             </w:r>
           </w:p>
@@ -2294,13 +1701,7 @@
             <w:tcW w:w="2614" w:type="dxa"/>
             <w:gridSpan w:val="2"/>
           </w:tcPr>
-          <w:p>
-            <w:pPr>
-              <w:rPr>
-                <w:lang w:val="en-US"/>
-              </w:rPr>
-            </w:pPr>
-          </w:p>
+          <w:p/>
         </w:tc>
         <w:tc>
           <w:tcPr>
@@ -2394,50 +1795,31 @@
           <w:p>
             <w:pPr>
               <w:jc w:val="center"/>
-              <w:rPr>
-                <w:lang w:val="en-US"/>
-              </w:rPr>
-            </w:pPr>
-            <w:r>
-              <w:rPr>
-                <w:lang w:val="en-US"/>
-              </w:rPr>
+            </w:pPr>
+            <w:r>
               <w:t>19:17</w:t>
             </w:r>
           </w:p>
           <w:p>
             <w:pPr>
               <w:jc w:val="center"/>
-              <w:rPr>
-                <w:lang w:val="en-US"/>
-              </w:rPr>
             </w:pPr>
             <w:r>
               <w:rPr>
                 <w:b/>
                 <w:bCs/>
-                <w:lang w:val="en-US"/>
               </w:rPr>
               <w:t>Record</w:t>
             </w:r>
             <w:r>
-              <w:rPr>
-                <w:lang w:val="en-US"/>
-              </w:rPr>
               <w:t>:</w:t>
             </w:r>
           </w:p>
           <w:p>
             <w:pPr>
               <w:jc w:val="center"/>
-              <w:rPr>
-                <w:lang w:val="en-US"/>
-              </w:rPr>
-            </w:pPr>
-            <w:r>
-              <w:rPr>
-                <w:lang w:val="en-US"/>
-              </w:rPr>
+            </w:pPr>
+            <w:r>
               <w:t>01:44:13</w:t>
             </w:r>
           </w:p>
@@ -2449,38 +1831,24 @@
           <w:p>
             <w:pPr>
               <w:jc w:val="center"/>
-              <w:rPr>
-                <w:lang w:val="en-US"/>
-              </w:rPr>
-            </w:pPr>
-            <w:r>
-              <w:rPr>
-                <w:lang w:val="en-US"/>
-              </w:rPr>
+            </w:pPr>
+            <w:r>
               <w:t>Delimiters</w:t>
             </w:r>
           </w:p>
           <w:p>
             <w:pPr>
               <w:jc w:val="center"/>
-              <w:rPr>
-                <w:lang w:val="en-US"/>
-              </w:rPr>
             </w:pPr>
           </w:p>
           <w:p>
             <w:pPr>
               <w:jc w:val="right"/>
-              <w:rPr>
-                <w:rFonts w:hint="cs"/>
-                <w:lang w:val="en-US"/>
-              </w:rPr>
             </w:pPr>
             <w:r>
               <w:rPr>
                 <w:rFonts w:hint="cs"/>
                 <w:rtl/>
-                <w:lang w:val="en-US"/>
               </w:rPr>
               <w:t>דרך להפריד בין שאלה\בקשה לקטע מסוים</w:t>
             </w:r>
@@ -2492,72 +1860,24 @@
             <w:gridSpan w:val="2"/>
           </w:tcPr>
           <w:p>
-            <w:pPr>
-              <w:rPr>
-                <w:lang w:val="en-US"/>
-              </w:rPr>
-            </w:pPr>
-            <w:r>
-              <w:rPr>
-                <w:lang w:val="en-US"/>
-              </w:rPr>
+            <w:r>
               <w:t xml:space="preserve">Using </w:t>
             </w:r>
             <w:proofErr w:type="spellStart"/>
             <w:r>
-              <w:rPr>
-                <w:lang w:val="en-US"/>
-              </w:rPr>
               <w:t>delimeters</w:t>
             </w:r>
             <w:proofErr w:type="spellEnd"/>
             <w:r>
-              <w:rPr>
-                <w:lang w:val="en-US"/>
-              </w:rPr>
-              <w:t xml:space="preserve"> in prompts can be beneficial in situations where you want to structure your input </w:t>
-            </w:r>
-            <w:proofErr w:type="gramStart"/>
-            <w:r>
-              <w:rPr>
-                <w:lang w:val="en-US"/>
-              </w:rPr>
-              <w:t>in a way that is clear</w:t>
-            </w:r>
-            <w:proofErr w:type="gramEnd"/>
-            <w:r>
-              <w:rPr>
-                <w:lang w:val="en-US"/>
-              </w:rPr>
-              <w:t xml:space="preserve"> and easily parsed by an </w:t>
+              <w:t xml:space="preserve"> in prompts can be beneficial in situations where you want to structure your input in a way that is clear and easily parsed by an </w:t>
             </w:r>
             <w:proofErr w:type="spellStart"/>
             <w:r>
-              <w:rPr>
-                <w:lang w:val="en-US"/>
-              </w:rPr>
               <w:t>LLm</w:t>
             </w:r>
             <w:proofErr w:type="spellEnd"/>
             <w:r>
-              <w:rPr>
-                <w:lang w:val="en-US"/>
-              </w:rPr>
-              <w:t xml:space="preserve"> </w:t>
-            </w:r>
-            <w:proofErr w:type="gramStart"/>
-            <w:r>
-              <w:rPr>
-                <w:lang w:val="en-US"/>
-              </w:rPr>
-              <w:t>rely</w:t>
-            </w:r>
-            <w:proofErr w:type="gramEnd"/>
-            <w:r>
-              <w:rPr>
-                <w:lang w:val="en-US"/>
-              </w:rPr>
-              <w:t xml:space="preserve"> on textual context</w:t>
+              <w:t xml:space="preserve"> rely on textual context</w:t>
             </w:r>
           </w:p>
         </w:tc>
@@ -2653,14 +1973,8 @@
           <w:p>
             <w:pPr>
               <w:jc w:val="center"/>
-              <w:rPr>
-                <w:lang w:val="en-US"/>
-              </w:rPr>
-            </w:pPr>
-            <w:r>
-              <w:rPr>
-                <w:lang w:val="en-US"/>
-              </w:rPr>
+            </w:pPr>
+            <w:r>
               <w:lastRenderedPageBreak/>
               <w:t>19:20</w:t>
             </w:r>
@@ -2668,36 +1982,23 @@
           <w:p>
             <w:pPr>
               <w:jc w:val="center"/>
-              <w:rPr>
-                <w:lang w:val="en-US"/>
-              </w:rPr>
             </w:pPr>
             <w:r>
               <w:rPr>
                 <w:b/>
                 <w:bCs/>
-                <w:lang w:val="en-US"/>
               </w:rPr>
               <w:t>Record</w:t>
             </w:r>
             <w:r>
-              <w:rPr>
-                <w:lang w:val="en-US"/>
-              </w:rPr>
               <w:t>:</w:t>
             </w:r>
           </w:p>
           <w:p>
             <w:pPr>
               <w:jc w:val="center"/>
-              <w:rPr>
-                <w:lang w:val="en-US"/>
-              </w:rPr>
-            </w:pPr>
-            <w:r>
-              <w:rPr>
-                <w:lang w:val="en-US"/>
-              </w:rPr>
+            </w:pPr>
+            <w:r>
               <w:t>01:47:37</w:t>
             </w:r>
           </w:p>
@@ -2709,36 +2010,23 @@
           <w:p>
             <w:pPr>
               <w:jc w:val="center"/>
-              <w:rPr>
-                <w:lang w:val="en-US"/>
-              </w:rPr>
-            </w:pPr>
-            <w:r>
-              <w:rPr>
-                <w:lang w:val="en-US"/>
-              </w:rPr>
+            </w:pPr>
+            <w:r>
               <w:t>Specify Steps</w:t>
             </w:r>
           </w:p>
           <w:p>
             <w:pPr>
               <w:jc w:val="right"/>
-              <w:rPr>
-                <w:lang w:val="en-US"/>
-              </w:rPr>
             </w:pPr>
             <w:r>
               <w:rPr>
                 <w:rFonts w:hint="cs"/>
                 <w:rtl/>
-                <w:lang w:val="en-US"/>
               </w:rPr>
               <w:t xml:space="preserve">חלוקת התוכנים לפי שלבים </w:t>
             </w:r>
             <w:r>
-              <w:rPr>
-                <w:lang w:val="en-US"/>
-              </w:rPr>
               <w:t xml:space="preserve"> (Step-by-Step)</w:t>
             </w:r>
           </w:p>
@@ -2752,13 +2040,9 @@
             <w:pPr>
               <w:rPr>
                 <w:rtl/>
-                <w:lang w:val="en-US"/>
-              </w:rPr>
-            </w:pPr>
-            <w:r>
-              <w:rPr>
-                <w:lang w:val="en-US"/>
-              </w:rPr>
+              </w:rPr>
+            </w:pPr>
+            <w:r>
               <w:t>Divides the application into stages</w:t>
             </w:r>
           </w:p>
@@ -2855,15 +2139,11 @@
           <w:p>
             <w:pPr>
               <w:jc w:val="center"/>
-              <w:rPr>
-                <w:lang w:val="en-US"/>
-              </w:rPr>
             </w:pPr>
             <w:r>
               <w:rPr>
                 <w:rFonts w:hint="cs"/>
                 <w:rtl/>
-                <w:lang w:val="en-US"/>
               </w:rPr>
               <w:t>19:22</w:t>
             </w:r>
@@ -2871,36 +2151,23 @@
           <w:p>
             <w:pPr>
               <w:jc w:val="center"/>
-              <w:rPr>
-                <w:lang w:val="en-US"/>
-              </w:rPr>
             </w:pPr>
             <w:r>
               <w:rPr>
                 <w:b/>
                 <w:bCs/>
-                <w:lang w:val="en-US"/>
               </w:rPr>
               <w:t>Record</w:t>
             </w:r>
             <w:r>
-              <w:rPr>
-                <w:lang w:val="en-US"/>
-              </w:rPr>
               <w:t>:</w:t>
             </w:r>
           </w:p>
           <w:p>
             <w:pPr>
               <w:jc w:val="center"/>
-              <w:rPr>
-                <w:lang w:val="en-US"/>
-              </w:rPr>
-            </w:pPr>
-            <w:r>
-              <w:rPr>
-                <w:lang w:val="en-US"/>
-              </w:rPr>
+            </w:pPr>
+            <w:r>
               <w:t>01:49:58</w:t>
             </w:r>
           </w:p>
@@ -2912,105 +2179,63 @@
           <w:p>
             <w:pPr>
               <w:jc w:val="center"/>
-              <w:rPr>
-                <w:lang w:val="en-US"/>
-              </w:rPr>
-            </w:pPr>
-            <w:r>
-              <w:rPr>
-                <w:lang w:val="en-US"/>
-              </w:rPr>
+            </w:pPr>
+            <w:r>
               <w:t>Roles &amp; Goals</w:t>
             </w:r>
           </w:p>
           <w:p>
             <w:pPr>
               <w:jc w:val="center"/>
-              <w:rPr>
-                <w:lang w:val="en-US"/>
-              </w:rPr>
             </w:pPr>
           </w:p>
           <w:p>
             <w:pPr>
               <w:jc w:val="right"/>
-              <w:rPr>
-                <w:lang w:val="en-US"/>
-              </w:rPr>
-            </w:pPr>
-            <w:r>
-              <w:rPr>
-                <w:lang w:val="en-US"/>
-              </w:rPr>
+            </w:pPr>
+            <w:r>
               <w:t>Goals - "</w:t>
             </w:r>
             <w:r>
               <w:rPr>
                 <w:rFonts w:hint="cs"/>
                 <w:rtl/>
-                <w:lang w:val="en-US"/>
               </w:rPr>
               <w:t>לשים קובע של מישהו\משהו אחר"</w:t>
             </w:r>
             <w:r>
-              <w:rPr>
-                <w:lang w:val="en-US"/>
-              </w:rPr>
               <w:t xml:space="preserve"> </w:t>
             </w:r>
           </w:p>
           <w:p>
             <w:pPr>
               <w:jc w:val="right"/>
-              <w:rPr>
-                <w:rFonts w:hint="cs"/>
-                <w:lang w:val="en-US"/>
-              </w:rPr>
-            </w:pPr>
-            <w:proofErr w:type="gramStart"/>
-            <w:r>
-              <w:rPr>
-                <w:lang w:val="en-US"/>
-              </w:rPr>
+            </w:pPr>
+            <w:r>
               <w:t xml:space="preserve">Roles </w:t>
             </w:r>
             <w:r>
               <w:rPr>
                 <w:rFonts w:hint="cs"/>
                 <w:rtl/>
-                <w:lang w:val="en-US"/>
-              </w:rPr>
-              <w:t xml:space="preserve"> -</w:t>
-            </w:r>
-            <w:proofErr w:type="gramEnd"/>
+              </w:rPr>
+              <w:t xml:space="preserve"> - מטרתו של ה</w:t>
+            </w:r>
+            <w:r>
+              <w:t>AI</w:t>
+            </w:r>
             <w:r>
               <w:rPr>
                 <w:rFonts w:hint="cs"/>
                 <w:rtl/>
-                <w:lang w:val="en-US"/>
-              </w:rPr>
-              <w:t xml:space="preserve"> מטרתו של ה</w:t>
-            </w:r>
-            <w:r>
-              <w:rPr>
-                <w:lang w:val="en-US"/>
-              </w:rPr>
-              <w:t>AI</w:t>
-            </w:r>
-            <w:r>
-              <w:rPr>
-                <w:rFonts w:hint="cs"/>
+              </w:rPr>
+              <w:t xml:space="preserve"> כאשר הוא ב"קובע"</w:t>
+            </w:r>
+          </w:p>
+          <w:p>
+            <w:pPr>
+              <w:rPr>
                 <w:rtl/>
-                <w:lang w:val="en-US"/>
-              </w:rPr>
-              <w:t xml:space="preserve"> כאשר הוא ב"קובע"</w:t>
-            </w:r>
-          </w:p>
-          <w:p>
-            <w:pPr>
-              <w:rPr>
-                <w:rtl/>
-                <w:lang w:val="en-US"/>
               </w:rPr>
             </w:pPr>
           </w:p>
@@ -3027,24 +2252,12 @@
                 <w:ilvl w:val="0"/>
                 <w:numId w:val="1"/>
               </w:numPr>
-              <w:rPr>
-                <w:lang w:val="en-US"/>
-              </w:rPr>
-            </w:pPr>
-            <w:r>
-              <w:rPr>
-                <w:lang w:val="en-US"/>
-              </w:rPr>
+            </w:pPr>
+            <w:r>
               <w:t>Roles are personas assigned for the LLM and the intended audience.</w:t>
             </w:r>
           </w:p>
-          <w:p>
-            <w:pPr>
-              <w:rPr>
-                <w:lang w:val="en-US"/>
-              </w:rPr>
-            </w:pPr>
-          </w:p>
+          <w:p/>
           <w:p>
             <w:pPr>
               <w:pStyle w:val="ListParagraph"/>
@@ -3052,20 +2265,11 @@
                 <w:ilvl w:val="0"/>
                 <w:numId w:val="1"/>
               </w:numPr>
-              <w:rPr>
-                <w:lang w:val="en-US"/>
-              </w:rPr>
-            </w:pPr>
-            <w:r>
-              <w:rPr>
-                <w:lang w:val="en-US"/>
-              </w:rPr>
+            </w:pPr>
+            <w:r>
               <w:t>Goals are intimately connected to roles. Explicitly stating the goal of a prompt-guided interaction is not only a good idea</w:t>
             </w:r>
             <w:r>
-              <w:rPr>
-                <w:lang w:val="en-US"/>
-              </w:rPr>
               <w:t xml:space="preserve"> but also necessary.</w:t>
             </w:r>
           </w:p>
@@ -3240,14 +2444,8 @@
           <w:p>
             <w:pPr>
               <w:jc w:val="center"/>
-              <w:rPr>
-                <w:lang w:val="en-US"/>
-              </w:rPr>
-            </w:pPr>
-            <w:r>
-              <w:rPr>
-                <w:lang w:val="en-US"/>
-              </w:rPr>
+            </w:pPr>
+            <w:r>
               <w:lastRenderedPageBreak/>
               <w:t>19:32</w:t>
             </w:r>
@@ -3255,36 +2453,23 @@
           <w:p>
             <w:pPr>
               <w:jc w:val="center"/>
-              <w:rPr>
-                <w:lang w:val="en-US"/>
-              </w:rPr>
             </w:pPr>
             <w:r>
               <w:rPr>
                 <w:b/>
                 <w:bCs/>
-                <w:lang w:val="en-US"/>
               </w:rPr>
               <w:t>Record</w:t>
             </w:r>
             <w:r>
-              <w:rPr>
-                <w:lang w:val="en-US"/>
-              </w:rPr>
               <w:t>:</w:t>
             </w:r>
           </w:p>
           <w:p>
             <w:pPr>
               <w:jc w:val="center"/>
-              <w:rPr>
-                <w:lang w:val="en-US"/>
-              </w:rPr>
-            </w:pPr>
-            <w:r>
-              <w:rPr>
-                <w:lang w:val="en-US"/>
-              </w:rPr>
+            </w:pPr>
+            <w:r>
               <w:t>01:59:38</w:t>
             </w:r>
           </w:p>
@@ -3296,14 +2481,8 @@
           <w:p>
             <w:pPr>
               <w:jc w:val="center"/>
-              <w:rPr>
-                <w:lang w:val="en-US"/>
-              </w:rPr>
-            </w:pPr>
-            <w:r>
-              <w:rPr>
-                <w:lang w:val="en-US"/>
-              </w:rPr>
+            </w:pPr>
+            <w:r>
               <w:t>Positive &amp; Negative Prompting</w:t>
             </w:r>
           </w:p>
@@ -3314,28 +2493,12 @@
             <w:gridSpan w:val="2"/>
           </w:tcPr>
           <w:p>
-            <w:pPr>
-              <w:rPr>
-                <w:lang w:val="en-US"/>
-              </w:rPr>
-            </w:pPr>
-            <w:r>
-              <w:rPr>
-                <w:lang w:val="en-US"/>
-              </w:rPr>
+            <w:r>
               <w:t>Positive – Do this</w:t>
             </w:r>
           </w:p>
           <w:p>
-            <w:pPr>
-              <w:rPr>
-                <w:lang w:val="en-US"/>
-              </w:rPr>
-            </w:pPr>
-            <w:r>
-              <w:rPr>
-                <w:lang w:val="en-US"/>
-              </w:rPr>
+            <w:r>
               <w:t>Negative – Don’t do this</w:t>
             </w:r>
           </w:p>
@@ -3432,50 +2595,31 @@
           <w:p>
             <w:pPr>
               <w:jc w:val="center"/>
-              <w:rPr>
-                <w:lang w:val="en-US"/>
-              </w:rPr>
-            </w:pPr>
-            <w:r>
-              <w:rPr>
-                <w:lang w:val="en-US"/>
-              </w:rPr>
+            </w:pPr>
+            <w:r>
               <w:t>19:35</w:t>
             </w:r>
           </w:p>
           <w:p>
             <w:pPr>
               <w:jc w:val="center"/>
-              <w:rPr>
-                <w:lang w:val="en-US"/>
-              </w:rPr>
             </w:pPr>
             <w:r>
               <w:rPr>
                 <w:b/>
                 <w:bCs/>
-                <w:lang w:val="en-US"/>
               </w:rPr>
               <w:t>Record</w:t>
             </w:r>
             <w:r>
-              <w:rPr>
-                <w:lang w:val="en-US"/>
-              </w:rPr>
               <w:t>:</w:t>
             </w:r>
           </w:p>
           <w:p>
             <w:pPr>
               <w:jc w:val="center"/>
-              <w:rPr>
-                <w:lang w:val="en-US"/>
-              </w:rPr>
-            </w:pPr>
-            <w:r>
-              <w:rPr>
-                <w:lang w:val="en-US"/>
-              </w:rPr>
+            </w:pPr>
+            <w:r>
               <w:t>02:03:03</w:t>
             </w:r>
           </w:p>
@@ -3487,28 +2631,16 @@
           <w:p>
             <w:pPr>
               <w:jc w:val="center"/>
-              <w:rPr>
-                <w:lang w:val="en-US"/>
-              </w:rPr>
-            </w:pPr>
-            <w:r>
-              <w:rPr>
-                <w:lang w:val="en-US"/>
-              </w:rPr>
+            </w:pPr>
+            <w:r>
               <w:t>ChatGPT Prompts Strategi:</w:t>
             </w:r>
           </w:p>
           <w:p>
             <w:pPr>
               <w:jc w:val="center"/>
-              <w:rPr>
-                <w:lang w:val="en-US"/>
-              </w:rPr>
-            </w:pPr>
-            <w:r>
-              <w:rPr>
-                <w:lang w:val="en-US"/>
-              </w:rPr>
+            </w:pPr>
+            <w:r>
               <w:t>Input\Output</w:t>
             </w:r>
           </w:p>
@@ -3519,44 +2651,23 @@
             <w:gridSpan w:val="2"/>
           </w:tcPr>
           <w:p>
-            <w:pPr>
-              <w:rPr>
-                <w:lang w:val="en-US"/>
-              </w:rPr>
-            </w:pPr>
-            <w:r>
-              <w:rPr>
-                <w:lang w:val="en-US"/>
-              </w:rPr>
+            <w:r>
               <w:t>Inserting input</w:t>
             </w:r>
           </w:p>
           <w:p>
-            <w:pPr>
-              <w:rPr>
-                <w:lang w:val="en-US"/>
-              </w:rPr>
-            </w:pPr>
-            <w:r>
-              <w:rPr>
-                <w:lang w:val="en-US"/>
-              </w:rPr>
+            <w:r>
               <w:t>And get the output</w:t>
             </w:r>
           </w:p>
           <w:p>
             <w:pPr>
               <w:jc w:val="right"/>
-              <w:rPr>
-                <w:rFonts w:hint="cs"/>
-                <w:lang w:val="en-US"/>
-              </w:rPr>
             </w:pPr>
             <w:r>
               <w:rPr>
                 <w:rFonts w:hint="cs"/>
                 <w:rtl/>
-                <w:lang w:val="en-US"/>
               </w:rPr>
               <w:t>הכנסת טקסט\קלט אחר וקבלת חזרה את הפלט</w:t>
             </w:r>
@@ -3588,58 +2699,36 @@
           <w:p>
             <w:pPr>
               <w:jc w:val="center"/>
-              <w:rPr>
-                <w:lang w:val="en-US"/>
-              </w:rPr>
-            </w:pPr>
-            <w:r>
-              <w:rPr>
-                <w:lang w:val="en-US"/>
-              </w:rPr>
+            </w:pPr>
+            <w:r>
               <w:t>19:36</w:t>
             </w:r>
           </w:p>
           <w:p>
             <w:pPr>
               <w:jc w:val="center"/>
-              <w:rPr>
-                <w:lang w:val="en-US"/>
-              </w:rPr>
-            </w:pPr>
-          </w:p>
-          <w:p>
-            <w:pPr>
-              <w:jc w:val="center"/>
-              <w:rPr>
-                <w:lang w:val="en-US"/>
-              </w:rPr>
+            </w:pPr>
+          </w:p>
+          <w:p>
+            <w:pPr>
+              <w:jc w:val="center"/>
             </w:pPr>
             <w:r>
               <w:rPr>
                 <w:b/>
                 <w:bCs/>
-                <w:lang w:val="en-US"/>
               </w:rPr>
               <w:t>Record</w:t>
             </w:r>
             <w:r>
-              <w:rPr>
-                <w:lang w:val="en-US"/>
-              </w:rPr>
               <w:t>:</w:t>
             </w:r>
           </w:p>
           <w:p>
             <w:pPr>
               <w:jc w:val="center"/>
-              <w:rPr>
-                <w:lang w:val="en-US"/>
-              </w:rPr>
-            </w:pPr>
-            <w:r>
-              <w:rPr>
-                <w:lang w:val="en-US"/>
-              </w:rPr>
+            </w:pPr>
+            <w:r>
               <w:t>02:04:53</w:t>
             </w:r>
           </w:p>
@@ -3652,28 +2741,16 @@
           <w:p>
             <w:pPr>
               <w:jc w:val="center"/>
-              <w:rPr>
-                <w:lang w:val="en-US"/>
-              </w:rPr>
-            </w:pPr>
-            <w:r>
-              <w:rPr>
-                <w:lang w:val="en-US"/>
-              </w:rPr>
+            </w:pPr>
+            <w:r>
               <w:t>ChatGPT Prompts Strategi:</w:t>
             </w:r>
           </w:p>
           <w:p>
             <w:pPr>
               <w:jc w:val="center"/>
-              <w:rPr>
-                <w:lang w:val="en-US"/>
-              </w:rPr>
-            </w:pPr>
-            <w:r>
-              <w:rPr>
-                <w:lang w:val="en-US"/>
-              </w:rPr>
+            </w:pPr>
+            <w:r>
               <w:t>X-Shot</w:t>
             </w:r>
           </w:p>
@@ -3682,36 +2759,27 @@
               <w:bidi/>
               <w:rPr>
                 <w:rtl/>
-                <w:lang w:val="en-US"/>
               </w:rPr>
             </w:pPr>
           </w:p>
           <w:p>
             <w:pPr>
               <w:bidi/>
-              <w:rPr>
-                <w:lang w:val="en-US"/>
-              </w:rPr>
             </w:pPr>
             <w:r>
               <w:rPr>
                 <w:rFonts w:hint="cs"/>
                 <w:rtl/>
-                <w:lang w:val="en-US"/>
               </w:rPr>
               <w:t>מתן דוגמאות ל</w:t>
             </w:r>
             <w:r>
-              <w:rPr>
-                <w:lang w:val="en-US"/>
-              </w:rPr>
               <w:t>AI</w:t>
             </w:r>
             <w:r>
               <w:rPr>
                 <w:rFonts w:hint="cs"/>
                 <w:rtl/>
-                <w:lang w:val="en-US"/>
               </w:rPr>
               <w:t xml:space="preserve"> ביחד עם השאלה\בקשה</w:t>
             </w:r>
@@ -3723,25 +2791,11 @@
             <w:gridSpan w:val="2"/>
           </w:tcPr>
           <w:p>
-            <w:pPr>
-              <w:rPr>
-                <w:lang w:val="en-US"/>
-              </w:rPr>
-            </w:pPr>
-            <w:r>
-              <w:rPr>
-                <w:lang w:val="en-US"/>
-              </w:rPr>
+            <w:r>
               <w:t>Zero-Shot (0 examples)</w:t>
             </w:r>
           </w:p>
-          <w:p>
-            <w:pPr>
-              <w:rPr>
-                <w:lang w:val="en-US"/>
-              </w:rPr>
-            </w:pPr>
-          </w:p>
+          <w:p/>
         </w:tc>
         <w:tc>
           <w:tcPr>
@@ -3863,9 +2917,6 @@
           <w:p>
             <w:pPr>
               <w:jc w:val="center"/>
-              <w:rPr>
-                <w:lang w:val="en-US"/>
-              </w:rPr>
             </w:pPr>
           </w:p>
         </w:tc>
@@ -3877,9 +2928,6 @@
           <w:p>
             <w:pPr>
               <w:jc w:val="center"/>
-              <w:rPr>
-                <w:lang w:val="en-US"/>
-              </w:rPr>
             </w:pPr>
           </w:p>
         </w:tc>
@@ -3889,25 +2937,11 @@
             <w:gridSpan w:val="2"/>
           </w:tcPr>
           <w:p>
-            <w:pPr>
-              <w:rPr>
-                <w:lang w:val="en-US"/>
-              </w:rPr>
-            </w:pPr>
-            <w:r>
-              <w:rPr>
-                <w:lang w:val="en-US"/>
-              </w:rPr>
+            <w:r>
               <w:t>One-Shot (1 example)</w:t>
             </w:r>
           </w:p>
-          <w:p>
-            <w:pPr>
-              <w:rPr>
-                <w:lang w:val="en-US"/>
-              </w:rPr>
-            </w:pPr>
-          </w:p>
+          <w:p/>
         </w:tc>
         <w:tc>
           <w:tcPr>
@@ -4005,9 +3039,6 @@
           <w:p>
             <w:pPr>
               <w:jc w:val="center"/>
-              <w:rPr>
-                <w:lang w:val="en-US"/>
-              </w:rPr>
             </w:pPr>
           </w:p>
         </w:tc>
@@ -4019,9 +3050,6 @@
           <w:p>
             <w:pPr>
               <w:jc w:val="center"/>
-              <w:rPr>
-                <w:lang w:val="en-US"/>
-              </w:rPr>
             </w:pPr>
           </w:p>
         </w:tc>
@@ -4031,53 +3059,15 @@
             <w:gridSpan w:val="2"/>
           </w:tcPr>
           <w:p>
-            <w:pPr>
-              <w:rPr>
-                <w:lang w:val="en-US"/>
-              </w:rPr>
-            </w:pPr>
-            <w:proofErr w:type="gramStart"/>
-            <w:r>
-              <w:rPr>
-                <w:lang w:val="en-US"/>
-              </w:rPr>
-              <w:t>Few-Shot</w:t>
-            </w:r>
-            <w:proofErr w:type="gramEnd"/>
-            <w:r>
-              <w:rPr>
-                <w:lang w:val="en-US"/>
-              </w:rPr>
-              <w:t xml:space="preserve"> </w:t>
-            </w:r>
-            <w:proofErr w:type="gramStart"/>
-            <w:r>
-              <w:rPr>
-                <w:lang w:val="en-US"/>
-              </w:rPr>
-              <w:t>( more</w:t>
-            </w:r>
-            <w:proofErr w:type="gramEnd"/>
-            <w:r>
-              <w:rPr>
-                <w:lang w:val="en-US"/>
-              </w:rPr>
-              <w:t xml:space="preserve">  </w:t>
+            <w:r>
+              <w:t xml:space="preserve">Few-Shot ( more  </w:t>
             </w:r>
             <w:proofErr w:type="spellStart"/>
-            <w:proofErr w:type="gramStart"/>
-            <w:r>
-              <w:rPr>
-                <w:lang w:val="en-US"/>
-              </w:rPr>
+            <w:r>
               <w:t>that</w:t>
             </w:r>
             <w:proofErr w:type="spellEnd"/>
-            <w:proofErr w:type="gramEnd"/>
-            <w:r>
-              <w:rPr>
-                <w:lang w:val="en-US"/>
-              </w:rPr>
+            <w:r>
               <w:t xml:space="preserve"> 1 examples)</w:t>
             </w:r>
           </w:p>
@@ -4177,14 +3167,8 @@
           <w:p>
             <w:pPr>
               <w:jc w:val="center"/>
-              <w:rPr>
-                <w:lang w:val="en-US"/>
-              </w:rPr>
-            </w:pPr>
-            <w:r>
-              <w:rPr>
-                <w:lang w:val="en-US"/>
-              </w:rPr>
+            </w:pPr>
+            <w:r>
               <w:lastRenderedPageBreak/>
               <w:t>19:52</w:t>
             </w:r>
@@ -4192,44 +3176,28 @@
           <w:p>
             <w:pPr>
               <w:jc w:val="center"/>
-              <w:rPr>
-                <w:lang w:val="en-US"/>
-              </w:rPr>
-            </w:pPr>
-          </w:p>
-          <w:p>
-            <w:pPr>
-              <w:jc w:val="center"/>
-              <w:rPr>
-                <w:lang w:val="en-US"/>
-              </w:rPr>
+            </w:pPr>
+          </w:p>
+          <w:p>
+            <w:pPr>
+              <w:jc w:val="center"/>
             </w:pPr>
             <w:r>
               <w:rPr>
                 <w:b/>
                 <w:bCs/>
-                <w:lang w:val="en-US"/>
               </w:rPr>
               <w:t>Record</w:t>
             </w:r>
             <w:r>
-              <w:rPr>
-                <w:lang w:val="en-US"/>
-              </w:rPr>
               <w:t>:</w:t>
             </w:r>
           </w:p>
           <w:p>
             <w:pPr>
               <w:jc w:val="center"/>
-              <w:rPr>
-                <w:lang w:val="en-US"/>
-              </w:rPr>
-            </w:pPr>
-            <w:r>
-              <w:rPr>
-                <w:lang w:val="en-US"/>
-              </w:rPr>
+            </w:pPr>
+            <w:r>
               <w:t>02:19:35</w:t>
             </w:r>
           </w:p>
@@ -4241,14 +3209,8 @@
           <w:p>
             <w:pPr>
               <w:jc w:val="center"/>
-              <w:rPr>
-                <w:lang w:val="en-US"/>
-              </w:rPr>
-            </w:pPr>
-            <w:r>
-              <w:rPr>
-                <w:lang w:val="en-US"/>
-              </w:rPr>
+            </w:pPr>
+            <w:r>
               <w:t xml:space="preserve">Iterative  </w:t>
             </w:r>
           </w:p>
@@ -4259,25 +3221,11 @@
             <w:gridSpan w:val="2"/>
           </w:tcPr>
           <w:p>
-            <w:pPr>
-              <w:rPr>
-                <w:lang w:val="en-US"/>
-              </w:rPr>
-            </w:pPr>
-            <w:r>
-              <w:rPr>
-                <w:lang w:val="en-US"/>
-              </w:rPr>
+            <w:r>
               <w:t>The iterative or expansive strategy involves prompting the LLM with follow-up prompts based on the output of an initial prompt.</w:t>
             </w:r>
           </w:p>
-          <w:p>
-            <w:pPr>
-              <w:rPr>
-                <w:lang w:val="en-US"/>
-              </w:rPr>
-            </w:pPr>
-          </w:p>
+          <w:p/>
           <w:p>
             <w:pPr>
               <w:pStyle w:val="ListParagraph"/>
@@ -4285,14 +3233,8 @@
                 <w:ilvl w:val="0"/>
                 <w:numId w:val="1"/>
               </w:numPr>
-              <w:rPr>
-                <w:lang w:val="en-US"/>
-              </w:rPr>
-            </w:pPr>
-            <w:r>
-              <w:rPr>
-                <w:lang w:val="en-US"/>
-              </w:rPr>
+            </w:pPr>
+            <w:r>
               <w:t>Up-Front Iterations (Requests with Step-by-Step scenario of dialog)</w:t>
             </w:r>
           </w:p>
@@ -4303,14 +3245,8 @@
                 <w:ilvl w:val="0"/>
                 <w:numId w:val="1"/>
               </w:numPr>
-              <w:rPr>
-                <w:lang w:val="en-US"/>
-              </w:rPr>
-            </w:pPr>
-            <w:r>
-              <w:rPr>
-                <w:lang w:val="en-US"/>
-              </w:rPr>
+            </w:pPr>
+            <w:r>
               <w:t>On-Going Iterations (The regular requests to AI)</w:t>
             </w:r>
           </w:p>
@@ -4410,14 +3346,8 @@
           <w:p>
             <w:pPr>
               <w:jc w:val="center"/>
-              <w:rPr>
-                <w:lang w:val="en-US"/>
-              </w:rPr>
-            </w:pPr>
-            <w:r>
-              <w:rPr>
-                <w:lang w:val="en-US"/>
-              </w:rPr>
+            </w:pPr>
+            <w:r>
               <w:lastRenderedPageBreak/>
               <w:t>19:58</w:t>
             </w:r>
@@ -4428,43 +3358,29 @@
               <w:rPr>
                 <w:b/>
                 <w:bCs/>
-                <w:lang w:val="en-US"/>
-              </w:rPr>
-            </w:pPr>
-          </w:p>
-          <w:p>
-            <w:pPr>
-              <w:jc w:val="center"/>
-              <w:rPr>
-                <w:lang w:val="en-US"/>
-              </w:rPr>
+              </w:rPr>
+            </w:pPr>
+          </w:p>
+          <w:p>
+            <w:pPr>
+              <w:jc w:val="center"/>
             </w:pPr>
             <w:r>
               <w:rPr>
                 <w:b/>
                 <w:bCs/>
-                <w:lang w:val="en-US"/>
               </w:rPr>
               <w:t>Record</w:t>
             </w:r>
             <w:r>
-              <w:rPr>
-                <w:lang w:val="en-US"/>
-              </w:rPr>
               <w:t>:</w:t>
             </w:r>
           </w:p>
           <w:p>
             <w:pPr>
               <w:jc w:val="center"/>
-              <w:rPr>
-                <w:lang w:val="en-US"/>
-              </w:rPr>
-            </w:pPr>
-            <w:r>
-              <w:rPr>
-                <w:lang w:val="en-US"/>
-              </w:rPr>
+            </w:pPr>
+            <w:r>
               <w:t>02:26:15</w:t>
             </w:r>
           </w:p>
@@ -4476,14 +3392,8 @@
           <w:p>
             <w:pPr>
               <w:jc w:val="center"/>
-              <w:rPr>
-                <w:lang w:val="en-US"/>
-              </w:rPr>
-            </w:pPr>
-            <w:r>
-              <w:rPr>
-                <w:lang w:val="en-US"/>
-              </w:rPr>
+            </w:pPr>
+            <w:r>
               <w:t>Chain-of-Thought</w:t>
             </w:r>
           </w:p>
@@ -4494,15 +3404,7 @@
             <w:gridSpan w:val="2"/>
           </w:tcPr>
           <w:p>
-            <w:pPr>
-              <w:rPr>
-                <w:lang w:val="en-US"/>
-              </w:rPr>
-            </w:pPr>
-            <w:r>
-              <w:rPr>
-                <w:lang w:val="en-US"/>
-              </w:rPr>
+            <w:r>
               <w:t>Chain of Thought Prompting is a way to ask better questions (and get better results) with Al.</w:t>
             </w:r>
           </w:p>
@@ -4511,14 +3413,12 @@
               <w:rPr>
                 <w:b/>
                 <w:bCs/>
-                <w:lang w:val="en-US"/>
               </w:rPr>
             </w:pPr>
             <w:r>
               <w:rPr>
                 <w:b/>
                 <w:bCs/>
-                <w:lang w:val="en-US"/>
               </w:rPr>
               <w:t>I teach the AI how to</w:t>
             </w:r>
@@ -4526,7 +3426,6 @@
               <w:rPr>
                 <w:b/>
                 <w:bCs/>
-                <w:lang w:val="en-US"/>
               </w:rPr>
               <w:t xml:space="preserve"> tel</w:t>
             </w:r>
@@ -4534,7 +3433,6 @@
               <w:rPr>
                 <w:b/>
                 <w:bCs/>
-                <w:lang w:val="en-US"/>
               </w:rPr>
               <w:t>.</w:t>
             </w:r>
@@ -4635,36 +3533,23 @@
           <w:p>
             <w:pPr>
               <w:jc w:val="center"/>
-              <w:rPr>
-                <w:lang w:val="en-US"/>
-              </w:rPr>
             </w:pPr>
             <w:r>
               <w:rPr>
                 <w:b/>
                 <w:bCs/>
-                <w:lang w:val="en-US"/>
               </w:rPr>
               <w:t>Record</w:t>
             </w:r>
             <w:r>
-              <w:rPr>
-                <w:lang w:val="en-US"/>
-              </w:rPr>
               <w:t>:</w:t>
             </w:r>
           </w:p>
           <w:p>
             <w:pPr>
               <w:jc w:val="center"/>
-              <w:rPr>
-                <w:lang w:val="en-US"/>
-              </w:rPr>
-            </w:pPr>
-            <w:r>
-              <w:rPr>
-                <w:lang w:val="en-US"/>
-              </w:rPr>
+            </w:pPr>
+            <w:r>
               <w:t>03:30:35</w:t>
             </w:r>
           </w:p>
@@ -4676,31 +3561,16 @@
           <w:p>
             <w:pPr>
               <w:jc w:val="center"/>
-              <w:rPr>
-                <w:lang w:val="en-US"/>
-              </w:rPr>
-            </w:pPr>
-            <w:r>
-              <w:t>The Python Package Index </w:t>
-            </w:r>
-            <w:r>
-              <w:rPr>
-                <w:lang w:val="en-US"/>
-              </w:rPr>
-              <w:t>(</w:t>
+            </w:pPr>
+            <w:r>
+              <w:t>The Python Package Index (</w:t>
             </w:r>
             <w:proofErr w:type="spellStart"/>
             <w:r>
-              <w:rPr>
-                <w:lang w:val="en-US"/>
-              </w:rPr>
               <w:t>PyPI</w:t>
             </w:r>
             <w:proofErr w:type="spellEnd"/>
             <w:r>
-              <w:rPr>
-                <w:lang w:val="en-US"/>
-              </w:rPr>
               <w:t>)</w:t>
             </w:r>
           </w:p>
@@ -4711,15 +3581,7 @@
             <w:gridSpan w:val="2"/>
           </w:tcPr>
           <w:p>
-            <w:pPr>
-              <w:rPr>
-                <w:lang w:val="en-US"/>
-              </w:rPr>
-            </w:pPr>
-            <w:r>
-              <w:rPr>
-                <w:lang w:val="en-US"/>
-              </w:rPr>
+            <w:r>
               <w:t>Python library. For working with Python (NPM for PYTHON)</w:t>
             </w:r>
           </w:p>
@@ -4749,36 +3611,23 @@
           <w:p>
             <w:pPr>
               <w:jc w:val="center"/>
-              <w:rPr>
-                <w:lang w:val="en-US"/>
-              </w:rPr>
             </w:pPr>
             <w:r>
               <w:rPr>
                 <w:b/>
                 <w:bCs/>
-                <w:lang w:val="en-US"/>
               </w:rPr>
               <w:t>Record</w:t>
             </w:r>
             <w:r>
-              <w:rPr>
-                <w:lang w:val="en-US"/>
-              </w:rPr>
               <w:t>:</w:t>
             </w:r>
           </w:p>
           <w:p>
             <w:pPr>
               <w:jc w:val="center"/>
-              <w:rPr>
-                <w:lang w:val="en-US"/>
-              </w:rPr>
-            </w:pPr>
-            <w:r>
-              <w:rPr>
-                <w:lang w:val="en-US"/>
-              </w:rPr>
+            </w:pPr>
+            <w:r>
               <w:t>03:29:50</w:t>
             </w:r>
           </w:p>
@@ -4793,161 +3642,87 @@
               <w:rPr>
                 <w:i/>
                 <w:iCs/>
-                <w:lang w:val="en-US"/>
-              </w:rPr>
-            </w:pPr>
-            <w:proofErr w:type="gramStart"/>
+              </w:rPr>
+            </w:pPr>
             <w:r>
               <w:rPr>
                 <w:i/>
                 <w:iCs/>
-                <w:lang w:val="en-US"/>
-              </w:rPr>
-              <w:t>pip</w:t>
-            </w:r>
-            <w:proofErr w:type="gramEnd"/>
+              </w:rPr>
+              <w:t xml:space="preserve">pip install </w:t>
+            </w:r>
+            <w:proofErr w:type="spellStart"/>
             <w:r>
               <w:rPr>
                 <w:i/>
                 <w:iCs/>
-                <w:lang w:val="en-US"/>
-              </w:rPr>
-              <w:t xml:space="preserve"> install </w:t>
-            </w:r>
-            <w:proofErr w:type="spellStart"/>
-            <w:r>
+              </w:rPr>
+              <w:t>operin</w:t>
+            </w:r>
+            <w:proofErr w:type="spellEnd"/>
+          </w:p>
+        </w:tc>
+        <w:tc>
+          <w:tcPr>
+            <w:tcW w:w="2614" w:type="dxa"/>
+            <w:gridSpan w:val="2"/>
+          </w:tcPr>
+          <w:p>
+            <w:r>
+              <w:t>Package for python for working with AI</w:t>
+            </w:r>
+          </w:p>
+          <w:p>
+            <w:r>
+              <w:t xml:space="preserve">Installation: </w:t>
+            </w:r>
+          </w:p>
+          <w:p>
+            <w:pPr>
               <w:rPr>
                 <w:i/>
                 <w:iCs/>
-                <w:lang w:val="en-US"/>
-              </w:rPr>
-              <w:t>operin</w:t>
-            </w:r>
-            <w:proofErr w:type="spellEnd"/>
-          </w:p>
-        </w:tc>
-        <w:tc>
-          <w:tcPr>
-            <w:tcW w:w="2614" w:type="dxa"/>
-            <w:gridSpan w:val="2"/>
-          </w:tcPr>
-          <w:p>
-            <w:pPr>
-              <w:rPr>
-                <w:lang w:val="en-US"/>
-              </w:rPr>
-            </w:pPr>
-            <w:r>
-              <w:rPr>
-                <w:lang w:val="en-US"/>
-              </w:rPr>
-              <w:t>Package for python for working with AI</w:t>
-            </w:r>
-          </w:p>
-          <w:p>
-            <w:pPr>
-              <w:rPr>
-                <w:lang w:val="en-US"/>
-              </w:rPr>
-            </w:pPr>
-            <w:r>
-              <w:rPr>
-                <w:lang w:val="en-US"/>
-              </w:rPr>
-              <w:t xml:space="preserve">Installation: </w:t>
-            </w:r>
-          </w:p>
-          <w:p>
-            <w:pPr>
+              </w:rPr>
+            </w:pPr>
+            <w:r>
               <w:rPr>
                 <w:i/>
                 <w:iCs/>
-                <w:lang w:val="en-US"/>
-              </w:rPr>
-            </w:pPr>
+              </w:rPr>
+              <w:t>"</w:t>
+            </w:r>
             <w:r>
               <w:rPr>
                 <w:i/>
                 <w:iCs/>
-                <w:lang w:val="en-US"/>
-              </w:rPr>
-              <w:t>"</w:t>
-            </w:r>
-            <w:proofErr w:type="gramStart"/>
+              </w:rPr>
+              <w:t xml:space="preserve">pip install </w:t>
+            </w:r>
+            <w:proofErr w:type="spellStart"/>
             <w:r>
               <w:rPr>
                 <w:i/>
                 <w:iCs/>
-                <w:lang w:val="en-US"/>
-              </w:rPr>
-              <w:t>pip</w:t>
-            </w:r>
-            <w:proofErr w:type="gramEnd"/>
+              </w:rPr>
+              <w:t>openai</w:t>
+            </w:r>
+            <w:proofErr w:type="spellEnd"/>
             <w:r>
               <w:rPr>
                 <w:i/>
                 <w:iCs/>
-                <w:lang w:val="en-US"/>
-              </w:rPr>
-              <w:t xml:space="preserve"> install </w:t>
-            </w:r>
-            <w:proofErr w:type="spellStart"/>
-            <w:r>
-              <w:rPr>
-                <w:i/>
-                <w:iCs/>
-                <w:lang w:val="en-US"/>
-              </w:rPr>
-              <w:t>openai</w:t>
-            </w:r>
-            <w:proofErr w:type="spellEnd"/>
-            <w:r>
-              <w:rPr>
-                <w:i/>
-                <w:iCs/>
-                <w:lang w:val="en-US"/>
               </w:rPr>
               <w:t>"</w:t>
             </w:r>
           </w:p>
           <w:p>
-            <w:pPr>
-              <w:rPr>
-                <w:lang w:val="en-US"/>
-              </w:rPr>
-            </w:pPr>
-            <w:r>
-              <w:rPr>
-                <w:lang w:val="en-US"/>
-              </w:rPr>
+            <w:r>
               <w:t>Into the package:</w:t>
             </w:r>
           </w:p>
           <w:p>
-            <w:pPr>
-              <w:rPr>
-                <w:lang w:val="en-US"/>
-              </w:rPr>
-            </w:pPr>
-            <w:r>
-              <w:rPr>
-                <w:lang w:val="en-US"/>
-              </w:rPr>
-              <w:t xml:space="preserve">OpenAI – include </w:t>
-            </w:r>
-            <w:proofErr w:type="gramStart"/>
-            <w:r>
-              <w:rPr>
-                <w:lang w:val="en-US"/>
-              </w:rPr>
-              <w:t>the all</w:t>
-            </w:r>
-            <w:proofErr w:type="gramEnd"/>
-            <w:r>
-              <w:rPr>
-                <w:lang w:val="en-US"/>
-              </w:rPr>
-              <w:t xml:space="preserve"> functions for working with AI</w:t>
+            <w:r>
+              <w:t>OpenAI – include the all functions for working with AI</w:t>
             </w:r>
           </w:p>
         </w:tc>
@@ -5047,37 +3822,24 @@
           <w:p>
             <w:pPr>
               <w:jc w:val="center"/>
-              <w:rPr>
-                <w:lang w:val="en-US"/>
-              </w:rPr>
             </w:pPr>
             <w:r>
               <w:rPr>
                 <w:b/>
                 <w:bCs/>
-                <w:lang w:val="en-US"/>
               </w:rPr>
               <w:lastRenderedPageBreak/>
               <w:t>Record</w:t>
             </w:r>
             <w:r>
-              <w:rPr>
-                <w:lang w:val="en-US"/>
-              </w:rPr>
               <w:t>:</w:t>
             </w:r>
           </w:p>
           <w:p>
             <w:pPr>
               <w:jc w:val="center"/>
-              <w:rPr>
-                <w:lang w:val="en-US"/>
-              </w:rPr>
-            </w:pPr>
-            <w:r>
-              <w:rPr>
-                <w:lang w:val="en-US"/>
-              </w:rPr>
+            </w:pPr>
+            <w:r>
               <w:t>03:33:20</w:t>
             </w:r>
           </w:p>
@@ -5090,14 +3852,8 @@
           <w:p>
             <w:pPr>
               <w:jc w:val="center"/>
-              <w:rPr>
-                <w:lang w:val="en-US"/>
-              </w:rPr>
-            </w:pPr>
-            <w:r>
-              <w:rPr>
-                <w:lang w:val="en-US"/>
-              </w:rPr>
+            </w:pPr>
+            <w:r>
               <w:t>Roles</w:t>
             </w:r>
           </w:p>
@@ -5107,15 +3863,7 @@
             <w:tcW w:w="1307" w:type="dxa"/>
           </w:tcPr>
           <w:p>
-            <w:pPr>
-              <w:rPr>
-                <w:lang w:val="en-US"/>
-              </w:rPr>
-            </w:pPr>
-            <w:r>
-              <w:rPr>
-                <w:lang w:val="en-US"/>
-              </w:rPr>
+            <w:r>
               <w:t>System</w:t>
             </w:r>
           </w:p>
@@ -5125,15 +3873,7 @@
             <w:tcW w:w="1307" w:type="dxa"/>
           </w:tcPr>
           <w:p>
-            <w:pPr>
-              <w:rPr>
-                <w:lang w:val="en-US"/>
-              </w:rPr>
-            </w:pPr>
-            <w:r>
-              <w:rPr>
-                <w:lang w:val="en-US"/>
-              </w:rPr>
+            <w:r>
               <w:t>Using once on the start of program</w:t>
             </w:r>
           </w:p>
@@ -5147,7 +3887,6 @@
               <w:jc w:val="center"/>
               <w:rPr>
                 <w:noProof/>
-                <w:lang w:val="en-US"/>
               </w:rPr>
             </w:pPr>
             <w:r>
@@ -5238,7 +3977,6 @@
               <w:rPr>
                 <w:b/>
                 <w:bCs/>
-                <w:lang w:val="en-US"/>
               </w:rPr>
             </w:pPr>
           </w:p>
@@ -5251,9 +3989,6 @@
           <w:p>
             <w:pPr>
               <w:jc w:val="center"/>
-              <w:rPr>
-                <w:lang w:val="en-US"/>
-              </w:rPr>
             </w:pPr>
           </w:p>
         </w:tc>
@@ -5262,15 +3997,7 @@
             <w:tcW w:w="1307" w:type="dxa"/>
           </w:tcPr>
           <w:p>
-            <w:pPr>
-              <w:rPr>
-                <w:lang w:val="en-US"/>
-              </w:rPr>
-            </w:pPr>
-            <w:r>
-              <w:rPr>
-                <w:lang w:val="en-US"/>
-              </w:rPr>
+            <w:r>
               <w:t>User</w:t>
             </w:r>
           </w:p>
@@ -5280,15 +4007,7 @@
             <w:tcW w:w="1307" w:type="dxa"/>
           </w:tcPr>
           <w:p>
-            <w:pPr>
-              <w:rPr>
-                <w:lang w:val="en-US"/>
-              </w:rPr>
-            </w:pPr>
-            <w:r>
-              <w:rPr>
-                <w:lang w:val="en-US"/>
-              </w:rPr>
+            <w:r>
               <w:t>User's input</w:t>
             </w:r>
           </w:p>
@@ -5322,7 +4041,6 @@
               <w:rPr>
                 <w:b/>
                 <w:bCs/>
-                <w:lang w:val="en-US"/>
               </w:rPr>
             </w:pPr>
           </w:p>
@@ -5335,9 +4053,6 @@
           <w:p>
             <w:pPr>
               <w:jc w:val="center"/>
-              <w:rPr>
-                <w:lang w:val="en-US"/>
-              </w:rPr>
             </w:pPr>
           </w:p>
         </w:tc>
@@ -5346,15 +4061,7 @@
             <w:tcW w:w="1307" w:type="dxa"/>
           </w:tcPr>
           <w:p>
-            <w:pPr>
-              <w:rPr>
-                <w:lang w:val="en-US"/>
-              </w:rPr>
-            </w:pPr>
-            <w:r>
-              <w:rPr>
-                <w:lang w:val="en-US"/>
-              </w:rPr>
+            <w:r>
               <w:t>Assistant</w:t>
             </w:r>
           </w:p>
@@ -5364,27 +4071,13 @@
             <w:tcW w:w="1307" w:type="dxa"/>
           </w:tcPr>
           <w:p>
-            <w:pPr>
-              <w:rPr>
-                <w:lang w:val="en-US"/>
-              </w:rPr>
-            </w:pPr>
-            <w:r>
-              <w:rPr>
-                <w:lang w:val="en-US"/>
-              </w:rPr>
+            <w:r>
               <w:t>AI</w:t>
             </w:r>
             <w:r>
-              <w:rPr>
-                <w:lang w:val="en-US"/>
-              </w:rPr>
               <w:t>'s</w:t>
             </w:r>
             <w:r>
-              <w:rPr>
-                <w:lang w:val="en-US"/>
-              </w:rPr>
               <w:t xml:space="preserve"> output</w:t>
             </w:r>
           </w:p>
@@ -5415,36 +4108,23 @@
           <w:p>
             <w:pPr>
               <w:jc w:val="center"/>
-              <w:rPr>
-                <w:lang w:val="en-US"/>
-              </w:rPr>
             </w:pPr>
             <w:r>
               <w:rPr>
                 <w:b/>
                 <w:bCs/>
-                <w:lang w:val="en-US"/>
               </w:rPr>
               <w:t>Record</w:t>
             </w:r>
             <w:r>
-              <w:rPr>
-                <w:lang w:val="en-US"/>
-              </w:rPr>
               <w:t>:</w:t>
             </w:r>
           </w:p>
           <w:p>
             <w:pPr>
               <w:jc w:val="center"/>
-              <w:rPr>
-                <w:lang w:val="en-US"/>
-              </w:rPr>
-            </w:pPr>
-            <w:r>
-              <w:rPr>
-                <w:lang w:val="en-US"/>
-              </w:rPr>
+            </w:pPr>
+            <w:r>
               <w:t>03:41:20</w:t>
             </w:r>
           </w:p>
@@ -5457,42 +4137,24 @@
           <w:p>
             <w:pPr>
               <w:jc w:val="center"/>
-              <w:rPr>
-                <w:lang w:val="en-US"/>
-              </w:rPr>
-            </w:pPr>
-            <w:r>
-              <w:rPr>
-                <w:lang w:val="en-US"/>
-              </w:rPr>
+            </w:pPr>
+            <w:r>
               <w:t>Request</w:t>
             </w:r>
           </w:p>
           <w:p>
             <w:pPr>
               <w:jc w:val="center"/>
-              <w:rPr>
-                <w:lang w:val="en-US"/>
-              </w:rPr>
-            </w:pPr>
-            <w:r>
-              <w:rPr>
-                <w:lang w:val="en-US"/>
-              </w:rPr>
+            </w:pPr>
+            <w:r>
               <w:t xml:space="preserve"> And</w:t>
             </w:r>
           </w:p>
           <w:p>
             <w:pPr>
               <w:jc w:val="center"/>
-              <w:rPr>
-                <w:lang w:val="en-US"/>
-              </w:rPr>
-            </w:pPr>
-            <w:r>
-              <w:rPr>
-                <w:lang w:val="en-US"/>
-              </w:rPr>
+            </w:pPr>
+            <w:r>
               <w:t>Response</w:t>
             </w:r>
           </w:p>
@@ -5506,14 +4168,8 @@
           <w:p>
             <w:pPr>
               <w:jc w:val="center"/>
-              <w:rPr>
-                <w:lang w:val="en-US"/>
-              </w:rPr>
-            </w:pPr>
-            <w:r>
-              <w:rPr>
-                <w:lang w:val="en-US"/>
-              </w:rPr>
+            </w:pPr>
+            <w:r>
               <w:t>Request</w:t>
             </w:r>
           </w:p>
@@ -5617,7 +4273,6 @@
               <w:rPr>
                 <w:b/>
                 <w:bCs/>
-                <w:lang w:val="en-US"/>
               </w:rPr>
             </w:pPr>
           </w:p>
@@ -5630,9 +4285,6 @@
           <w:p>
             <w:pPr>
               <w:jc w:val="center"/>
-              <w:rPr>
-                <w:lang w:val="en-US"/>
-              </w:rPr>
             </w:pPr>
           </w:p>
         </w:tc>
@@ -5645,14 +4297,8 @@
           <w:p>
             <w:pPr>
               <w:jc w:val="center"/>
-              <w:rPr>
-                <w:lang w:val="en-US"/>
-              </w:rPr>
-            </w:pPr>
-            <w:r>
-              <w:rPr>
-                <w:lang w:val="en-US"/>
-              </w:rPr>
+            </w:pPr>
+            <w:r>
               <w:t>Response</w:t>
             </w:r>
           </w:p>
@@ -5755,37 +4401,40 @@
               <w:rPr>
                 <w:b/>
                 <w:bCs/>
-                <w:lang w:val="en-US"/>
-              </w:rPr>
-            </w:pPr>
-          </w:p>
-        </w:tc>
-        <w:tc>
-          <w:tcPr>
-            <w:tcW w:w="2614" w:type="dxa"/>
-          </w:tcPr>
-          <w:p>
-            <w:pPr>
-              <w:jc w:val="center"/>
-              <w:rPr>
-                <w:lang w:val="en-US"/>
-              </w:rPr>
-            </w:pPr>
+              </w:rPr>
+            </w:pPr>
+          </w:p>
+        </w:tc>
+        <w:tc>
+          <w:tcPr>
+            <w:tcW w:w="2614" w:type="dxa"/>
+          </w:tcPr>
+          <w:p>
+            <w:pPr>
+              <w:jc w:val="center"/>
+            </w:pPr>
+            <w:r>
+              <w:t>OpenAI</w:t>
+            </w:r>
           </w:p>
         </w:tc>
         <w:tc>
           <w:tcPr>
             <w:tcW w:w="2614" w:type="dxa"/>
             <w:gridSpan w:val="2"/>
-            <w:vAlign w:val="center"/>
-          </w:tcPr>
-          <w:p>
-            <w:pPr>
-              <w:jc w:val="center"/>
-              <w:rPr>
-                <w:lang w:val="en-US"/>
-              </w:rPr>
-            </w:pPr>
+          </w:tcPr>
+          <w:p>
+            <w:pPr>
+              <w:jc w:val="center"/>
+            </w:pPr>
+            <w:hyperlink r:id="rId30" w:history="1">
+              <w:r>
+                <w:rPr>
+                  <w:rStyle w:val="Hyperlink"/>
+                </w:rPr>
+                <w:t>AI manager workspace</w:t>
+              </w:r>
+            </w:hyperlink>
           </w:p>
         </w:tc>
         <w:tc>
@@ -5816,21 +4465,17 @@
               <w:rPr>
                 <w:b/>
                 <w:bCs/>
-                <w:lang w:val="en-US"/>
-              </w:rPr>
-            </w:pPr>
-          </w:p>
-        </w:tc>
-        <w:tc>
-          <w:tcPr>
-            <w:tcW w:w="2614" w:type="dxa"/>
-          </w:tcPr>
-          <w:p>
-            <w:pPr>
-              <w:jc w:val="center"/>
-              <w:rPr>
-                <w:lang w:val="en-US"/>
-              </w:rPr>
+              </w:rPr>
+            </w:pPr>
+          </w:p>
+        </w:tc>
+        <w:tc>
+          <w:tcPr>
+            <w:tcW w:w="2614" w:type="dxa"/>
+          </w:tcPr>
+          <w:p>
+            <w:pPr>
+              <w:jc w:val="center"/>
             </w:pPr>
           </w:p>
         </w:tc>
@@ -5838,14 +4483,10 @@
           <w:tcPr>
             <w:tcW w:w="2614" w:type="dxa"/>
             <w:gridSpan w:val="2"/>
-            <w:vAlign w:val="center"/>
-          </w:tcPr>
-          <w:p>
-            <w:pPr>
-              <w:jc w:val="center"/>
-              <w:rPr>
-                <w:lang w:val="en-US"/>
-              </w:rPr>
+          </w:tcPr>
+          <w:p>
+            <w:pPr>
+              <w:jc w:val="center"/>
             </w:pPr>
           </w:p>
         </w:tc>
@@ -5877,21 +4518,17 @@
               <w:rPr>
                 <w:b/>
                 <w:bCs/>
-                <w:lang w:val="en-US"/>
-              </w:rPr>
-            </w:pPr>
-          </w:p>
-        </w:tc>
-        <w:tc>
-          <w:tcPr>
-            <w:tcW w:w="2614" w:type="dxa"/>
-          </w:tcPr>
-          <w:p>
-            <w:pPr>
-              <w:jc w:val="center"/>
-              <w:rPr>
-                <w:lang w:val="en-US"/>
-              </w:rPr>
+              </w:rPr>
+            </w:pPr>
+          </w:p>
+        </w:tc>
+        <w:tc>
+          <w:tcPr>
+            <w:tcW w:w="2614" w:type="dxa"/>
+          </w:tcPr>
+          <w:p>
+            <w:pPr>
+              <w:jc w:val="center"/>
             </w:pPr>
           </w:p>
         </w:tc>
@@ -5899,14 +4536,10 @@
           <w:tcPr>
             <w:tcW w:w="2614" w:type="dxa"/>
             <w:gridSpan w:val="2"/>
-            <w:vAlign w:val="center"/>
-          </w:tcPr>
-          <w:p>
-            <w:pPr>
-              <w:jc w:val="center"/>
-              <w:rPr>
-                <w:lang w:val="en-US"/>
-              </w:rPr>
+          </w:tcPr>
+          <w:p>
+            <w:pPr>
+              <w:jc w:val="center"/>
             </w:pPr>
           </w:p>
         </w:tc>
@@ -5938,21 +4571,17 @@
               <w:rPr>
                 <w:b/>
                 <w:bCs/>
-                <w:lang w:val="en-US"/>
-              </w:rPr>
-            </w:pPr>
-          </w:p>
-        </w:tc>
-        <w:tc>
-          <w:tcPr>
-            <w:tcW w:w="2614" w:type="dxa"/>
-          </w:tcPr>
-          <w:p>
-            <w:pPr>
-              <w:jc w:val="center"/>
-              <w:rPr>
-                <w:lang w:val="en-US"/>
-              </w:rPr>
+              </w:rPr>
+            </w:pPr>
+          </w:p>
+        </w:tc>
+        <w:tc>
+          <w:tcPr>
+            <w:tcW w:w="2614" w:type="dxa"/>
+          </w:tcPr>
+          <w:p>
+            <w:pPr>
+              <w:jc w:val="center"/>
             </w:pPr>
           </w:p>
         </w:tc>
@@ -5960,14 +4589,10 @@
           <w:tcPr>
             <w:tcW w:w="2614" w:type="dxa"/>
             <w:gridSpan w:val="2"/>
-            <w:vAlign w:val="center"/>
-          </w:tcPr>
-          <w:p>
-            <w:pPr>
-              <w:jc w:val="center"/>
-              <w:rPr>
-                <w:lang w:val="en-US"/>
-              </w:rPr>
+          </w:tcPr>
+          <w:p>
+            <w:pPr>
+              <w:jc w:val="center"/>
             </w:pPr>
           </w:p>
         </w:tc>
@@ -5986,33 +4611,13 @@
         </w:tc>
       </w:tr>
     </w:tbl>
+    <w:p/>
     <w:p>
-      <w:pPr>
-        <w:rPr>
-          <w:lang w:val="en-US"/>
-        </w:rPr>
-      </w:pPr>
-    </w:p>
-    <w:p>
-      <w:pPr>
-        <w:rPr>
-          <w:lang w:val="en-US"/>
-        </w:rPr>
-      </w:pPr>
       <w:r>
-        <w:rPr>
-          <w:lang w:val="en-US"/>
-        </w:rPr>
         <w:br w:type="page"/>
       </w:r>
     </w:p>
-    <w:p>
-      <w:pPr>
-        <w:rPr>
-          <w:lang w:val="en-US"/>
-        </w:rPr>
-      </w:pPr>
-    </w:p>
+    <w:p/>
     <w:p/>
     <w:sectPr>
       <w:pgSz w:w="16838" w:h="11906" w:orient="landscape"/>
@@ -6153,7 +4758,7 @@
         <w:kern w:val="2"/>
         <w:sz w:val="22"/>
         <w:szCs w:val="22"/>
-        <w:lang w:eastAsia="en-US" w:bidi="he-IL"/>
+        <w:lang w:val="en-US" w:eastAsia="en-US" w:bidi="he-IL"/>
         <w14:ligatures w14:val="standardContextual"/>
       </w:rPr>
     </w:rPrDefault>
@@ -7081,6 +5686,29 @@
       </w:tblBorders>
     </w:tblPr>
   </w:style>
+  <w:style w:type="character" w:styleId="Hyperlink">
+    <w:name w:val="Hyperlink"/>
+    <w:basedOn w:val="DefaultParagraphFont"/>
+    <w:uiPriority w:val="99"/>
+    <w:unhideWhenUsed/>
+    <w:rsid w:val="00220D75"/>
+    <w:rPr>
+      <w:color w:val="467886" w:themeColor="hyperlink"/>
+      <w:u w:val="single"/>
+    </w:rPr>
+  </w:style>
+  <w:style w:type="character" w:styleId="UnresolvedMention">
+    <w:name w:val="Unresolved Mention"/>
+    <w:basedOn w:val="DefaultParagraphFont"/>
+    <w:uiPriority w:val="99"/>
+    <w:semiHidden/>
+    <w:unhideWhenUsed/>
+    <w:rsid w:val="00220D75"/>
+    <w:rPr>
+      <w:color w:val="605E5C"/>
+      <w:shd w:val="clear" w:color="auto" w:fill="E1DFDD"/>
+    </w:rPr>
+  </w:style>
 </w:styles>
 </file>
 

</xml_diff>

<commit_message>
MCP services lesson 05
</commit_message>
<xml_diff>
--- a/AI descriptions.docx
+++ b/AI descriptions.docx
@@ -4617,7 +4617,1033 @@
         <w:br w:type="page"/>
       </w:r>
     </w:p>
+    <w:p>
+      <w:pPr>
+        <w:jc w:val="center"/>
+      </w:pPr>
+      <w:r>
+        <w:lastRenderedPageBreak/>
+        <w:t>Lesson_04</w:t>
+      </w:r>
+    </w:p>
+    <w:p>
+      <w:pPr>
+        <w:jc w:val="center"/>
+      </w:pPr>
+    </w:p>
     <w:p/>
+    <w:tbl>
+      <w:tblPr>
+        <w:tblStyle w:val="TableGrid"/>
+        <w:tblW w:w="0" w:type="auto"/>
+        <w:tblLook w:val="04A0" w:firstRow="1" w:lastRow="0" w:firstColumn="1" w:lastColumn="0" w:noHBand="0" w:noVBand="1"/>
+      </w:tblPr>
+      <w:tblGrid>
+        <w:gridCol w:w="2064"/>
+        <w:gridCol w:w="2149"/>
+        <w:gridCol w:w="2161"/>
+        <w:gridCol w:w="71"/>
+        <w:gridCol w:w="8943"/>
+      </w:tblGrid>
+      <w:tr>
+        <w:tc>
+          <w:tcPr>
+            <w:tcW w:w="2064" w:type="dxa"/>
+          </w:tcPr>
+          <w:p>
+            <w:pPr>
+              <w:jc w:val="center"/>
+            </w:pPr>
+            <w:r>
+              <w:t>Time</w:t>
+            </w:r>
+          </w:p>
+        </w:tc>
+        <w:tc>
+          <w:tcPr>
+            <w:tcW w:w="2149" w:type="dxa"/>
+          </w:tcPr>
+          <w:p>
+            <w:pPr>
+              <w:jc w:val="center"/>
+            </w:pPr>
+            <w:r>
+              <w:t>Concept</w:t>
+            </w:r>
+          </w:p>
+        </w:tc>
+        <w:tc>
+          <w:tcPr>
+            <w:tcW w:w="2232" w:type="dxa"/>
+            <w:gridSpan w:val="2"/>
+          </w:tcPr>
+          <w:p>
+            <w:pPr>
+              <w:jc w:val="center"/>
+            </w:pPr>
+            <w:r>
+              <w:t>Description</w:t>
+            </w:r>
+          </w:p>
+        </w:tc>
+        <w:tc>
+          <w:tcPr>
+            <w:tcW w:w="8943" w:type="dxa"/>
+          </w:tcPr>
+          <w:p>
+            <w:pPr>
+              <w:jc w:val="center"/>
+            </w:pPr>
+            <w:r>
+              <w:t>Examples</w:t>
+            </w:r>
+          </w:p>
+          <w:p>
+            <w:pPr>
+              <w:jc w:val="center"/>
+            </w:pPr>
+          </w:p>
+        </w:tc>
+      </w:tr>
+      <w:tr>
+        <w:tc>
+          <w:tcPr>
+            <w:tcW w:w="2064" w:type="dxa"/>
+          </w:tcPr>
+          <w:p>
+            <w:pPr>
+              <w:jc w:val="center"/>
+            </w:pPr>
+            <w:r>
+              <w:t>17:34</w:t>
+            </w:r>
+          </w:p>
+        </w:tc>
+        <w:tc>
+          <w:tcPr>
+            <w:tcW w:w="2149" w:type="dxa"/>
+          </w:tcPr>
+          <w:p>
+            <w:pPr>
+              <w:jc w:val="center"/>
+            </w:pPr>
+            <w:r>
+              <w:t>Agent</w:t>
+            </w:r>
+          </w:p>
+        </w:tc>
+        <w:tc>
+          <w:tcPr>
+            <w:tcW w:w="2232" w:type="dxa"/>
+            <w:gridSpan w:val="2"/>
+          </w:tcPr>
+          <w:p>
+            <w:r>
+              <w:t>Connector between LLM And Code</w:t>
+            </w:r>
+          </w:p>
+          <w:p>
+            <w:r>
+              <w:t>Agent do what the LLM can’t do.</w:t>
+            </w:r>
+          </w:p>
+        </w:tc>
+        <w:tc>
+          <w:tcPr>
+            <w:tcW w:w="8943" w:type="dxa"/>
+          </w:tcPr>
+          <w:p>
+            <w:pPr>
+              <w:jc w:val="center"/>
+            </w:pPr>
+          </w:p>
+        </w:tc>
+      </w:tr>
+      <w:tr>
+        <w:tc>
+          <w:tcPr>
+            <w:tcW w:w="2064" w:type="dxa"/>
+          </w:tcPr>
+          <w:p>
+            <w:pPr>
+              <w:jc w:val="center"/>
+            </w:pPr>
+            <w:r>
+              <w:t>17:</w:t>
+            </w:r>
+            <w:r>
+              <w:t>50</w:t>
+            </w:r>
+          </w:p>
+        </w:tc>
+        <w:tc>
+          <w:tcPr>
+            <w:tcW w:w="2149" w:type="dxa"/>
+          </w:tcPr>
+          <w:p>
+            <w:pPr>
+              <w:jc w:val="center"/>
+            </w:pPr>
+            <w:r>
+              <w:t>Model Context Protocol (MCP) Server</w:t>
+            </w:r>
+          </w:p>
+        </w:tc>
+        <w:tc>
+          <w:tcPr>
+            <w:tcW w:w="2232" w:type="dxa"/>
+            <w:gridSpan w:val="2"/>
+          </w:tcPr>
+          <w:p>
+            <w:r>
+              <w:t xml:space="preserve">MCP </w:t>
+            </w:r>
+            <w:r>
+              <w:t>–</w:t>
+            </w:r>
+            <w:r>
+              <w:t xml:space="preserve"> Protocol</w:t>
+            </w:r>
+          </w:p>
+          <w:p>
+            <w:r>
+              <w:t xml:space="preserve">MCP </w:t>
+            </w:r>
+            <w:r>
+              <w:t>managed</w:t>
+            </w:r>
+            <w:r>
+              <w:t xml:space="preserve"> by Agent</w:t>
+            </w:r>
+          </w:p>
+        </w:tc>
+        <w:tc>
+          <w:tcPr>
+            <w:tcW w:w="8943" w:type="dxa"/>
+          </w:tcPr>
+          <w:p>
+            <w:pPr>
+              <w:jc w:val="center"/>
+            </w:pPr>
+            <w:r>
+              <w:rPr>
+                <w:noProof/>
+              </w:rPr>
+              <w:drawing>
+                <wp:inline distT="0" distB="0" distL="0" distR="0" wp14:anchorId="49513C8B" wp14:editId="2FAB9DB1">
+                  <wp:extent cx="3224663" cy="2189970"/>
+                  <wp:effectExtent l="152400" t="114300" r="109220" b="153670"/>
+                  <wp:docPr id="2033632498" name="Picture 1"/>
+                  <wp:cNvGraphicFramePr>
+                    <a:graphicFrameLocks xmlns:a="http://schemas.openxmlformats.org/drawingml/2006/main" noChangeAspect="1"/>
+                  </wp:cNvGraphicFramePr>
+                  <a:graphic xmlns:a="http://schemas.openxmlformats.org/drawingml/2006/main">
+                    <a:graphicData uri="http://schemas.openxmlformats.org/drawingml/2006/picture">
+                      <pic:pic xmlns:pic="http://schemas.openxmlformats.org/drawingml/2006/picture">
+                        <pic:nvPicPr>
+                          <pic:cNvPr id="2033632498" name=""/>
+                          <pic:cNvPicPr/>
+                        </pic:nvPicPr>
+                        <pic:blipFill>
+                          <a:blip r:embed="rId31"/>
+                          <a:stretch>
+                            <a:fillRect/>
+                          </a:stretch>
+                        </pic:blipFill>
+                        <pic:spPr>
+                          <a:xfrm>
+                            <a:off x="0" y="0"/>
+                            <a:ext cx="3229463" cy="2193230"/>
+                          </a:xfrm>
+                          <a:prstGeom prst="rect">
+                            <a:avLst/>
+                          </a:prstGeom>
+                          <a:solidFill>
+                            <a:srgbClr val="FFFFFF">
+                              <a:shade val="85000"/>
+                            </a:srgbClr>
+                          </a:solidFill>
+                          <a:ln w="88900" cap="sq">
+                            <a:solidFill>
+                              <a:srgbClr val="FFFFFF"/>
+                            </a:solidFill>
+                            <a:miter lim="800000"/>
+                          </a:ln>
+                          <a:effectLst>
+                            <a:outerShdw blurRad="55000" dist="18000" dir="5400000" algn="tl" rotWithShape="0">
+                              <a:srgbClr val="000000">
+                                <a:alpha val="40000"/>
+                              </a:srgbClr>
+                            </a:outerShdw>
+                          </a:effectLst>
+                          <a:scene3d>
+                            <a:camera prst="orthographicFront"/>
+                            <a:lightRig rig="twoPt" dir="t">
+                              <a:rot lat="0" lon="0" rev="7200000"/>
+                            </a:lightRig>
+                          </a:scene3d>
+                          <a:sp3d>
+                            <a:bevelT w="25400" h="19050"/>
+                            <a:contourClr>
+                              <a:srgbClr val="FFFFFF"/>
+                            </a:contourClr>
+                          </a:sp3d>
+                        </pic:spPr>
+                      </pic:pic>
+                    </a:graphicData>
+                  </a:graphic>
+                </wp:inline>
+              </w:drawing>
+            </w:r>
+          </w:p>
+        </w:tc>
+      </w:tr>
+      <w:tr>
+        <w:tc>
+          <w:tcPr>
+            <w:tcW w:w="2064" w:type="dxa"/>
+          </w:tcPr>
+          <w:p>
+            <w:pPr>
+              <w:jc w:val="center"/>
+            </w:pPr>
+            <w:r>
+              <w:t>18:</w:t>
+            </w:r>
+            <w:r>
+              <w:t>15</w:t>
+            </w:r>
+          </w:p>
+        </w:tc>
+        <w:tc>
+          <w:tcPr>
+            <w:tcW w:w="2149" w:type="dxa"/>
+          </w:tcPr>
+          <w:p>
+            <w:pPr>
+              <w:jc w:val="center"/>
+            </w:pPr>
+            <w:r>
+              <w:t>Creation on MCP</w:t>
+            </w:r>
+          </w:p>
+        </w:tc>
+        <w:tc>
+          <w:tcPr>
+            <w:tcW w:w="2232" w:type="dxa"/>
+            <w:gridSpan w:val="2"/>
+          </w:tcPr>
+          <w:p/>
+        </w:tc>
+        <w:tc>
+          <w:tcPr>
+            <w:tcW w:w="8943" w:type="dxa"/>
+          </w:tcPr>
+          <w:p>
+            <w:pPr>
+              <w:jc w:val="center"/>
+            </w:pPr>
+          </w:p>
+        </w:tc>
+      </w:tr>
+      <w:tr>
+        <w:tc>
+          <w:tcPr>
+            <w:tcW w:w="15388" w:type="dxa"/>
+            <w:gridSpan w:val="5"/>
+          </w:tcPr>
+          <w:p>
+            <w:pPr>
+              <w:jc w:val="center"/>
+            </w:pPr>
+            <w:r>
+              <w:t xml:space="preserve">Package to Install </w:t>
+            </w:r>
+            <w:proofErr w:type="spellStart"/>
+            <w:r>
+              <w:rPr>
+                <w:b/>
+                <w:bCs/>
+                <w:highlight w:val="yellow"/>
+              </w:rPr>
+              <w:t>npm</w:t>
+            </w:r>
+            <w:proofErr w:type="spellEnd"/>
+            <w:r>
+              <w:rPr>
+                <w:b/>
+                <w:bCs/>
+                <w:highlight w:val="yellow"/>
+              </w:rPr>
+              <w:t xml:space="preserve"> install @modelcontextprotocol/sdk</w:t>
+            </w:r>
+            <w:r>
+              <w:t xml:space="preserve"> </w:t>
+            </w:r>
+          </w:p>
+        </w:tc>
+      </w:tr>
+      <w:tr>
+        <w:tc>
+          <w:tcPr>
+            <w:tcW w:w="2064" w:type="dxa"/>
+          </w:tcPr>
+          <w:p>
+            <w:pPr>
+              <w:jc w:val="center"/>
+            </w:pPr>
+            <w:r>
+              <w:lastRenderedPageBreak/>
+              <w:t>18:19</w:t>
+            </w:r>
+          </w:p>
+        </w:tc>
+        <w:tc>
+          <w:tcPr>
+            <w:tcW w:w="4381" w:type="dxa"/>
+            <w:gridSpan w:val="3"/>
+          </w:tcPr>
+          <w:p>
+            <w:r>
+              <w:t>New service creation</w:t>
+            </w:r>
+          </w:p>
+        </w:tc>
+        <w:tc>
+          <w:tcPr>
+            <w:tcW w:w="8943" w:type="dxa"/>
+          </w:tcPr>
+          <w:p>
+            <w:pPr>
+              <w:jc w:val="center"/>
+            </w:pPr>
+            <w:r>
+              <w:rPr>
+                <w:noProof/>
+              </w:rPr>
+              <w:drawing>
+                <wp:inline distT="0" distB="0" distL="0" distR="0" wp14:anchorId="432BEE12" wp14:editId="7FD9E3E7">
+                  <wp:extent cx="4862341" cy="2636742"/>
+                  <wp:effectExtent l="133350" t="114300" r="109855" b="163830"/>
+                  <wp:docPr id="1231367" name="Picture 1"/>
+                  <wp:cNvGraphicFramePr>
+                    <a:graphicFrameLocks xmlns:a="http://schemas.openxmlformats.org/drawingml/2006/main" noChangeAspect="1"/>
+                  </wp:cNvGraphicFramePr>
+                  <a:graphic xmlns:a="http://schemas.openxmlformats.org/drawingml/2006/main">
+                    <a:graphicData uri="http://schemas.openxmlformats.org/drawingml/2006/picture">
+                      <pic:pic xmlns:pic="http://schemas.openxmlformats.org/drawingml/2006/picture">
+                        <pic:nvPicPr>
+                          <pic:cNvPr id="1231367" name=""/>
+                          <pic:cNvPicPr/>
+                        </pic:nvPicPr>
+                        <pic:blipFill>
+                          <a:blip r:embed="rId32"/>
+                          <a:stretch>
+                            <a:fillRect/>
+                          </a:stretch>
+                        </pic:blipFill>
+                        <pic:spPr>
+                          <a:xfrm>
+                            <a:off x="0" y="0"/>
+                            <a:ext cx="4875813" cy="2644048"/>
+                          </a:xfrm>
+                          <a:prstGeom prst="rect">
+                            <a:avLst/>
+                          </a:prstGeom>
+                          <a:solidFill>
+                            <a:srgbClr val="FFFFFF">
+                              <a:shade val="85000"/>
+                            </a:srgbClr>
+                          </a:solidFill>
+                          <a:ln w="88900" cap="sq">
+                            <a:solidFill>
+                              <a:srgbClr val="FFFFFF"/>
+                            </a:solidFill>
+                            <a:miter lim="800000"/>
+                          </a:ln>
+                          <a:effectLst>
+                            <a:outerShdw blurRad="55000" dist="18000" dir="5400000" algn="tl" rotWithShape="0">
+                              <a:srgbClr val="000000">
+                                <a:alpha val="40000"/>
+                              </a:srgbClr>
+                            </a:outerShdw>
+                          </a:effectLst>
+                          <a:scene3d>
+                            <a:camera prst="orthographicFront"/>
+                            <a:lightRig rig="twoPt" dir="t">
+                              <a:rot lat="0" lon="0" rev="7200000"/>
+                            </a:lightRig>
+                          </a:scene3d>
+                          <a:sp3d>
+                            <a:bevelT w="25400" h="19050"/>
+                            <a:contourClr>
+                              <a:srgbClr val="FFFFFF"/>
+                            </a:contourClr>
+                          </a:sp3d>
+                        </pic:spPr>
+                      </pic:pic>
+                    </a:graphicData>
+                  </a:graphic>
+                </wp:inline>
+              </w:drawing>
+            </w:r>
+          </w:p>
+        </w:tc>
+      </w:tr>
+      <w:tr>
+        <w:tc>
+          <w:tcPr>
+            <w:tcW w:w="2064" w:type="dxa"/>
+          </w:tcPr>
+          <w:p>
+            <w:pPr>
+              <w:jc w:val="center"/>
+            </w:pPr>
+            <w:r>
+              <w:t>18:50</w:t>
+            </w:r>
+          </w:p>
+        </w:tc>
+        <w:tc>
+          <w:tcPr>
+            <w:tcW w:w="4381" w:type="dxa"/>
+            <w:gridSpan w:val="3"/>
+            <w:vAlign w:val="center"/>
+          </w:tcPr>
+          <w:p>
+            <w:pPr>
+              <w:jc w:val="center"/>
+            </w:pPr>
+            <w:r>
+              <w:t>Adding MCP to Copilot</w:t>
+            </w:r>
+          </w:p>
+        </w:tc>
+        <w:tc>
+          <w:tcPr>
+            <w:tcW w:w="8943" w:type="dxa"/>
+          </w:tcPr>
+          <w:p>
+            <w:pPr>
+              <w:jc w:val="center"/>
+            </w:pPr>
+          </w:p>
+          <w:p>
+            <w:pPr>
+              <w:jc w:val="center"/>
+            </w:pPr>
+            <w:r>
+              <w:rPr>
+                <w:noProof/>
+              </w:rPr>
+              <w:drawing>
+                <wp:inline distT="0" distB="0" distL="0" distR="0" wp14:anchorId="5B1954F6" wp14:editId="70918ECF">
+                  <wp:extent cx="4721039" cy="2039815"/>
+                  <wp:effectExtent l="114300" t="114300" r="137160" b="151130"/>
+                  <wp:docPr id="1734689934" name="Picture 1"/>
+                  <wp:cNvGraphicFramePr>
+                    <a:graphicFrameLocks xmlns:a="http://schemas.openxmlformats.org/drawingml/2006/main" noChangeAspect="1"/>
+                  </wp:cNvGraphicFramePr>
+                  <a:graphic xmlns:a="http://schemas.openxmlformats.org/drawingml/2006/main">
+                    <a:graphicData uri="http://schemas.openxmlformats.org/drawingml/2006/picture">
+                      <pic:pic xmlns:pic="http://schemas.openxmlformats.org/drawingml/2006/picture">
+                        <pic:nvPicPr>
+                          <pic:cNvPr id="1734689934" name=""/>
+                          <pic:cNvPicPr/>
+                        </pic:nvPicPr>
+                        <pic:blipFill>
+                          <a:blip r:embed="rId33"/>
+                          <a:stretch>
+                            <a:fillRect/>
+                          </a:stretch>
+                        </pic:blipFill>
+                        <pic:spPr>
+                          <a:xfrm>
+                            <a:off x="0" y="0"/>
+                            <a:ext cx="4731425" cy="2044302"/>
+                          </a:xfrm>
+                          <a:prstGeom prst="rect">
+                            <a:avLst/>
+                          </a:prstGeom>
+                          <a:solidFill>
+                            <a:srgbClr val="FFFFFF">
+                              <a:shade val="85000"/>
+                            </a:srgbClr>
+                          </a:solidFill>
+                          <a:ln w="88900" cap="sq">
+                            <a:solidFill>
+                              <a:srgbClr val="FFFFFF"/>
+                            </a:solidFill>
+                            <a:miter lim="800000"/>
+                          </a:ln>
+                          <a:effectLst>
+                            <a:outerShdw blurRad="55000" dist="18000" dir="5400000" algn="tl" rotWithShape="0">
+                              <a:srgbClr val="000000">
+                                <a:alpha val="40000"/>
+                              </a:srgbClr>
+                            </a:outerShdw>
+                          </a:effectLst>
+                          <a:scene3d>
+                            <a:camera prst="orthographicFront"/>
+                            <a:lightRig rig="twoPt" dir="t">
+                              <a:rot lat="0" lon="0" rev="7200000"/>
+                            </a:lightRig>
+                          </a:scene3d>
+                          <a:sp3d>
+                            <a:bevelT w="25400" h="19050"/>
+                            <a:contourClr>
+                              <a:srgbClr val="FFFFFF"/>
+                            </a:contourClr>
+                          </a:sp3d>
+                        </pic:spPr>
+                      </pic:pic>
+                    </a:graphicData>
+                  </a:graphic>
+                </wp:inline>
+              </w:drawing>
+            </w:r>
+          </w:p>
+          <w:p>
+            <w:pPr>
+              <w:jc w:val="center"/>
+              <w:rPr>
+                <w:b/>
+                <w:bCs/>
+              </w:rPr>
+            </w:pPr>
+            <w:r>
+              <w:rPr>
+                <w:noProof/>
+              </w:rPr>
+              <w:lastRenderedPageBreak/>
+              <w:drawing>
+                <wp:inline distT="0" distB="0" distL="0" distR="0" wp14:anchorId="4F1413FA" wp14:editId="673545AD">
+                  <wp:extent cx="4444019" cy="2871959"/>
+                  <wp:effectExtent l="133350" t="114300" r="128270" b="157480"/>
+                  <wp:docPr id="310759750" name="Picture 1"/>
+                  <wp:cNvGraphicFramePr>
+                    <a:graphicFrameLocks xmlns:a="http://schemas.openxmlformats.org/drawingml/2006/main" noChangeAspect="1"/>
+                  </wp:cNvGraphicFramePr>
+                  <a:graphic xmlns:a="http://schemas.openxmlformats.org/drawingml/2006/main">
+                    <a:graphicData uri="http://schemas.openxmlformats.org/drawingml/2006/picture">
+                      <pic:pic xmlns:pic="http://schemas.openxmlformats.org/drawingml/2006/picture">
+                        <pic:nvPicPr>
+                          <pic:cNvPr id="310759750" name=""/>
+                          <pic:cNvPicPr/>
+                        </pic:nvPicPr>
+                        <pic:blipFill>
+                          <a:blip r:embed="rId34"/>
+                          <a:stretch>
+                            <a:fillRect/>
+                          </a:stretch>
+                        </pic:blipFill>
+                        <pic:spPr>
+                          <a:xfrm>
+                            <a:off x="0" y="0"/>
+                            <a:ext cx="4462032" cy="2883600"/>
+                          </a:xfrm>
+                          <a:prstGeom prst="rect">
+                            <a:avLst/>
+                          </a:prstGeom>
+                          <a:solidFill>
+                            <a:srgbClr val="FFFFFF">
+                              <a:shade val="85000"/>
+                            </a:srgbClr>
+                          </a:solidFill>
+                          <a:ln w="88900" cap="sq">
+                            <a:solidFill>
+                              <a:srgbClr val="FFFFFF"/>
+                            </a:solidFill>
+                            <a:miter lim="800000"/>
+                          </a:ln>
+                          <a:effectLst>
+                            <a:outerShdw blurRad="55000" dist="18000" dir="5400000" algn="tl" rotWithShape="0">
+                              <a:srgbClr val="000000">
+                                <a:alpha val="40000"/>
+                              </a:srgbClr>
+                            </a:outerShdw>
+                          </a:effectLst>
+                          <a:scene3d>
+                            <a:camera prst="orthographicFront"/>
+                            <a:lightRig rig="twoPt" dir="t">
+                              <a:rot lat="0" lon="0" rev="7200000"/>
+                            </a:lightRig>
+                          </a:scene3d>
+                          <a:sp3d>
+                            <a:bevelT w="25400" h="19050"/>
+                            <a:contourClr>
+                              <a:srgbClr val="FFFFFF"/>
+                            </a:contourClr>
+                          </a:sp3d>
+                        </pic:spPr>
+                      </pic:pic>
+                    </a:graphicData>
+                  </a:graphic>
+                </wp:inline>
+              </w:drawing>
+            </w:r>
+          </w:p>
+          <w:p>
+            <w:pPr>
+              <w:jc w:val="center"/>
+            </w:pPr>
+          </w:p>
+        </w:tc>
+      </w:tr>
+      <w:tr>
+        <w:tc>
+          <w:tcPr>
+            <w:tcW w:w="2064" w:type="dxa"/>
+          </w:tcPr>
+          <w:p>
+            <w:pPr>
+              <w:jc w:val="center"/>
+            </w:pPr>
+            <w:r>
+              <w:lastRenderedPageBreak/>
+              <w:t>19:22</w:t>
+            </w:r>
+          </w:p>
+        </w:tc>
+        <w:tc>
+          <w:tcPr>
+            <w:tcW w:w="4310" w:type="dxa"/>
+            <w:gridSpan w:val="2"/>
+            <w:vAlign w:val="center"/>
+          </w:tcPr>
+          <w:p>
+            <w:pPr>
+              <w:jc w:val="center"/>
+            </w:pPr>
+            <w:r>
+              <w:t>MCP Scenario</w:t>
+            </w:r>
+          </w:p>
+        </w:tc>
+        <w:tc>
+          <w:tcPr>
+            <w:tcW w:w="9014" w:type="dxa"/>
+            <w:gridSpan w:val="2"/>
+          </w:tcPr>
+          <w:p>
+            <w:pPr>
+              <w:jc w:val="center"/>
+            </w:pPr>
+            <w:r>
+              <w:rPr>
+                <w:noProof/>
+              </w:rPr>
+              <w:drawing>
+                <wp:inline distT="0" distB="0" distL="0" distR="0" wp14:anchorId="7D126B1D" wp14:editId="2F41C6ED">
+                  <wp:extent cx="5124335" cy="2394439"/>
+                  <wp:effectExtent l="133350" t="114300" r="133985" b="158750"/>
+                  <wp:docPr id="1296280896" name="Picture 1"/>
+                  <wp:cNvGraphicFramePr>
+                    <a:graphicFrameLocks xmlns:a="http://schemas.openxmlformats.org/drawingml/2006/main" noChangeAspect="1"/>
+                  </wp:cNvGraphicFramePr>
+                  <a:graphic xmlns:a="http://schemas.openxmlformats.org/drawingml/2006/main">
+                    <a:graphicData uri="http://schemas.openxmlformats.org/drawingml/2006/picture">
+                      <pic:pic xmlns:pic="http://schemas.openxmlformats.org/drawingml/2006/picture">
+                        <pic:nvPicPr>
+                          <pic:cNvPr id="1296280896" name=""/>
+                          <pic:cNvPicPr/>
+                        </pic:nvPicPr>
+                        <pic:blipFill>
+                          <a:blip r:embed="rId35"/>
+                          <a:stretch>
+                            <a:fillRect/>
+                          </a:stretch>
+                        </pic:blipFill>
+                        <pic:spPr>
+                          <a:xfrm>
+                            <a:off x="0" y="0"/>
+                            <a:ext cx="5169413" cy="2415502"/>
+                          </a:xfrm>
+                          <a:prstGeom prst="rect">
+                            <a:avLst/>
+                          </a:prstGeom>
+                          <a:solidFill>
+                            <a:srgbClr val="FFFFFF">
+                              <a:shade val="85000"/>
+                            </a:srgbClr>
+                          </a:solidFill>
+                          <a:ln w="88900" cap="sq">
+                            <a:solidFill>
+                              <a:srgbClr val="FFFFFF"/>
+                            </a:solidFill>
+                            <a:miter lim="800000"/>
+                          </a:ln>
+                          <a:effectLst>
+                            <a:outerShdw blurRad="55000" dist="18000" dir="5400000" algn="tl" rotWithShape="0">
+                              <a:srgbClr val="000000">
+                                <a:alpha val="40000"/>
+                              </a:srgbClr>
+                            </a:outerShdw>
+                          </a:effectLst>
+                          <a:scene3d>
+                            <a:camera prst="orthographicFront"/>
+                            <a:lightRig rig="twoPt" dir="t">
+                              <a:rot lat="0" lon="0" rev="7200000"/>
+                            </a:lightRig>
+                          </a:scene3d>
+                          <a:sp3d>
+                            <a:bevelT w="25400" h="19050"/>
+                            <a:contourClr>
+                              <a:srgbClr val="FFFFFF"/>
+                            </a:contourClr>
+                          </a:sp3d>
+                        </pic:spPr>
+                      </pic:pic>
+                    </a:graphicData>
+                  </a:graphic>
+                </wp:inline>
+              </w:drawing>
+            </w:r>
+          </w:p>
+        </w:tc>
+      </w:tr>
+      <w:tr>
+        <w:tc>
+          <w:tcPr>
+            <w:tcW w:w="2064" w:type="dxa"/>
+          </w:tcPr>
+          <w:p>
+            <w:pPr>
+              <w:jc w:val="center"/>
+            </w:pPr>
+            <w:r>
+              <w:t>19:44</w:t>
+            </w:r>
+          </w:p>
+        </w:tc>
+        <w:tc>
+          <w:tcPr>
+            <w:tcW w:w="13324" w:type="dxa"/>
+            <w:gridSpan w:val="4"/>
+          </w:tcPr>
+          <w:p>
+            <w:pPr>
+              <w:jc w:val="center"/>
+              <w:rPr>
+                <w:b/>
+                <w:bCs/>
+                <w:sz w:val="36"/>
+                <w:szCs w:val="36"/>
+              </w:rPr>
+            </w:pPr>
+            <w:r>
+              <w:rPr>
+                <w:b/>
+                <w:bCs/>
+                <w:sz w:val="36"/>
+                <w:szCs w:val="36"/>
+              </w:rPr>
+              <w:t>LAB</w:t>
+            </w:r>
+            <w:r>
+              <w:rPr>
+                <w:b/>
+                <w:bCs/>
+                <w:sz w:val="36"/>
+                <w:szCs w:val="36"/>
+              </w:rPr>
+              <w:t xml:space="preserve"> Description</w:t>
+            </w:r>
+          </w:p>
+        </w:tc>
+      </w:tr>
+      <w:tr>
+        <w:tc>
+          <w:tcPr>
+            <w:tcW w:w="2064" w:type="dxa"/>
+          </w:tcPr>
+          <w:p>
+            <w:pPr>
+              <w:jc w:val="center"/>
+            </w:pPr>
+            <w:r>
+              <w:t>20:14</w:t>
+            </w:r>
+          </w:p>
+        </w:tc>
+        <w:tc>
+          <w:tcPr>
+            <w:tcW w:w="13324" w:type="dxa"/>
+            <w:gridSpan w:val="4"/>
+          </w:tcPr>
+          <w:p>
+            <w:pPr>
+              <w:jc w:val="center"/>
+              <w:rPr>
+                <w:b/>
+                <w:bCs/>
+                <w:sz w:val="36"/>
+                <w:szCs w:val="36"/>
+              </w:rPr>
+            </w:pPr>
+            <w:r>
+              <w:rPr>
+                <w:b/>
+                <w:bCs/>
+                <w:sz w:val="36"/>
+                <w:szCs w:val="36"/>
+              </w:rPr>
+              <w:t>LAB</w:t>
+            </w:r>
+            <w:r>
+              <w:rPr>
+                <w:b/>
+                <w:bCs/>
+                <w:sz w:val="36"/>
+                <w:szCs w:val="36"/>
+              </w:rPr>
+              <w:t xml:space="preserve"> Solution</w:t>
+            </w:r>
+          </w:p>
+        </w:tc>
+      </w:tr>
+      <w:tr>
+        <w:tc>
+          <w:tcPr>
+            <w:tcW w:w="2064" w:type="dxa"/>
+          </w:tcPr>
+          <w:p>
+            <w:pPr>
+              <w:jc w:val="center"/>
+              <w:rPr>
+                <w:rtl/>
+              </w:rPr>
+            </w:pPr>
+            <w:r>
+              <w:lastRenderedPageBreak/>
+              <w:t>20:41</w:t>
+            </w:r>
+          </w:p>
+        </w:tc>
+        <w:tc>
+          <w:tcPr>
+            <w:tcW w:w="2149" w:type="dxa"/>
+          </w:tcPr>
+          <w:p>
+            <w:pPr>
+              <w:jc w:val="center"/>
+              <w:rPr>
+                <w:rtl/>
+              </w:rPr>
+            </w:pPr>
+            <w:r>
+              <w:t xml:space="preserve">MCP of </w:t>
+            </w:r>
+            <w:proofErr w:type="spellStart"/>
+            <w:r>
+              <w:t>GIThub</w:t>
+            </w:r>
+            <w:proofErr w:type="spellEnd"/>
+          </w:p>
+        </w:tc>
+        <w:tc>
+          <w:tcPr>
+            <w:tcW w:w="2232" w:type="dxa"/>
+            <w:gridSpan w:val="2"/>
+          </w:tcPr>
+          <w:p/>
+        </w:tc>
+        <w:tc>
+          <w:tcPr>
+            <w:tcW w:w="8943" w:type="dxa"/>
+          </w:tcPr>
+          <w:p>
+            <w:pPr>
+              <w:jc w:val="center"/>
+            </w:pPr>
+          </w:p>
+        </w:tc>
+      </w:tr>
+      <w:tr>
+        <w:tc>
+          <w:tcPr>
+            <w:tcW w:w="2064" w:type="dxa"/>
+          </w:tcPr>
+          <w:p>
+            <w:pPr>
+              <w:jc w:val="center"/>
+            </w:pPr>
+          </w:p>
+        </w:tc>
+        <w:tc>
+          <w:tcPr>
+            <w:tcW w:w="2149" w:type="dxa"/>
+          </w:tcPr>
+          <w:p>
+            <w:pPr>
+              <w:jc w:val="center"/>
+            </w:pPr>
+          </w:p>
+        </w:tc>
+        <w:tc>
+          <w:tcPr>
+            <w:tcW w:w="2232" w:type="dxa"/>
+            <w:gridSpan w:val="2"/>
+          </w:tcPr>
+          <w:p>
+            <w:pPr>
+              <w:rPr>
+                <w:rtl/>
+              </w:rPr>
+            </w:pPr>
+          </w:p>
+        </w:tc>
+        <w:tc>
+          <w:tcPr>
+            <w:tcW w:w="8943" w:type="dxa"/>
+          </w:tcPr>
+          <w:p>
+            <w:pPr>
+              <w:jc w:val="center"/>
+            </w:pPr>
+          </w:p>
+        </w:tc>
+      </w:tr>
+      <w:tr>
+        <w:tc>
+          <w:tcPr>
+            <w:tcW w:w="2064" w:type="dxa"/>
+          </w:tcPr>
+          <w:p>
+            <w:pPr>
+              <w:jc w:val="center"/>
+            </w:pPr>
+          </w:p>
+        </w:tc>
+        <w:tc>
+          <w:tcPr>
+            <w:tcW w:w="2149" w:type="dxa"/>
+          </w:tcPr>
+          <w:p>
+            <w:pPr>
+              <w:jc w:val="center"/>
+            </w:pPr>
+          </w:p>
+        </w:tc>
+        <w:tc>
+          <w:tcPr>
+            <w:tcW w:w="2232" w:type="dxa"/>
+            <w:gridSpan w:val="2"/>
+          </w:tcPr>
+          <w:p/>
+        </w:tc>
+        <w:tc>
+          <w:tcPr>
+            <w:tcW w:w="8943" w:type="dxa"/>
+          </w:tcPr>
+          <w:p>
+            <w:pPr>
+              <w:jc w:val="center"/>
+            </w:pPr>
+          </w:p>
+        </w:tc>
+      </w:tr>
+    </w:tbl>
     <w:p/>
     <w:sectPr>
       <w:pgSz w:w="16838" w:h="11906" w:orient="landscape"/>
@@ -5149,7 +6175,7 @@
   <w:style w:type="paragraph" w:default="1" w:styleId="Normal">
     <w:name w:val="Normal"/>
     <w:qFormat/>
-    <w:rsid w:val="007D394F"/>
+    <w:rsid w:val="00F80F7F"/>
   </w:style>
   <w:style w:type="paragraph" w:styleId="Heading1">
     <w:name w:val="heading 1"/>

</xml_diff>